<commit_message>
add functional and nonfunctional requirements
</commit_message>
<xml_diff>
--- a/docs/engineering_project_report.docx
+++ b/docs/engineering_project_report.docx
@@ -332,7 +332,7 @@
           <w:i/>
           <w:iCs/>
         </w:rPr>
-        <w:t xml:space="preserve">“The objective of this project is to design, implement, and evaluate a software system capable of reconstructing fragmented (shredded or torn) documents based on an image of their pieces, supported by a dedicated document-splitting module for synthetic dataset generation and testing.”</w:t>
+        <w:t xml:space="preserve">“The objective of this project is to design, implement, and evaluate a system capable of reconstructing fragmented (shredded or torn) documents based on an image of their pieces, supported by a dedicated document-splitting module.”</w:t>
       </w:r>
     </w:p>
     <w:p>
@@ -439,7 +439,7 @@
         </w:numPr>
       </w:pPr>
       <w:r>
-        <w:t xml:space="preserve">Extracts individual fragments from an input image (single and batch mode).</w:t>
+        <w:t xml:space="preserve">Extracts individual fragments from an input image (single or batch mode).</w:t>
       </w:r>
     </w:p>
     <w:p>
@@ -451,7 +451,7 @@
         </w:numPr>
       </w:pPr>
       <w:r>
-        <w:t xml:space="preserve">Reconstructs original documents using selectable or automated algorithms.</w:t>
+        <w:t xml:space="preserve">Reconstructs original documents using user-selected or automated algorithms.</w:t>
       </w:r>
     </w:p>
     <w:p>
@@ -463,7 +463,7 @@
         </w:numPr>
       </w:pPr>
       <w:r>
-        <w:t xml:space="preserve">Displays the reconstructed output, allows iterative refinement (adjusting time/algorithm), and saves the final result locally.</w:t>
+        <w:t xml:space="preserve">Displays the reconstructed output, allows iterative improvement (adjusting time or algorithm), and saves the final result locally.</w:t>
       </w:r>
     </w:p>
     <w:p>
@@ -486,6 +486,18 @@
       </w:pPr>
       <w:r>
         <w:t xml:space="preserve">Integration with external cloud storage providers or dedicated mobile applications.</w:t>
+      </w:r>
+    </w:p>
+    <w:p>
+      <w:pPr>
+        <w:pStyle w:val="Compact"/>
+        <w:numPr>
+          <w:ilvl w:val="0"/>
+          <w:numId w:val="1005"/>
+        </w:numPr>
+      </w:pPr>
+      <w:r>
+        <w:t xml:space="preserve">Reconstruction of documents with missing fragments.</w:t>
       </w:r>
     </w:p>
     <w:p>
@@ -509,13 +521,13 @@
       <w:pPr>
         <w:pStyle w:val="Heading3"/>
       </w:pPr>
-      <w:bookmarkStart w:id="16" w:name="_334378d35480c7210ddf6788623dee284adbf3d"/>
-      <w:r>
-        <w:rPr>
-          <w:b/>
-          <w:bCs/>
-        </w:rPr>
-        <w:t xml:space="preserve">US-01: Ingestion of a Single Telemetry Data Point</w:t>
+      <w:bookmarkStart w:id="16" w:name="_57417cdd8d8443ebed76ce7719983dd2c07d353"/>
+      <w:r>
+        <w:rPr>
+          <w:b/>
+          <w:bCs/>
+        </w:rPr>
+        <w:t xml:space="preserve">US-01: Loading a document image for splitting</w:t>
       </w:r>
       <w:bookmarkEnd w:id="16"/>
     </w:p>
@@ -532,13 +544,13 @@
           <w:b/>
           <w:bCs/>
         </w:rPr>
-        <w:t xml:space="preserve">As an:</w:t>
-      </w:r>
-      <w:r>
-        <w:t xml:space="preserve"> </w:t>
-      </w:r>
-      <w:r>
-        <w:t xml:space="preserve">External system (e.g., IoT sensor / telemetry script),</w:t>
+        <w:t xml:space="preserve">As a:</w:t>
+      </w:r>
+      <w:r>
+        <w:t xml:space="preserve"> </w:t>
+      </w:r>
+      <w:r>
+        <w:t xml:space="preserve">User of the document splitting module,</w:t>
       </w:r>
     </w:p>
     <w:p>
@@ -560,22 +572,7 @@
         <w:t xml:space="preserve"> </w:t>
       </w:r>
       <w:r>
-        <w:t xml:space="preserve">Submit a measurement with a timestamp and numeric value via the</w:t>
-      </w:r>
-      <w:r>
-        <w:t xml:space="preserve"> </w:t>
-      </w:r>
-      <w:r>
-        <w:rPr>
-          <w:rStyle w:val="VerbatimChar"/>
-        </w:rPr>
-        <w:t xml:space="preserve">POST /api/v1/metrics</w:t>
-      </w:r>
-      <w:r>
-        <w:t xml:space="preserve"> </w:t>
-      </w:r>
-      <w:r>
-        <w:t xml:space="preserve">endpoint,</w:t>
+        <w:t xml:space="preserve">Upload a single document image or select a folder of document images,</w:t>
       </w:r>
     </w:p>
     <w:p>
@@ -597,7 +594,7 @@
         <w:t xml:space="preserve"> </w:t>
       </w:r>
       <w:r>
-        <w:t xml:space="preserve">The data is validated, stored in the time-series database, and forwarded to the analytical engine.</w:t>
+        <w:t xml:space="preserve">The system can process them for fragment generation.</w:t>
       </w:r>
     </w:p>
     <w:p>
@@ -631,7 +628,7 @@
         <w:t xml:space="preserve"> </w:t>
       </w:r>
       <w:r>
-        <w:t xml:space="preserve">A running and authenticated ingestion service,</w:t>
+        <w:t xml:space="preserve">The splitting module is open,</w:t>
       </w:r>
     </w:p>
     <w:p>
@@ -653,34 +650,7 @@
         <w:t xml:space="preserve"> </w:t>
       </w:r>
       <w:r>
-        <w:t xml:space="preserve">The client sends a</w:t>
-      </w:r>
-      <w:r>
-        <w:t xml:space="preserve"> </w:t>
-      </w:r>
-      <w:r>
-        <w:rPr>
-          <w:rStyle w:val="VerbatimChar"/>
-        </w:rPr>
-        <w:t xml:space="preserve">POST</w:t>
-      </w:r>
-      <w:r>
-        <w:t xml:space="preserve"> </w:t>
-      </w:r>
-      <w:r>
-        <w:t xml:space="preserve">request with a valid JSON payload</w:t>
-      </w:r>
-      <w:r>
-        <w:t xml:space="preserve"> </w:t>
-      </w:r>
-      <w:r>
-        <w:rPr>
-          <w:rStyle w:val="VerbatimChar"/>
-        </w:rPr>
-        <w:t xml:space="preserve">{ "sensor_id": "temp-01", "timestamp": 1729000000, "value": 24.5 }</w:t>
-      </w:r>
-      <w:r>
-        <w:t xml:space="preserve">,</w:t>
+        <w:t xml:space="preserve">The user uploads a valid image file or selects a folder containing valid image files,</w:t>
       </w:r>
     </w:p>
     <w:p>
@@ -702,42 +672,7 @@
         <w:t xml:space="preserve"> </w:t>
       </w:r>
       <w:r>
-        <w:t xml:space="preserve">The system returns response status</w:t>
-      </w:r>
-      <w:r>
-        <w:t xml:space="preserve"> </w:t>
-      </w:r>
-      <w:r>
-        <w:rPr>
-          <w:rStyle w:val="VerbatimChar"/>
-        </w:rPr>
-        <w:t xml:space="preserve">201 Created</w:t>
-      </w:r>
-      <w:r>
-        <w:t xml:space="preserve"> </w:t>
-      </w:r>
-      <w:r>
-        <w:t xml:space="preserve">in</w:t>
-      </w:r>
-      <w:r>
-        <w:t xml:space="preserve"> </w:t>
-      </w:r>
-      <m:oMath>
-        <m:r>
-          <m:rPr>
-            <m:sty m:val="p"/>
-          </m:rPr>
-          <m:t>≤</m:t>
-        </m:r>
-        <m:r>
-          <m:t>50</m:t>
-        </m:r>
-      </m:oMath>
-      <w:r>
-        <w:t xml:space="preserve"> </w:t>
-      </w:r>
-      <w:r>
-        <w:t xml:space="preserve">ms, and the record is persisted in the TimescaleDB hypertable.</w:t>
+        <w:t xml:space="preserve">The system loads the images and displays a preview of the first document.</w:t>
       </w:r>
     </w:p>
     <w:p>
@@ -753,7 +688,7 @@
           <w:b/>
           <w:bCs/>
         </w:rPr>
-        <w:t xml:space="preserve">Scenario (Invalid data):</w:t>
+        <w:t xml:space="preserve">Scenario (Invalid input):</w:t>
       </w:r>
     </w:p>
     <w:p>
@@ -775,22 +710,7 @@
         <w:t xml:space="preserve"> </w:t>
       </w:r>
       <w:r>
-        <w:t xml:space="preserve">The client sends a request with a negative timestamp or a missing</w:t>
-      </w:r>
-      <w:r>
-        <w:t xml:space="preserve"> </w:t>
-      </w:r>
-      <w:r>
-        <w:rPr>
-          <w:rStyle w:val="VerbatimChar"/>
-        </w:rPr>
-        <w:t xml:space="preserve">value</w:t>
-      </w:r>
-      <w:r>
-        <w:t xml:space="preserve"> </w:t>
-      </w:r>
-      <w:r>
-        <w:t xml:space="preserve">field,</w:t>
+        <w:t xml:space="preserve">The user uploads a file in an unsupported format or an empty folder,</w:t>
       </w:r>
     </w:p>
     <w:p>
@@ -812,22 +732,7 @@
         <w:t xml:space="preserve"> </w:t>
       </w:r>
       <w:r>
-        <w:t xml:space="preserve">The system rejects the request with HTTP</w:t>
-      </w:r>
-      <w:r>
-        <w:t xml:space="preserve"> </w:t>
-      </w:r>
-      <w:r>
-        <w:rPr>
-          <w:rStyle w:val="VerbatimChar"/>
-        </w:rPr>
-        <w:t xml:space="preserve">422 Unprocessable Entity</w:t>
-      </w:r>
-      <w:r>
-        <w:t xml:space="preserve"> </w:t>
-      </w:r>
-      <w:r>
-        <w:t xml:space="preserve">containing a detailed validation error message.</w:t>
+        <w:t xml:space="preserve">The system displays an error message indicating the accepted formats.</w:t>
       </w:r>
     </w:p>
     <w:p>
@@ -841,13 +746,13 @@
       <w:pPr>
         <w:pStyle w:val="Heading3"/>
       </w:pPr>
-      <w:bookmarkStart w:id="17" w:name="_f650a3d1f1b796ea0b4aad8bf69be1bbf0db285"/>
-      <w:r>
-        <w:rPr>
-          <w:b/>
-          <w:bCs/>
-        </w:rPr>
-        <w:t xml:space="preserve">US-02: Viewing Time-Series Chart with Flagged Anomalies</w:t>
+      <w:bookmarkStart w:id="17" w:name="_f47538c0b533229e806588be09ef0bf151e1dc4"/>
+      <w:r>
+        <w:rPr>
+          <w:b/>
+          <w:bCs/>
+        </w:rPr>
+        <w:t xml:space="preserve">US-02: Splitting a document into fragments</w:t>
       </w:r>
       <w:bookmarkEnd w:id="17"/>
     </w:p>
@@ -864,13 +769,13 @@
           <w:b/>
           <w:bCs/>
         </w:rPr>
-        <w:t xml:space="preserve">As an:</w:t>
-      </w:r>
-      <w:r>
-        <w:t xml:space="preserve"> </w:t>
-      </w:r>
-      <w:r>
-        <w:t xml:space="preserve">Operations engineer / data analyst,</w:t>
+        <w:t xml:space="preserve">As a:</w:t>
+      </w:r>
+      <w:r>
+        <w:t xml:space="preserve"> </w:t>
+      </w:r>
+      <w:r>
+        <w:t xml:space="preserve">User of the document splitting module,</w:t>
       </w:r>
     </w:p>
     <w:p>
@@ -892,7 +797,7 @@
         <w:t xml:space="preserve"> </w:t>
       </w:r>
       <w:r>
-        <w:t xml:space="preserve">Open the chart view for a selected sensor covering the last 24 hours with highlighted anomalies,</w:t>
+        <w:t xml:space="preserve">Select a splitting algorithm and its parameters and preview the proposed piece borders overlaid on the document,</w:t>
       </w:r>
     </w:p>
     <w:p>
@@ -914,7 +819,7 @@
         <w:t xml:space="preserve"> </w:t>
       </w:r>
       <w:r>
-        <w:t xml:space="preserve">I can quickly diagnose equipment faults across infrastructure.</w:t>
+        <w:t xml:space="preserve">I can control how the document is fragmented.</w:t>
       </w:r>
     </w:p>
     <w:p>
@@ -948,7 +853,7 @@
         <w:t xml:space="preserve"> </w:t>
       </w:r>
       <w:r>
-        <w:t xml:space="preserve">A user logged in to the web dashboard,</w:t>
+        <w:t xml:space="preserve">A document image has been loaded,</w:t>
       </w:r>
     </w:p>
     <w:p>
@@ -970,37 +875,7 @@
         <w:t xml:space="preserve"> </w:t>
       </w:r>
       <w:r>
-        <w:t xml:space="preserve">The user selects sensor</w:t>
-      </w:r>
-      <w:r>
-        <w:t xml:space="preserve"> </w:t>
-      </w:r>
-      <w:r>
-        <w:rPr>
-          <w:rStyle w:val="VerbatimChar"/>
-        </w:rPr>
-        <w:t xml:space="preserve">sensor_id="temp-01"</w:t>
-      </w:r>
-      <w:r>
-        <w:t xml:space="preserve"> </w:t>
-      </w:r>
-      <w:r>
-        <w:t xml:space="preserve">and time window</w:t>
-      </w:r>
-      <w:r>
-        <w:t xml:space="preserve"> </w:t>
-      </w:r>
-      <w:r>
-        <w:rPr>
-          <w:rStyle w:val="VerbatimChar"/>
-        </w:rPr>
-        <w:t xml:space="preserve">24h</w:t>
-      </w:r>
-      <w:r>
-        <w:t xml:space="preserve"> </w:t>
-      </w:r>
-      <w:r>
-        <w:t xml:space="preserve">from the menu,</w:t>
+        <w:t xml:space="preserve">The user selects a splitting algorithm and confirms its parameters,</w:t>
       </w:r>
     </w:p>
     <w:p>
@@ -1022,27 +897,60 @@
         <w:t xml:space="preserve"> </w:t>
       </w:r>
       <w:r>
-        <w:t xml:space="preserve">The line chart renders in</w:t>
-      </w:r>
-      <w:r>
-        <w:t xml:space="preserve"> </w:t>
-      </w:r>
-      <m:oMath>
-        <m:r>
-          <m:rPr>
-            <m:sty m:val="p"/>
-          </m:rPr>
-          <m:t>&lt;</m:t>
-        </m:r>
-        <m:r>
-          <m:t>1.0</m:t>
-        </m:r>
-      </m:oMath>
-      <w:r>
-        <w:t xml:space="preserve"> </w:t>
-      </w:r>
-      <w:r>
-        <w:t xml:space="preserve">s with anomalous points highlighted in red.</w:t>
+        <w:t xml:space="preserve">The system displays the proposed piece borders overlaid on the original image.</w:t>
+      </w:r>
+    </w:p>
+    <w:p>
+      <w:pPr>
+        <w:pStyle w:val="Compact"/>
+        <w:numPr>
+          <w:ilvl w:val="0"/>
+          <w:numId w:val="1009"/>
+        </w:numPr>
+      </w:pPr>
+      <w:r>
+        <w:rPr>
+          <w:b/>
+          <w:bCs/>
+        </w:rPr>
+        <w:t xml:space="preserve">When:</w:t>
+      </w:r>
+      <w:r>
+        <w:t xml:space="preserve"> </w:t>
+      </w:r>
+      <w:r>
+        <w:t xml:space="preserve">The user is not satisfied with the result and clicks</w:t>
+      </w:r>
+      <w:r>
+        <w:t xml:space="preserve"> </w:t>
+      </w:r>
+      <w:r>
+        <w:t xml:space="preserve">“Generate again”</w:t>
+      </w:r>
+      <w:r>
+        <w:t xml:space="preserve">,</w:t>
+      </w:r>
+    </w:p>
+    <w:p>
+      <w:pPr>
+        <w:pStyle w:val="Compact"/>
+        <w:numPr>
+          <w:ilvl w:val="0"/>
+          <w:numId w:val="1009"/>
+        </w:numPr>
+      </w:pPr>
+      <w:r>
+        <w:rPr>
+          <w:b/>
+          <w:bCs/>
+        </w:rPr>
+        <w:t xml:space="preserve">Then:</w:t>
+      </w:r>
+      <w:r>
+        <w:t xml:space="preserve"> </w:t>
+      </w:r>
+      <w:r>
+        <w:t xml:space="preserve">The system generates a new set of borders using the same or modified parameters.</w:t>
       </w:r>
     </w:p>
     <w:p>
@@ -1054,13 +962,876 @@
     </w:p>
     <w:p>
       <w:pPr>
+        <w:pStyle w:val="Heading3"/>
+      </w:pPr>
+      <w:bookmarkStart w:id="18" w:name="_f97a41c56bb88b6e431db06e70a2b1a15570e21"/>
+      <w:r>
+        <w:rPr>
+          <w:b/>
+          <w:bCs/>
+        </w:rPr>
+        <w:t xml:space="preserve">US-03: Generating a fragmented image</w:t>
+      </w:r>
+      <w:bookmarkEnd w:id="18"/>
+    </w:p>
+    <w:p>
+      <w:pPr>
+        <w:pStyle w:val="Compact"/>
+        <w:numPr>
+          <w:ilvl w:val="0"/>
+          <w:numId w:val="1010"/>
+        </w:numPr>
+      </w:pPr>
+      <w:r>
+        <w:rPr>
+          <w:b/>
+          <w:bCs/>
+        </w:rPr>
+        <w:t xml:space="preserve">As a:</w:t>
+      </w:r>
+      <w:r>
+        <w:t xml:space="preserve"> </w:t>
+      </w:r>
+      <w:r>
+        <w:t xml:space="preserve">User of the document splitting module,</w:t>
+      </w:r>
+    </w:p>
+    <w:p>
+      <w:pPr>
+        <w:pStyle w:val="Compact"/>
+        <w:numPr>
+          <w:ilvl w:val="0"/>
+          <w:numId w:val="1010"/>
+        </w:numPr>
+      </w:pPr>
+      <w:r>
+        <w:rPr>
+          <w:b/>
+          <w:bCs/>
+        </w:rPr>
+        <w:t xml:space="preserve">I want to:</w:t>
+      </w:r>
+      <w:r>
+        <w:t xml:space="preserve"> </w:t>
+      </w:r>
+      <w:r>
+        <w:t xml:space="preserve">Confirm the generated borders and have the system randomly rotate the pieces and arrange them on a plain background without overlapping,</w:t>
+      </w:r>
+    </w:p>
+    <w:p>
+      <w:pPr>
+        <w:pStyle w:val="Compact"/>
+        <w:numPr>
+          <w:ilvl w:val="0"/>
+          <w:numId w:val="1010"/>
+        </w:numPr>
+      </w:pPr>
+      <w:r>
+        <w:rPr>
+          <w:b/>
+          <w:bCs/>
+        </w:rPr>
+        <w:t xml:space="preserve">So that:</w:t>
+      </w:r>
+      <w:r>
+        <w:t xml:space="preserve"> </w:t>
+      </w:r>
+      <w:r>
+        <w:t xml:space="preserve">I get an image of document fragments for testing</w:t>
+      </w:r>
+    </w:p>
+    <w:p>
+      <w:pPr>
+        <w:pStyle w:val="BlockText"/>
+      </w:pPr>
+      <w:r>
+        <w:rPr>
+          <w:b/>
+          <w:bCs/>
+        </w:rPr>
+        <w:t xml:space="preserve">Acceptance Criteria (Gherkin):</w:t>
+      </w:r>
+    </w:p>
+    <w:p>
+      <w:pPr>
+        <w:pStyle w:val="Compact"/>
+        <w:numPr>
+          <w:ilvl w:val="0"/>
+          <w:numId w:val="1011"/>
+        </w:numPr>
+      </w:pPr>
+      <w:r>
+        <w:rPr>
+          <w:b/>
+          <w:bCs/>
+        </w:rPr>
+        <w:t xml:space="preserve">Given:</w:t>
+      </w:r>
+      <w:r>
+        <w:t xml:space="preserve"> </w:t>
+      </w:r>
+      <w:r>
+        <w:t xml:space="preserve">The user has confirmed a set of piece borders,</w:t>
+      </w:r>
+    </w:p>
+    <w:p>
+      <w:pPr>
+        <w:pStyle w:val="Compact"/>
+        <w:numPr>
+          <w:ilvl w:val="0"/>
+          <w:numId w:val="1011"/>
+        </w:numPr>
+      </w:pPr>
+      <w:r>
+        <w:rPr>
+          <w:b/>
+          <w:bCs/>
+        </w:rPr>
+        <w:t xml:space="preserve">When:</w:t>
+      </w:r>
+      <w:r>
+        <w:t xml:space="preserve"> </w:t>
+      </w:r>
+      <w:r>
+        <w:t xml:space="preserve">The user sets parameters and confirms,</w:t>
+      </w:r>
+    </w:p>
+    <w:p>
+      <w:pPr>
+        <w:pStyle w:val="Compact"/>
+        <w:numPr>
+          <w:ilvl w:val="0"/>
+          <w:numId w:val="1011"/>
+        </w:numPr>
+      </w:pPr>
+      <w:r>
+        <w:rPr>
+          <w:b/>
+          <w:bCs/>
+        </w:rPr>
+        <w:t xml:space="preserve">Then:</w:t>
+      </w:r>
+      <w:r>
+        <w:t xml:space="preserve"> </w:t>
+      </w:r>
+      <w:r>
+        <w:t xml:space="preserve">The system produces an image with all fragments placed on the background without overlap.</w:t>
+      </w:r>
+    </w:p>
+    <w:p>
+      <w:pPr>
+        <w:pStyle w:val="Compact"/>
+        <w:numPr>
+          <w:ilvl w:val="0"/>
+          <w:numId w:val="1011"/>
+        </w:numPr>
+      </w:pPr>
+      <w:r>
+        <w:rPr>
+          <w:b/>
+          <w:bCs/>
+        </w:rPr>
+        <w:t xml:space="preserve">When:</w:t>
+      </w:r>
+      <w:r>
+        <w:t xml:space="preserve"> </w:t>
+      </w:r>
+      <w:r>
+        <w:t xml:space="preserve">The user can save the result to a chosen disk location.</w:t>
+      </w:r>
+    </w:p>
+    <w:p>
+      <w:r>
+        <w:pict>
+          <v:rect style="width:0;height:1.5pt" o:hralign="center" o:hrstd="t" o:hr="t"/>
+        </w:pict>
+      </w:r>
+    </w:p>
+    <w:p>
+      <w:pPr>
+        <w:pStyle w:val="Heading3"/>
+      </w:pPr>
+      <w:bookmarkStart w:id="19" w:name="_e74ca91d32794644ddf35cae32992f3ab071ad1"/>
+      <w:r>
+        <w:rPr>
+          <w:b/>
+          <w:bCs/>
+        </w:rPr>
+        <w:t xml:space="preserve">US-04: Extracting fragments from an input image</w:t>
+      </w:r>
+      <w:bookmarkEnd w:id="19"/>
+    </w:p>
+    <w:p>
+      <w:pPr>
+        <w:pStyle w:val="Compact"/>
+        <w:numPr>
+          <w:ilvl w:val="0"/>
+          <w:numId w:val="1012"/>
+        </w:numPr>
+      </w:pPr>
+      <w:r>
+        <w:rPr>
+          <w:b/>
+          <w:bCs/>
+        </w:rPr>
+        <w:t xml:space="preserve">As a:</w:t>
+      </w:r>
+      <w:r>
+        <w:t xml:space="preserve"> </w:t>
+      </w:r>
+      <w:r>
+        <w:t xml:space="preserve">User of the document reconstruction module,</w:t>
+      </w:r>
+    </w:p>
+    <w:p>
+      <w:pPr>
+        <w:pStyle w:val="Compact"/>
+        <w:numPr>
+          <w:ilvl w:val="0"/>
+          <w:numId w:val="1012"/>
+        </w:numPr>
+      </w:pPr>
+      <w:r>
+        <w:rPr>
+          <w:b/>
+          <w:bCs/>
+        </w:rPr>
+        <w:t xml:space="preserve">I want to:</w:t>
+      </w:r>
+      <w:r>
+        <w:t xml:space="preserve"> </w:t>
+      </w:r>
+      <w:r>
+        <w:t xml:space="preserve">Upload an image containing document fragments (single or batch mode),</w:t>
+      </w:r>
+    </w:p>
+    <w:p>
+      <w:pPr>
+        <w:pStyle w:val="Compact"/>
+        <w:numPr>
+          <w:ilvl w:val="0"/>
+          <w:numId w:val="1012"/>
+        </w:numPr>
+      </w:pPr>
+      <w:r>
+        <w:rPr>
+          <w:b/>
+          <w:bCs/>
+        </w:rPr>
+        <w:t xml:space="preserve">So that:</w:t>
+      </w:r>
+      <w:r>
+        <w:t xml:space="preserve"> </w:t>
+      </w:r>
+      <w:r>
+        <w:t xml:space="preserve">The system extracts individual pieces for reconstruction.</w:t>
+      </w:r>
+    </w:p>
+    <w:p>
+      <w:pPr>
+        <w:pStyle w:val="BlockText"/>
+      </w:pPr>
+      <w:r>
+        <w:rPr>
+          <w:b/>
+          <w:bCs/>
+        </w:rPr>
+        <w:t xml:space="preserve">Acceptance Criteria (Gherkin):</w:t>
+      </w:r>
+    </w:p>
+    <w:p>
+      <w:pPr>
+        <w:pStyle w:val="Compact"/>
+        <w:numPr>
+          <w:ilvl w:val="0"/>
+          <w:numId w:val="1013"/>
+        </w:numPr>
+      </w:pPr>
+      <w:r>
+        <w:rPr>
+          <w:b/>
+          <w:bCs/>
+        </w:rPr>
+        <w:t xml:space="preserve">Given:</w:t>
+      </w:r>
+      <w:r>
+        <w:t xml:space="preserve"> </w:t>
+      </w:r>
+      <w:r>
+        <w:t xml:space="preserve">The reconstruction module is open,</w:t>
+      </w:r>
+    </w:p>
+    <w:p>
+      <w:pPr>
+        <w:pStyle w:val="Compact"/>
+        <w:numPr>
+          <w:ilvl w:val="0"/>
+          <w:numId w:val="1013"/>
+        </w:numPr>
+      </w:pPr>
+      <w:r>
+        <w:rPr>
+          <w:b/>
+          <w:bCs/>
+        </w:rPr>
+        <w:t xml:space="preserve">When:</w:t>
+      </w:r>
+      <w:r>
+        <w:t xml:space="preserve"> </w:t>
+      </w:r>
+      <w:r>
+        <w:t xml:space="preserve">The user uploads a valid image containing non-overlapping fragments,</w:t>
+      </w:r>
+    </w:p>
+    <w:p>
+      <w:pPr>
+        <w:pStyle w:val="Compact"/>
+        <w:numPr>
+          <w:ilvl w:val="0"/>
+          <w:numId w:val="1013"/>
+        </w:numPr>
+      </w:pPr>
+      <w:r>
+        <w:rPr>
+          <w:b/>
+          <w:bCs/>
+        </w:rPr>
+        <w:t xml:space="preserve">Then:</w:t>
+      </w:r>
+      <w:r>
+        <w:t xml:space="preserve"> </w:t>
+      </w:r>
+      <w:r>
+        <w:t xml:space="preserve">The system identifies and extracts all individual fragments from the image.</w:t>
+      </w:r>
+    </w:p>
+    <w:p>
+      <w:pPr>
+        <w:pStyle w:val="Compact"/>
+        <w:numPr>
+          <w:ilvl w:val="0"/>
+          <w:numId w:val="1013"/>
+        </w:numPr>
+      </w:pPr>
+      <w:r>
+        <w:rPr>
+          <w:b/>
+          <w:bCs/>
+        </w:rPr>
+        <w:t xml:space="preserve">Scenario (Invalid input):</w:t>
+      </w:r>
+    </w:p>
+    <w:p>
+      <w:pPr>
+        <w:pStyle w:val="Compact"/>
+        <w:numPr>
+          <w:ilvl w:val="0"/>
+          <w:numId w:val="1013"/>
+        </w:numPr>
+      </w:pPr>
+      <w:r>
+        <w:rPr>
+          <w:b/>
+          <w:bCs/>
+        </w:rPr>
+        <w:t xml:space="preserve">When:</w:t>
+      </w:r>
+      <w:r>
+        <w:t xml:space="preserve"> </w:t>
+      </w:r>
+      <w:r>
+        <w:t xml:space="preserve">The image does not contain identifiable fragments,</w:t>
+      </w:r>
+    </w:p>
+    <w:p>
+      <w:pPr>
+        <w:pStyle w:val="Compact"/>
+        <w:numPr>
+          <w:ilvl w:val="0"/>
+          <w:numId w:val="1013"/>
+        </w:numPr>
+      </w:pPr>
+      <w:r>
+        <w:rPr>
+          <w:b/>
+          <w:bCs/>
+        </w:rPr>
+        <w:t xml:space="preserve">Then:</w:t>
+      </w:r>
+      <w:r>
+        <w:t xml:space="preserve"> </w:t>
+      </w:r>
+      <w:r>
+        <w:t xml:space="preserve">The system displays an appropriate error message.</w:t>
+      </w:r>
+    </w:p>
+    <w:p>
+      <w:r>
+        <w:pict>
+          <v:rect style="width:0;height:1.5pt" o:hralign="center" o:hrstd="t" o:hr="t"/>
+        </w:pict>
+      </w:r>
+    </w:p>
+    <w:p>
+      <w:pPr>
+        <w:pStyle w:val="Heading3"/>
+      </w:pPr>
+      <w:bookmarkStart w:id="20" w:name="_7d55e9282812fdebaa20850db5960c1af453bcd"/>
+      <w:r>
+        <w:rPr>
+          <w:b/>
+          <w:bCs/>
+        </w:rPr>
+        <w:t xml:space="preserve">US-05: Reconstructing a document from fragments</w:t>
+      </w:r>
+      <w:bookmarkEnd w:id="20"/>
+    </w:p>
+    <w:p>
+      <w:pPr>
+        <w:pStyle w:val="Compact"/>
+        <w:numPr>
+          <w:ilvl w:val="0"/>
+          <w:numId w:val="1014"/>
+        </w:numPr>
+      </w:pPr>
+      <w:r>
+        <w:rPr>
+          <w:b/>
+          <w:bCs/>
+        </w:rPr>
+        <w:t xml:space="preserve">As a:</w:t>
+      </w:r>
+      <w:r>
+        <w:t xml:space="preserve"> </w:t>
+      </w:r>
+      <w:r>
+        <w:t xml:space="preserve">User of the document reconstruction module,</w:t>
+      </w:r>
+    </w:p>
+    <w:p>
+      <w:pPr>
+        <w:pStyle w:val="Compact"/>
+        <w:numPr>
+          <w:ilvl w:val="0"/>
+          <w:numId w:val="1014"/>
+        </w:numPr>
+      </w:pPr>
+      <w:r>
+        <w:rPr>
+          <w:b/>
+          <w:bCs/>
+        </w:rPr>
+        <w:t xml:space="preserve">I want to:</w:t>
+      </w:r>
+      <w:r>
+        <w:t xml:space="preserve"> </w:t>
+      </w:r>
+      <w:r>
+        <w:t xml:space="preserve">Select a reconstruction algorithm (or let the system choose automatically) and view the reconstructed document,</w:t>
+      </w:r>
+    </w:p>
+    <w:p>
+      <w:pPr>
+        <w:pStyle w:val="Compact"/>
+        <w:numPr>
+          <w:ilvl w:val="0"/>
+          <w:numId w:val="1014"/>
+        </w:numPr>
+      </w:pPr>
+      <w:r>
+        <w:rPr>
+          <w:b/>
+          <w:bCs/>
+        </w:rPr>
+        <w:t xml:space="preserve">So that:</w:t>
+      </w:r>
+      <w:r>
+        <w:t xml:space="preserve"> </w:t>
+      </w:r>
+      <w:r>
+        <w:t xml:space="preserve">I can achieve the original document content in a legible form.</w:t>
+      </w:r>
+    </w:p>
+    <w:p>
+      <w:pPr>
+        <w:pStyle w:val="BlockText"/>
+      </w:pPr>
+      <w:r>
+        <w:rPr>
+          <w:b/>
+          <w:bCs/>
+        </w:rPr>
+        <w:t xml:space="preserve">Acceptance Criteria (Gherkin):</w:t>
+      </w:r>
+    </w:p>
+    <w:p>
+      <w:pPr>
+        <w:pStyle w:val="Compact"/>
+        <w:numPr>
+          <w:ilvl w:val="0"/>
+          <w:numId w:val="1015"/>
+        </w:numPr>
+      </w:pPr>
+      <w:r>
+        <w:rPr>
+          <w:b/>
+          <w:bCs/>
+        </w:rPr>
+        <w:t xml:space="preserve">Given:</w:t>
+      </w:r>
+      <w:r>
+        <w:t xml:space="preserve"> </w:t>
+      </w:r>
+      <w:r>
+        <w:t xml:space="preserve">Fragments have been extracted from the input image,</w:t>
+      </w:r>
+    </w:p>
+    <w:p>
+      <w:pPr>
+        <w:pStyle w:val="Compact"/>
+        <w:numPr>
+          <w:ilvl w:val="0"/>
+          <w:numId w:val="1015"/>
+        </w:numPr>
+      </w:pPr>
+      <w:r>
+        <w:rPr>
+          <w:b/>
+          <w:bCs/>
+        </w:rPr>
+        <w:t xml:space="preserve">When:</w:t>
+      </w:r>
+      <w:r>
+        <w:t xml:space="preserve"> </w:t>
+      </w:r>
+      <w:r>
+        <w:t xml:space="preserve">The user selects an algorithm or chooses automatic selection, and starts reconstruction,</w:t>
+      </w:r>
+    </w:p>
+    <w:p>
+      <w:pPr>
+        <w:pStyle w:val="Compact"/>
+        <w:numPr>
+          <w:ilvl w:val="0"/>
+          <w:numId w:val="1015"/>
+        </w:numPr>
+      </w:pPr>
+      <w:r>
+        <w:rPr>
+          <w:b/>
+          <w:bCs/>
+        </w:rPr>
+        <w:t xml:space="preserve">Then:</w:t>
+      </w:r>
+      <w:r>
+        <w:t xml:space="preserve"> </w:t>
+      </w:r>
+      <w:r>
+        <w:t xml:space="preserve">The system displays the reconstructed document image.</w:t>
+      </w:r>
+    </w:p>
+    <w:p>
+      <w:r>
+        <w:pict>
+          <v:rect style="width:0;height:1.5pt" o:hralign="center" o:hrstd="t" o:hr="t"/>
+        </w:pict>
+      </w:r>
+    </w:p>
+    <w:p>
+      <w:pPr>
+        <w:pStyle w:val="Heading3"/>
+      </w:pPr>
+      <w:bookmarkStart w:id="21" w:name="_8e4fbef483609392b257fbf02c771a1538f7008"/>
+      <w:r>
+        <w:rPr>
+          <w:b/>
+          <w:bCs/>
+        </w:rPr>
+        <w:t xml:space="preserve">US-06: Iterative enhancement of reconstruction</w:t>
+      </w:r>
+      <w:bookmarkEnd w:id="21"/>
+    </w:p>
+    <w:p>
+      <w:pPr>
+        <w:pStyle w:val="Compact"/>
+        <w:numPr>
+          <w:ilvl w:val="0"/>
+          <w:numId w:val="1016"/>
+        </w:numPr>
+      </w:pPr>
+      <w:r>
+        <w:rPr>
+          <w:b/>
+          <w:bCs/>
+        </w:rPr>
+        <w:t xml:space="preserve">As a:</w:t>
+      </w:r>
+      <w:r>
+        <w:t xml:space="preserve"> </w:t>
+      </w:r>
+      <w:r>
+        <w:t xml:space="preserve">User of the document reconstruction module,</w:t>
+      </w:r>
+    </w:p>
+    <w:p>
+      <w:pPr>
+        <w:pStyle w:val="Compact"/>
+        <w:numPr>
+          <w:ilvl w:val="0"/>
+          <w:numId w:val="1016"/>
+        </w:numPr>
+      </w:pPr>
+      <w:r>
+        <w:rPr>
+          <w:b/>
+          <w:bCs/>
+        </w:rPr>
+        <w:t xml:space="preserve">I want to:</w:t>
+      </w:r>
+      <w:r>
+        <w:t xml:space="preserve"> </w:t>
+      </w:r>
+      <w:r>
+        <w:t xml:space="preserve">Review the reconstruction result and choose to accept it, continue the same algorithm for more time or switch to a different algorithm,</w:t>
+      </w:r>
+    </w:p>
+    <w:p>
+      <w:pPr>
+        <w:pStyle w:val="Compact"/>
+        <w:numPr>
+          <w:ilvl w:val="0"/>
+          <w:numId w:val="1016"/>
+        </w:numPr>
+      </w:pPr>
+      <w:r>
+        <w:rPr>
+          <w:b/>
+          <w:bCs/>
+        </w:rPr>
+        <w:t xml:space="preserve">So that:</w:t>
+      </w:r>
+      <w:r>
+        <w:t xml:space="preserve"> </w:t>
+      </w:r>
+      <w:r>
+        <w:t xml:space="preserve">I can iteratively improve the reconstruction quality.</w:t>
+      </w:r>
+    </w:p>
+    <w:p>
+      <w:pPr>
+        <w:pStyle w:val="BlockText"/>
+      </w:pPr>
+      <w:r>
+        <w:rPr>
+          <w:b/>
+          <w:bCs/>
+        </w:rPr>
+        <w:t xml:space="preserve">Acceptance Criteria (Gherkin):</w:t>
+      </w:r>
+    </w:p>
+    <w:p>
+      <w:pPr>
+        <w:pStyle w:val="Compact"/>
+        <w:numPr>
+          <w:ilvl w:val="0"/>
+          <w:numId w:val="1017"/>
+        </w:numPr>
+      </w:pPr>
+      <w:r>
+        <w:rPr>
+          <w:b/>
+          <w:bCs/>
+        </w:rPr>
+        <w:t xml:space="preserve">Given:</w:t>
+      </w:r>
+      <w:r>
+        <w:t xml:space="preserve"> </w:t>
+      </w:r>
+      <w:r>
+        <w:t xml:space="preserve">A reconstruction result is displayed,</w:t>
+      </w:r>
+    </w:p>
+    <w:p>
+      <w:pPr>
+        <w:pStyle w:val="Compact"/>
+        <w:numPr>
+          <w:ilvl w:val="0"/>
+          <w:numId w:val="1017"/>
+        </w:numPr>
+      </w:pPr>
+      <w:r>
+        <w:rPr>
+          <w:b/>
+          <w:bCs/>
+        </w:rPr>
+        <w:t xml:space="preserve">When:</w:t>
+      </w:r>
+      <w:r>
+        <w:t xml:space="preserve"> </w:t>
+      </w:r>
+      <w:r>
+        <w:t xml:space="preserve">The user selects</w:t>
+      </w:r>
+      <w:r>
+        <w:t xml:space="preserve"> </w:t>
+      </w:r>
+      <w:r>
+        <w:t xml:space="preserve">“Continue”</w:t>
+      </w:r>
+      <w:r>
+        <w:t xml:space="preserve"> </w:t>
+      </w:r>
+      <w:r>
+        <w:t xml:space="preserve">with the current algorithm,</w:t>
+      </w:r>
+    </w:p>
+    <w:p>
+      <w:pPr>
+        <w:pStyle w:val="Compact"/>
+        <w:numPr>
+          <w:ilvl w:val="0"/>
+          <w:numId w:val="1017"/>
+        </w:numPr>
+      </w:pPr>
+      <w:r>
+        <w:rPr>
+          <w:b/>
+          <w:bCs/>
+        </w:rPr>
+        <w:t xml:space="preserve">Then:</w:t>
+      </w:r>
+      <w:r>
+        <w:t xml:space="preserve"> </w:t>
+      </w:r>
+      <w:r>
+        <w:t xml:space="preserve">The system resumes processing.</w:t>
+      </w:r>
+    </w:p>
+    <w:p>
+      <w:pPr>
+        <w:pStyle w:val="Compact"/>
+        <w:numPr>
+          <w:ilvl w:val="0"/>
+          <w:numId w:val="1017"/>
+        </w:numPr>
+      </w:pPr>
+      <w:r>
+        <w:rPr>
+          <w:b/>
+          <w:bCs/>
+        </w:rPr>
+        <w:t xml:space="preserve">When:</w:t>
+      </w:r>
+      <w:r>
+        <w:t xml:space="preserve"> </w:t>
+      </w:r>
+      <w:r>
+        <w:t xml:space="preserve">The user selects</w:t>
+      </w:r>
+      <w:r>
+        <w:t xml:space="preserve"> </w:t>
+      </w:r>
+      <w:r>
+        <w:t xml:space="preserve">“Change algorithm”</w:t>
+      </w:r>
+      <w:r>
+        <w:t xml:space="preserve"> </w:t>
+      </w:r>
+      <w:r>
+        <w:t xml:space="preserve">and picks a new one,</w:t>
+      </w:r>
+    </w:p>
+    <w:p>
+      <w:pPr>
+        <w:pStyle w:val="Compact"/>
+        <w:numPr>
+          <w:ilvl w:val="0"/>
+          <w:numId w:val="1017"/>
+        </w:numPr>
+      </w:pPr>
+      <w:r>
+        <w:rPr>
+          <w:b/>
+          <w:bCs/>
+        </w:rPr>
+        <w:t xml:space="preserve">Then:</w:t>
+      </w:r>
+      <w:r>
+        <w:t xml:space="preserve"> </w:t>
+      </w:r>
+      <w:r>
+        <w:t xml:space="preserve">The system restarts reconstruction with the new algorithm.</w:t>
+      </w:r>
+    </w:p>
+    <w:p>
+      <w:pPr>
+        <w:pStyle w:val="Compact"/>
+        <w:numPr>
+          <w:ilvl w:val="0"/>
+          <w:numId w:val="1017"/>
+        </w:numPr>
+      </w:pPr>
+      <w:r>
+        <w:rPr>
+          <w:b/>
+          <w:bCs/>
+        </w:rPr>
+        <w:t xml:space="preserve">When:</w:t>
+      </w:r>
+      <w:r>
+        <w:t xml:space="preserve"> </w:t>
+      </w:r>
+      <w:r>
+        <w:t xml:space="preserve">The user selects</w:t>
+      </w:r>
+      <w:r>
+        <w:t xml:space="preserve"> </w:t>
+      </w:r>
+      <w:r>
+        <w:t xml:space="preserve">“Accept”</w:t>
+      </w:r>
+      <w:r>
+        <w:t xml:space="preserve">,</w:t>
+      </w:r>
+    </w:p>
+    <w:p>
+      <w:pPr>
+        <w:pStyle w:val="Compact"/>
+        <w:numPr>
+          <w:ilvl w:val="0"/>
+          <w:numId w:val="1017"/>
+        </w:numPr>
+      </w:pPr>
+      <w:r>
+        <w:rPr>
+          <w:b/>
+          <w:bCs/>
+        </w:rPr>
+        <w:t xml:space="preserve">Then:</w:t>
+      </w:r>
+      <w:r>
+        <w:t xml:space="preserve"> </w:t>
+      </w:r>
+      <w:r>
+        <w:t xml:space="preserve">The system allows saving the result locally.</w:t>
+      </w:r>
+    </w:p>
+    <w:p>
+      <w:r>
+        <w:pict>
+          <v:rect style="width:0;height:1.5pt" o:hralign="center" o:hrstd="t" o:hr="t"/>
+        </w:pict>
+      </w:r>
+    </w:p>
+    <w:p>
+      <w:pPr>
         <w:pStyle w:val="Heading2"/>
       </w:pPr>
-      <w:bookmarkStart w:id="18" w:name="_74a6988351e924c576c6f7673b837877495fc73"/>
+      <w:bookmarkStart w:id="22" w:name="_74a6988351e924c576c6f7673b837877495fc73"/>
       <w:r>
         <w:t xml:space="preserve">5. Quantifiable Non-Functional Requirements (NFRs)</w:t>
       </w:r>
-      <w:bookmarkEnd w:id="18"/>
+      <w:bookmarkEnd w:id="22"/>
     </w:p>
     <w:tbl>
       <w:tblPr>
@@ -1070,10 +1841,10 @@
         <w:tblLook w:firstRow="1" w:lastRow="0" w:firstColumn="0" w:lastColumn="0" w:noHBand="0" w:noVBand="0" w:val="0020"/>
       </w:tblPr>
       <w:tblGrid>
-        <w:gridCol w:w="548"/>
-        <w:gridCol w:w="1234"/>
-        <w:gridCol w:w="5074"/>
-        <w:gridCol w:w="1062"/>
+        <w:gridCol w:w="1584"/>
+        <w:gridCol w:w="2112"/>
+        <w:gridCol w:w="2112"/>
+        <w:gridCol w:w="2112"/>
       </w:tblGrid>
       <w:tr>
         <w:trPr>
@@ -1157,7 +1928,7 @@
                 <w:b/>
                 <w:bCs/>
               </w:rPr>
-              <w:t xml:space="preserve">Response Time (Latency)</w:t>
+              <w:t xml:space="preserve">Performance (Splitting)</w:t>
             </w:r>
           </w:p>
         </w:tc>
@@ -1169,24 +1940,7 @@
               <w:jc w:val="left"/>
             </w:pPr>
             <w:r>
-              <w:t xml:space="preserve">95% of write and read requests respond in</w:t>
-            </w:r>
-            <m:oMath>
-              <m:r>
-                <m:rPr>
-                  <m:sty m:val="p"/>
-                </m:rPr>
-                <m:t>&lt;</m:t>
-              </m:r>
-              <m:r>
-                <m:t>200</m:t>
-              </m:r>
-            </m:oMath>
-            <w:r>
-              <w:t xml:space="preserve"> </w:t>
-            </w:r>
-            <w:r>
-              <w:t xml:space="preserve">ms under a load of 50 concurrent virtual users.</w:t>
+              <w:t xml:space="preserve">Splitting a single A4-sized document image into at least 50 fragments completes under 60 seconds.</w:t>
             </w:r>
           </w:p>
         </w:tc>
@@ -1198,7 +1952,7 @@
               <w:jc w:val="left"/>
             </w:pPr>
             <w:r>
-              <w:t xml:space="preserve">k6 / Locust load benchmark</w:t>
+              <w:t xml:space="preserve">Automated benchmark script with sample dataset</w:t>
             </w:r>
           </w:p>
         </w:tc>
@@ -1232,7 +1986,7 @@
                 <w:b/>
                 <w:bCs/>
               </w:rPr>
-              <w:t xml:space="preserve">Throughput</w:t>
+              <w:t xml:space="preserve">Performance (Reconstruction)</w:t>
             </w:r>
           </w:p>
         </w:tc>
@@ -1244,30 +1998,7 @@
               <w:jc w:val="left"/>
             </w:pPr>
             <w:r>
-              <w:t xml:space="preserve">Ingestion engine processes</w:t>
-            </w:r>
-            <m:oMath>
-              <m:r>
-                <m:rPr>
-                  <m:sty m:val="p"/>
-                </m:rPr>
-                <m:t>≥</m:t>
-              </m:r>
-              <m:r>
-                <m:t>5</m:t>
-              </m:r>
-              <m:r>
-                <m:t> </m:t>
-              </m:r>
-              <m:r>
-                <m:t>000</m:t>
-              </m:r>
-            </m:oMath>
-            <w:r>
-              <w:t xml:space="preserve"> </w:t>
-            </w:r>
-            <w:r>
-              <w:t xml:space="preserve">events/second on a 4-core machine with 16 GB RAM.</w:t>
+              <w:t xml:space="preserve">Reconstruction of a document with at least 50 fragments completes under 60 minutes.</w:t>
             </w:r>
           </w:p>
         </w:tc>
@@ -1279,7 +2010,7 @@
               <w:jc w:val="left"/>
             </w:pPr>
             <w:r>
-              <w:t xml:space="preserve">Locust stress test</w:t>
+              <w:t xml:space="preserve">Automated benchmark script with sample dataset</w:t>
             </w:r>
           </w:p>
         </w:tc>
@@ -1313,7 +2044,7 @@
                 <w:b/>
                 <w:bCs/>
               </w:rPr>
-              <w:t xml:space="preserve">Resource Utilization</w:t>
+              <w:t xml:space="preserve">Scalability</w:t>
             </w:r>
           </w:p>
         </w:tc>
@@ -1325,24 +2056,7 @@
               <w:jc w:val="left"/>
             </w:pPr>
             <w:r>
-              <w:t xml:space="preserve">Total idle RAM consumption of the container stack</w:t>
-            </w:r>
-            <m:oMath>
-              <m:r>
-                <m:rPr>
-                  <m:sty m:val="p"/>
-                </m:rPr>
-                <m:t>≤</m:t>
-              </m:r>
-              <m:r>
-                <m:t>2.0</m:t>
-              </m:r>
-            </m:oMath>
-            <w:r>
-              <w:t xml:space="preserve"> </w:t>
-            </w:r>
-            <w:r>
-              <w:t xml:space="preserve">GB; analytical model runs in CPU memory without GPU requirements.</w:t>
+              <w:t xml:space="preserve">The system handles documents split into up to 100 fragments without crashing.</w:t>
             </w:r>
           </w:p>
         </w:tc>
@@ -1354,10 +2068,7 @@
               <w:jc w:val="left"/>
             </w:pPr>
             <w:r>
-              <w:rPr>
-                <w:rStyle w:val="VerbatimChar"/>
-              </w:rPr>
-              <w:t xml:space="preserve">docker stats</w:t>
+              <w:t xml:space="preserve">Stress tess</w:t>
             </w:r>
           </w:p>
         </w:tc>
@@ -1391,7 +2102,7 @@
                 <w:b/>
                 <w:bCs/>
               </w:rPr>
-              <w:t xml:space="preserve">Deployment Reproducibility</w:t>
+              <w:t xml:space="preserve">Usability</w:t>
             </w:r>
           </w:p>
         </w:tc>
@@ -1403,39 +2114,7 @@
               <w:jc w:val="left"/>
             </w:pPr>
             <w:r>
-              <w:t xml:space="preserve">Complete deployment and startup of a clean environment using</w:t>
-            </w:r>
-            <w:r>
-              <w:rPr>
-                <w:rStyle w:val="VerbatimChar"/>
-              </w:rPr>
-              <w:t xml:space="preserve">docker compose up --build</w:t>
-            </w:r>
-            <w:r>
-              <w:t xml:space="preserve"> </w:t>
-            </w:r>
-            <w:r>
-              <w:t xml:space="preserve">completes in</w:t>
-            </w:r>
-            <w:r>
-              <w:t xml:space="preserve"> </w:t>
-            </w:r>
-            <m:oMath>
-              <m:r>
-                <m:rPr>
-                  <m:sty m:val="p"/>
-                </m:rPr>
-                <m:t>&lt;</m:t>
-              </m:r>
-              <m:r>
-                <m:t>3</m:t>
-              </m:r>
-            </m:oMath>
-            <w:r>
-              <w:t xml:space="preserve"> </w:t>
-            </w:r>
-            <w:r>
-              <w:t xml:space="preserve">minutes on a MiNI lab Ubuntu machine.</w:t>
+              <w:t xml:space="preserve">A user with no prior training can complete a full split-and-reconstruct workflow.</w:t>
             </w:r>
           </w:p>
         </w:tc>
@@ -1447,7 +2126,7 @@
               <w:jc w:val="left"/>
             </w:pPr>
             <w:r>
-              <w:t xml:space="preserve">Stopwatch / installation script</w:t>
+              <w:t xml:space="preserve">Usability test</w:t>
             </w:r>
           </w:p>
         </w:tc>
@@ -1481,7 +2160,7 @@
                 <w:b/>
                 <w:bCs/>
               </w:rPr>
-              <w:t xml:space="preserve">Reliability</w:t>
+              <w:t xml:space="preserve">Error Handling</w:t>
             </w:r>
           </w:p>
         </w:tc>
@@ -1493,7 +2172,7 @@
               <w:jc w:val="left"/>
             </w:pPr>
             <w:r>
-              <w:t xml:space="preserve">0 unhandled HTTP 500 exceptions on malformed input data; automated database reconnection retries in containers.</w:t>
+              <w:t xml:space="preserve">100% of invalid inputs produce a user-friendly error message.</w:t>
             </w:r>
           </w:p>
         </w:tc>
@@ -1505,7 +2184,123 @@
               <w:jc w:val="left"/>
             </w:pPr>
             <w:r>
-              <w:t xml:space="preserve">pytest integration test suite</w:t>
+              <w:t xml:space="preserve">test covering all invalid input scenarios</w:t>
+            </w:r>
+          </w:p>
+        </w:tc>
+      </w:tr>
+      <w:tr>
+        <w:tc>
+          <w:tcPr/>
+          <w:p>
+            <w:pPr>
+              <w:pStyle w:val="Compact"/>
+              <w:jc w:val="center"/>
+            </w:pPr>
+            <w:r>
+              <w:rPr>
+                <w:b/>
+                <w:bCs/>
+              </w:rPr>
+              <w:t xml:space="preserve">NFR-06</w:t>
+            </w:r>
+          </w:p>
+        </w:tc>
+        <w:tc>
+          <w:tcPr/>
+          <w:p>
+            <w:pPr>
+              <w:pStyle w:val="Compact"/>
+              <w:jc w:val="left"/>
+            </w:pPr>
+            <w:r>
+              <w:rPr>
+                <w:b/>
+                <w:bCs/>
+              </w:rPr>
+              <w:t xml:space="preserve">Availability</w:t>
+            </w:r>
+          </w:p>
+        </w:tc>
+        <w:tc>
+          <w:tcPr/>
+          <w:p>
+            <w:pPr>
+              <w:pStyle w:val="Compact"/>
+              <w:jc w:val="left"/>
+            </w:pPr>
+            <w:r>
+              <w:t xml:space="preserve">The system operates fully offline</w:t>
+            </w:r>
+          </w:p>
+        </w:tc>
+        <w:tc>
+          <w:tcPr/>
+          <w:p>
+            <w:pPr>
+              <w:pStyle w:val="Compact"/>
+              <w:jc w:val="left"/>
+            </w:pPr>
+            <w:r>
+              <w:t xml:space="preserve">Disconnected network test</w:t>
+            </w:r>
+          </w:p>
+        </w:tc>
+      </w:tr>
+      <w:tr>
+        <w:tc>
+          <w:tcPr/>
+          <w:p>
+            <w:pPr>
+              <w:pStyle w:val="Compact"/>
+              <w:jc w:val="center"/>
+            </w:pPr>
+            <w:r>
+              <w:rPr>
+                <w:b/>
+                <w:bCs/>
+              </w:rPr>
+              <w:t xml:space="preserve">NFR-07</w:t>
+            </w:r>
+          </w:p>
+        </w:tc>
+        <w:tc>
+          <w:tcPr/>
+          <w:p>
+            <w:pPr>
+              <w:pStyle w:val="Compact"/>
+              <w:jc w:val="left"/>
+            </w:pPr>
+            <w:r>
+              <w:rPr>
+                <w:b/>
+                <w:bCs/>
+              </w:rPr>
+              <w:t xml:space="preserve">Security</w:t>
+            </w:r>
+          </w:p>
+        </w:tc>
+        <w:tc>
+          <w:tcPr/>
+          <w:p>
+            <w:pPr>
+              <w:pStyle w:val="Compact"/>
+              <w:jc w:val="left"/>
+            </w:pPr>
+            <w:r>
+              <w:t xml:space="preserve">All image processing is performed locally and no data is transmitted to external servers.</w:t>
+            </w:r>
+          </w:p>
+        </w:tc>
+        <w:tc>
+          <w:tcPr/>
+          <w:p>
+            <w:pPr>
+              <w:pStyle w:val="Compact"/>
+              <w:jc w:val="left"/>
+            </w:pPr>
+            <w:r>
+              <w:t xml:space="preserve">Manual verification of network traffic</w:t>
             </w:r>
           </w:p>
         </w:tc>
@@ -1522,11 +2317,11 @@
       <w:pPr>
         <w:pStyle w:val="Heading2"/>
       </w:pPr>
-      <w:bookmarkStart w:id="19" w:name="_glossary"/>
+      <w:bookmarkStart w:id="23" w:name="_glossary"/>
       <w:r>
         <w:t xml:space="preserve">6. Glossary</w:t>
       </w:r>
-      <w:bookmarkEnd w:id="19"/>
+      <w:bookmarkEnd w:id="23"/>
     </w:p>
     <w:tbl>
       <w:tblPr>
@@ -1790,11 +2585,11 @@
       <w:pPr>
         <w:pStyle w:val="Heading2"/>
       </w:pPr>
-      <w:bookmarkStart w:id="20" w:name="_9355d538fe36870ae34e2533a500119c7a01bed"/>
+      <w:bookmarkStart w:id="24" w:name="_9355d538fe36870ae34e2533a500119c7a01bed"/>
       <w:r>
         <w:t xml:space="preserve">7. Preliminary Risk Register and Role Allocation</w:t>
       </w:r>
-      <w:bookmarkEnd w:id="20"/>
+      <w:bookmarkEnd w:id="24"/>
     </w:p>
     <w:p>
       <w:pPr>
@@ -1814,7 +2609,7 @@
         </w:rPr>
         <w:t xml:space="preserve"> </w:t>
       </w:r>
-      <w:hyperlink r:id="rId21">
+      <w:hyperlink r:id="rId25">
         <w:r>
           <w:rPr>
             <w:rStyle w:val="VerbatimChar"/>
@@ -1845,7 +2640,7 @@
         </w:rPr>
         <w:t xml:space="preserve"> </w:t>
       </w:r>
-      <w:hyperlink r:id="rId22">
+      <w:hyperlink r:id="rId26">
         <w:r>
           <w:rPr>
             <w:rStyle w:val="VerbatimChar"/>
@@ -1874,18 +2669,18 @@
       <w:pPr>
         <w:pStyle w:val="Heading2"/>
       </w:pPr>
-      <w:bookmarkStart w:id="23" w:name="_e7661c3f8e43572b2cbb74e30a10316b34a2af0"/>
+      <w:bookmarkStart w:id="27" w:name="_e7661c3f8e43572b2cbb74e30a10316b34a2af0"/>
       <w:r>
         <w:t xml:space="preserve">8. Formal Supervisor Acceptance</w:t>
       </w:r>
-      <w:bookmarkEnd w:id="23"/>
-    </w:p>
-    <w:p>
-      <w:pPr>
-        <w:pStyle w:val="Compact"/>
-        <w:numPr>
-          <w:ilvl w:val="0"/>
-          <w:numId w:val="1010"/>
+      <w:bookmarkEnd w:id="27"/>
+    </w:p>
+    <w:p>
+      <w:pPr>
+        <w:pStyle w:val="Compact"/>
+        <w:numPr>
+          <w:ilvl w:val="0"/>
+          <w:numId w:val="1018"/>
         </w:numPr>
       </w:pPr>
       <w:r>
@@ -2395,6 +3190,30 @@
     <w:abstractNumId w:val="991"/>
   </w:num>
   <w:num w:numId="1010">
+    <w:abstractNumId w:val="991"/>
+  </w:num>
+  <w:num w:numId="1011">
+    <w:abstractNumId w:val="991"/>
+  </w:num>
+  <w:num w:numId="1012">
+    <w:abstractNumId w:val="991"/>
+  </w:num>
+  <w:num w:numId="1013">
+    <w:abstractNumId w:val="991"/>
+  </w:num>
+  <w:num w:numId="1014">
+    <w:abstractNumId w:val="991"/>
+  </w:num>
+  <w:num w:numId="1015">
+    <w:abstractNumId w:val="991"/>
+  </w:num>
+  <w:num w:numId="1016">
+    <w:abstractNumId w:val="991"/>
+  </w:num>
+  <w:num w:numId="1017">
+    <w:abstractNumId w:val="991"/>
+  </w:num>
+  <w:num w:numId="1018">
     <w:abstractNumId w:val="993"/>
   </w:num>
 </w:numbering>

</xml_diff>

<commit_message>
added risk register and contingency plans
</commit_message>
<xml_diff>
--- a/docs/engineering_project_report.docx
+++ b/docs/engineering_project_report.docx
@@ -2,15 +2,14 @@
 <file path=word/document.xml><?xml version="1.0" encoding="utf-8"?>
 <w:document xmlns:w="http://schemas.openxmlformats.org/wordprocessingml/2006/main" xmlns:m="http://schemas.openxmlformats.org/officeDocument/2006/math" xmlns:r="http://schemas.openxmlformats.org/officeDocument/2006/relationships" xmlns:o="urn:schemas-microsoft-com:office:office" xmlns:v="urn:schemas-microsoft-com:vml" xmlns:w10="urn:schemas-microsoft-com:office:word" xmlns:a="http://schemas.openxmlformats.org/drawingml/2006/main" xmlns:pic="http://schemas.openxmlformats.org/drawingml/2006/picture" xmlns:wp="http://schemas.openxmlformats.org/drawingml/2006/wordprocessingDrawing">
   <w:body>
+    <w:bookmarkStart w:id="29" w:name="Xcbf66d44cddd739ff66a8f4ebd6e07e67a6b8c0"/>
     <w:p>
       <w:pPr>
         <w:pStyle w:val="Heading1"/>
       </w:pPr>
-      <w:bookmarkStart w:id="9" w:name="_cbf66d44cddd739ff66a8f4ebd6e07e67a6b8c0"/>
       <w:r>
         <w:t xml:space="preserve">Stage 1 Document: Requirements Specification and Project Scope</w:t>
       </w:r>
-      <w:bookmarkEnd w:id="9"/>
     </w:p>
     <w:p>
       <w:pPr>
@@ -51,15 +50,14 @@
         </w:pict>
       </w:r>
     </w:p>
+    <w:bookmarkStart w:id="9" w:name="document-metadata-and-change-history"/>
     <w:p>
       <w:pPr>
         <w:pStyle w:val="Heading2"/>
       </w:pPr>
-      <w:bookmarkStart w:id="10" w:name="_359c456ad8a5e19f4e9450cf8fc98d79a9b3b06"/>
       <w:r>
         <w:t xml:space="preserve">1. Document Metadata and Change History</w:t>
       </w:r>
-      <w:bookmarkEnd w:id="10"/>
     </w:p>
     <w:tbl>
       <w:tblPr>
@@ -152,31 +150,31 @@
               <w:jc w:val="center"/>
             </w:pPr>
             <w:r>
-              <w:t xml:space="preserve">15.10.2024</w:t>
-            </w:r>
-          </w:p>
-        </w:tc>
-        <w:tc>
-          <w:tcPr/>
-          <w:p>
-            <w:pPr>
-              <w:pStyle w:val="Compact"/>
-              <w:jc w:val="center"/>
-            </w:pPr>
-            <w:r>
-              <w:t xml:space="preserve">Alice Kowalska</w:t>
-            </w:r>
-          </w:p>
-        </w:tc>
-        <w:tc>
-          <w:tcPr/>
-          <w:p>
-            <w:pPr>
-              <w:pStyle w:val="Compact"/>
-              <w:jc w:val="left"/>
-            </w:pPr>
-            <w:r>
-              <w:t xml:space="preserve">Baseline version for supervisor sign-off</w:t>
+              <w:t xml:space="preserve">13.10.2026</w:t>
+            </w:r>
+          </w:p>
+        </w:tc>
+        <w:tc>
+          <w:tcPr/>
+          <w:p>
+            <w:pPr>
+              <w:pStyle w:val="Compact"/>
+              <w:jc w:val="center"/>
+            </w:pPr>
+            <w:r>
+              <w:t xml:space="preserve">Zuzanna Zalewska</w:t>
+            </w:r>
+          </w:p>
+        </w:tc>
+        <w:tc>
+          <w:tcPr/>
+          <w:p>
+            <w:pPr>
+              <w:pStyle w:val="Compact"/>
+              <w:jc w:val="left"/>
+            </w:pPr>
+            <w:r>
+              <w:t xml:space="preserve">Baseline version for supervisor sign-off, problem formulation and project scope</w:t>
             </w:r>
           </w:p>
         </w:tc>
@@ -206,31 +204,85 @@
               <w:jc w:val="center"/>
             </w:pPr>
             <w:r>
-              <w:t xml:space="preserve">18.10.2024</w:t>
-            </w:r>
-          </w:p>
-        </w:tc>
-        <w:tc>
-          <w:tcPr/>
-          <w:p>
-            <w:pPr>
-              <w:pStyle w:val="Compact"/>
-              <w:jc w:val="center"/>
-            </w:pPr>
-            <w:r>
-              <w:t xml:space="preserve">Bob Nowak</w:t>
-            </w:r>
-          </w:p>
-        </w:tc>
-        <w:tc>
-          <w:tcPr/>
-          <w:p>
-            <w:pPr>
-              <w:pStyle w:val="Compact"/>
-              <w:jc w:val="left"/>
-            </w:pPr>
-            <w:r>
-              <w:t xml:space="preserve">Added quantifiable non-functional requirements (NFRs)</w:t>
+              <w:t xml:space="preserve">14.10.2026</w:t>
+            </w:r>
+          </w:p>
+        </w:tc>
+        <w:tc>
+          <w:tcPr/>
+          <w:p>
+            <w:pPr>
+              <w:pStyle w:val="Compact"/>
+              <w:jc w:val="center"/>
+            </w:pPr>
+            <w:r>
+              <w:t xml:space="preserve">Zuzanna Zalewska</w:t>
+            </w:r>
+          </w:p>
+        </w:tc>
+        <w:tc>
+          <w:tcPr/>
+          <w:p>
+            <w:pPr>
+              <w:pStyle w:val="Compact"/>
+              <w:jc w:val="left"/>
+            </w:pPr>
+            <w:r>
+              <w:t xml:space="preserve">Added functional non-functional requirements</w:t>
+            </w:r>
+          </w:p>
+        </w:tc>
+      </w:tr>
+      <w:tr>
+        <w:tc>
+          <w:tcPr/>
+          <w:p>
+            <w:pPr>
+              <w:pStyle w:val="Compact"/>
+              <w:jc w:val="center"/>
+            </w:pPr>
+            <w:r>
+              <w:rPr>
+                <w:b/>
+                <w:bCs/>
+              </w:rPr>
+              <w:t xml:space="preserve">1.2</w:t>
+            </w:r>
+          </w:p>
+        </w:tc>
+        <w:tc>
+          <w:tcPr/>
+          <w:p>
+            <w:pPr>
+              <w:pStyle w:val="Compact"/>
+              <w:jc w:val="center"/>
+            </w:pPr>
+            <w:r>
+              <w:t xml:space="preserve">15.10.2026</w:t>
+            </w:r>
+          </w:p>
+        </w:tc>
+        <w:tc>
+          <w:tcPr/>
+          <w:p>
+            <w:pPr>
+              <w:pStyle w:val="Compact"/>
+              <w:jc w:val="center"/>
+            </w:pPr>
+            <w:r>
+              <w:t xml:space="preserve">Martyna Sadowska</w:t>
+            </w:r>
+          </w:p>
+        </w:tc>
+        <w:tc>
+          <w:tcPr/>
+          <w:p>
+            <w:pPr>
+              <w:pStyle w:val="Compact"/>
+              <w:jc w:val="left"/>
+            </w:pPr>
+            <w:r>
+              <w:t xml:space="preserve">Added risk register and contingency plans</w:t>
             </w:r>
           </w:p>
         </w:tc>
@@ -313,15 +365,15 @@
         </w:pict>
       </w:r>
     </w:p>
+    <w:bookmarkEnd w:id="9"/>
+    <w:bookmarkStart w:id="10" w:name="X208661bb300c19ea44f94b3286f175eadce5de7"/>
     <w:p>
       <w:pPr>
         <w:pStyle w:val="Heading2"/>
       </w:pPr>
-      <w:bookmarkStart w:id="11" w:name="_208661bb300c19ea44f94b3286f175eadce5de7"/>
       <w:r>
         <w:t xml:space="preserve">2. One-Sentence Engineering / Research Problem Formulation</w:t>
       </w:r>
-      <w:bookmarkEnd w:id="11"/>
     </w:p>
     <w:p>
       <w:pPr>
@@ -342,25 +394,24 @@
         </w:pict>
       </w:r>
     </w:p>
+    <w:bookmarkEnd w:id="10"/>
+    <w:bookmarkStart w:id="13" w:name="X849c5ef3e6a95175330fde1820214ed9a3f2f63"/>
     <w:p>
       <w:pPr>
         <w:pStyle w:val="Heading2"/>
       </w:pPr>
-      <w:bookmarkStart w:id="12" w:name="_849c5ef3e6a95175330fde1820214ed9a3f2f63"/>
       <w:r>
         <w:t xml:space="preserve">3. Project Scope: MVP vs. Future Work (Scope Management)</w:t>
       </w:r>
-      <w:bookmarkEnd w:id="12"/>
-    </w:p>
+    </w:p>
+    <w:bookmarkStart w:id="11" w:name="minimum-viable-product-mvp-passing-scope"/>
     <w:p>
       <w:pPr>
         <w:pStyle w:val="Heading3"/>
       </w:pPr>
-      <w:bookmarkStart w:id="13" w:name="_1e9c6e17298c255f6f09138aa09bd283f770454"/>
       <w:r>
         <w:t xml:space="preserve">3.1. Minimum Viable Product (MVP – Passing Scope)</w:t>
       </w:r>
-      <w:bookmarkEnd w:id="13"/>
     </w:p>
     <w:p>
       <w:pPr>
@@ -466,15 +517,15 @@
         <w:t xml:space="preserve">Displays the reconstructed output, allows iterative improvement (adjusting time or algorithm), and saves the final result locally.</w:t>
       </w:r>
     </w:p>
+    <w:bookmarkEnd w:id="11"/>
+    <w:bookmarkStart w:id="12" w:name="out-of-scope-future-work"/>
     <w:p>
       <w:pPr>
         <w:pStyle w:val="Heading3"/>
       </w:pPr>
-      <w:bookmarkStart w:id="14" w:name="_da33a321df5d4b4c544dd8a8c7335a1a5f37196"/>
       <w:r>
         <w:t xml:space="preserve">3.2. Out of Scope (Future Work)</w:t>
       </w:r>
-      <w:bookmarkEnd w:id="14"/>
     </w:p>
     <w:p>
       <w:pPr>
@@ -507,21 +558,22 @@
         </w:pict>
       </w:r>
     </w:p>
+    <w:bookmarkEnd w:id="12"/>
+    <w:bookmarkEnd w:id="13"/>
+    <w:bookmarkStart w:id="20" w:name="X32c7745bee60674eb057a95928e5168c201f3b9"/>
     <w:p>
       <w:pPr>
         <w:pStyle w:val="Heading2"/>
       </w:pPr>
-      <w:bookmarkStart w:id="15" w:name="_32c7745bee60674eb057a95928e5168c201f3b9"/>
       <w:r>
         <w:t xml:space="preserve">4. Functional Requirements (User Stories &amp; Acceptance Criteria)</w:t>
       </w:r>
-      <w:bookmarkEnd w:id="15"/>
-    </w:p>
+    </w:p>
+    <w:bookmarkStart w:id="14" w:name="X57417cdd8d8443ebed76ce7719983dd2c07d353"/>
     <w:p>
       <w:pPr>
         <w:pStyle w:val="Heading3"/>
       </w:pPr>
-      <w:bookmarkStart w:id="16" w:name="_57417cdd8d8443ebed76ce7719983dd2c07d353"/>
       <w:r>
         <w:rPr>
           <w:b/>
@@ -529,7 +581,6 @@
         </w:rPr>
         <w:t xml:space="preserve">US-01: Loading a document image for splitting</w:t>
       </w:r>
-      <w:bookmarkEnd w:id="16"/>
     </w:p>
     <w:p>
       <w:pPr>
@@ -742,11 +793,12 @@
         </w:pict>
       </w:r>
     </w:p>
+    <w:bookmarkEnd w:id="14"/>
+    <w:bookmarkStart w:id="15" w:name="Xf47538c0b533229e806588be09ef0bf151e1dc4"/>
     <w:p>
       <w:pPr>
         <w:pStyle w:val="Heading3"/>
       </w:pPr>
-      <w:bookmarkStart w:id="17" w:name="_f47538c0b533229e806588be09ef0bf151e1dc4"/>
       <w:r>
         <w:rPr>
           <w:b/>
@@ -754,7 +806,6 @@
         </w:rPr>
         <w:t xml:space="preserve">US-02: Splitting a document into fragments</w:t>
       </w:r>
-      <w:bookmarkEnd w:id="17"/>
     </w:p>
     <w:p>
       <w:pPr>
@@ -960,11 +1011,12 @@
         </w:pict>
       </w:r>
     </w:p>
+    <w:bookmarkEnd w:id="15"/>
+    <w:bookmarkStart w:id="16" w:name="us-03-generating-a-fragmented-image"/>
     <w:p>
       <w:pPr>
         <w:pStyle w:val="Heading3"/>
       </w:pPr>
-      <w:bookmarkStart w:id="18" w:name="_f97a41c56bb88b6e431db06e70a2b1a15570e21"/>
       <w:r>
         <w:rPr>
           <w:b/>
@@ -972,7 +1024,6 @@
         </w:rPr>
         <w:t xml:space="preserve">US-03: Generating a fragmented image</w:t>
       </w:r>
-      <w:bookmarkEnd w:id="18"/>
     </w:p>
     <w:p>
       <w:pPr>
@@ -1147,11 +1198,12 @@
         </w:pict>
       </w:r>
     </w:p>
+    <w:bookmarkEnd w:id="16"/>
+    <w:bookmarkStart w:id="17" w:name="Xe74ca91d32794644ddf35cae32992f3ab071ad1"/>
     <w:p>
       <w:pPr>
         <w:pStyle w:val="Heading3"/>
       </w:pPr>
-      <w:bookmarkStart w:id="19" w:name="_e74ca91d32794644ddf35cae32992f3ab071ad1"/>
       <w:r>
         <w:rPr>
           <w:b/>
@@ -1159,7 +1211,6 @@
         </w:rPr>
         <w:t xml:space="preserve">US-04: Extracting fragments from an input image</w:t>
       </w:r>
-      <w:bookmarkEnd w:id="19"/>
     </w:p>
     <w:p>
       <w:pPr>
@@ -1372,11 +1423,12 @@
         </w:pict>
       </w:r>
     </w:p>
+    <w:bookmarkEnd w:id="17"/>
+    <w:bookmarkStart w:id="18" w:name="X7d55e9282812fdebaa20850db5960c1af453bcd"/>
     <w:p>
       <w:pPr>
         <w:pStyle w:val="Heading3"/>
       </w:pPr>
-      <w:bookmarkStart w:id="20" w:name="_7d55e9282812fdebaa20850db5960c1af453bcd"/>
       <w:r>
         <w:rPr>
           <w:b/>
@@ -1384,7 +1436,6 @@
         </w:rPr>
         <w:t xml:space="preserve">US-05: Reconstructing a document from fragments</w:t>
       </w:r>
-      <w:bookmarkEnd w:id="20"/>
     </w:p>
     <w:p>
       <w:pPr>
@@ -1537,11 +1588,12 @@
         </w:pict>
       </w:r>
     </w:p>
+    <w:bookmarkEnd w:id="18"/>
+    <w:bookmarkStart w:id="19" w:name="X8e4fbef483609392b257fbf02c771a1538f7008"/>
     <w:p>
       <w:pPr>
         <w:pStyle w:val="Heading3"/>
       </w:pPr>
-      <w:bookmarkStart w:id="21" w:name="_8e4fbef483609392b257fbf02c771a1538f7008"/>
       <w:r>
         <w:rPr>
           <w:b/>
@@ -1549,7 +1601,6 @@
         </w:rPr>
         <w:t xml:space="preserve">US-06: Iterative enhancement of reconstruction</w:t>
       </w:r>
-      <w:bookmarkEnd w:id="21"/>
     </w:p>
     <w:p>
       <w:pPr>
@@ -1823,15 +1874,16 @@
         </w:pict>
       </w:r>
     </w:p>
+    <w:bookmarkEnd w:id="19"/>
+    <w:bookmarkEnd w:id="20"/>
+    <w:bookmarkStart w:id="21" w:name="X74a6988351e924c576c6f7673b837877495fc73"/>
     <w:p>
       <w:pPr>
         <w:pStyle w:val="Heading2"/>
       </w:pPr>
-      <w:bookmarkStart w:id="22" w:name="_74a6988351e924c576c6f7673b837877495fc73"/>
       <w:r>
         <w:t xml:space="preserve">5. Quantifiable Non-Functional Requirements (NFRs)</w:t>
       </w:r>
-      <w:bookmarkEnd w:id="22"/>
     </w:p>
     <w:tbl>
       <w:tblPr>
@@ -2184,7 +2236,7 @@
               <w:jc w:val="left"/>
             </w:pPr>
             <w:r>
-              <w:t xml:space="preserve">test covering all invalid input scenarios</w:t>
+              <w:t xml:space="preserve">Test covering all invalid input scenarios</w:t>
             </w:r>
           </w:p>
         </w:tc>
@@ -2313,15 +2365,15 @@
         </w:pict>
       </w:r>
     </w:p>
+    <w:bookmarkEnd w:id="21"/>
+    <w:bookmarkStart w:id="22" w:name="glossary"/>
     <w:p>
       <w:pPr>
         <w:pStyle w:val="Heading2"/>
       </w:pPr>
-      <w:bookmarkStart w:id="23" w:name="_glossary"/>
       <w:r>
         <w:t xml:space="preserve">6. Glossary</w:t>
       </w:r>
-      <w:bookmarkEnd w:id="23"/>
     </w:p>
     <w:tbl>
       <w:tblPr>
@@ -2581,83 +2633,1184 @@
         </w:pict>
       </w:r>
     </w:p>
+    <w:bookmarkEnd w:id="22"/>
+    <w:bookmarkStart w:id="27" w:name="X9355d538fe36870ae34e2533a500119c7a01bed"/>
     <w:p>
       <w:pPr>
         <w:pStyle w:val="Heading2"/>
       </w:pPr>
-      <w:bookmarkStart w:id="24" w:name="_9355d538fe36870ae34e2533a500119c7a01bed"/>
       <w:r>
         <w:t xml:space="preserve">7. Preliminary Risk Register and Role Allocation</w:t>
       </w:r>
-      <w:bookmarkEnd w:id="24"/>
-    </w:p>
-    <w:p>
-      <w:pPr>
-        <w:pStyle w:val="FirstParagraph"/>
-      </w:pPr>
-      <w:r>
-        <w:rPr>
-          <w:i/>
-          <w:iCs/>
-        </w:rPr>
-        <w:t xml:space="preserve">(Detailed Risk Register and RACI Matrix are defined in dedicated documents:</w:t>
-      </w:r>
-      <w:r>
-        <w:rPr>
-          <w:i/>
-          <w:iCs/>
-        </w:rPr>
-        <w:t xml:space="preserve"> </w:t>
-      </w:r>
-      <w:hyperlink r:id="rId25">
-        <w:r>
-          <w:rPr>
-            <w:rStyle w:val="VerbatimChar"/>
-            <w:i/>
-            <w:iCs/>
-          </w:rPr>
-          <w:t xml:space="preserve">management/risk-register-and-contingency.md</w:t>
-        </w:r>
-      </w:hyperlink>
-      <w:r>
-        <w:rPr>
-          <w:i/>
-          <w:iCs/>
-        </w:rPr>
-        <w:t xml:space="preserve"> </w:t>
-      </w:r>
-      <w:r>
-        <w:rPr>
-          <w:i/>
-          <w:iCs/>
-        </w:rPr>
-        <w:t xml:space="preserve">and</w:t>
-      </w:r>
-      <w:r>
-        <w:rPr>
-          <w:i/>
-          <w:iCs/>
-        </w:rPr>
-        <w:t xml:space="preserve"> </w:t>
-      </w:r>
-      <w:hyperlink r:id="rId26">
-        <w:r>
-          <w:rPr>
-            <w:rStyle w:val="VerbatimChar"/>
-            <w:i/>
-            <w:iCs/>
-          </w:rPr>
-          <w:t xml:space="preserve">management/team-charter-and-raci.md</w:t>
-        </w:r>
-      </w:hyperlink>
-      <w:r>
-        <w:rPr>
-          <w:i/>
-          <w:iCs/>
-        </w:rPr>
-        <w:t xml:space="preserve">.)</w:t>
-      </w:r>
-    </w:p>
+    </w:p>
+    <w:bookmarkStart w:id="23" w:name="project-and-technical-risk-register"/>
+    <w:p>
+      <w:pPr>
+        <w:pStyle w:val="Heading3"/>
+      </w:pPr>
+      <w:r>
+        <w:t xml:space="preserve">7.1 Project and Technical Risk Register</w:t>
+      </w:r>
+    </w:p>
+    <w:tbl>
+      <w:tblPr>
+        <w:tblStyle w:val="Table"/>
+        <w:tblW w:type="pct" w:w="5000"/>
+        <w:tblLayout w:type="fixed"/>
+        <w:tblLook w:firstRow="1" w:lastRow="0" w:firstColumn="0" w:lastColumn="0" w:noHBand="0" w:noVBand="0" w:val="0020"/>
+      </w:tblPr>
+      <w:tblGrid>
+        <w:gridCol w:w="502"/>
+        <w:gridCol w:w="1885"/>
+        <w:gridCol w:w="565"/>
+        <w:gridCol w:w="597"/>
+        <w:gridCol w:w="251"/>
+        <w:gridCol w:w="4117"/>
+      </w:tblGrid>
+      <w:tr>
+        <w:trPr>
+          <w:tblHeader w:val="on"/>
+        </w:trPr>
+        <w:tc>
+          <w:tcPr/>
+          <w:p>
+            <w:pPr>
+              <w:pStyle w:val="Compact"/>
+              <w:jc w:val="center"/>
+            </w:pPr>
+            <w:r>
+              <w:t xml:space="preserve">ID</w:t>
+            </w:r>
+          </w:p>
+        </w:tc>
+        <w:tc>
+          <w:tcPr/>
+          <w:p>
+            <w:pPr>
+              <w:pStyle w:val="Compact"/>
+              <w:jc w:val="left"/>
+            </w:pPr>
+            <w:r>
+              <w:t xml:space="preserve">Risk Event</w:t>
+            </w:r>
+          </w:p>
+        </w:tc>
+        <w:tc>
+          <w:tcPr/>
+          <w:p>
+            <w:pPr>
+              <w:pStyle w:val="Compact"/>
+              <w:jc w:val="center"/>
+            </w:pPr>
+            <w:r>
+              <w:t xml:space="preserve">Likelihood (L/M/H)</w:t>
+            </w:r>
+          </w:p>
+        </w:tc>
+        <w:tc>
+          <w:tcPr/>
+          <w:p>
+            <w:pPr>
+              <w:pStyle w:val="Compact"/>
+              <w:jc w:val="center"/>
+            </w:pPr>
+            <w:r>
+              <w:t xml:space="preserve">Impact (L/M/H/Crit)</w:t>
+            </w:r>
+          </w:p>
+        </w:tc>
+        <w:tc>
+          <w:tcPr/>
+          <w:p>
+            <w:pPr>
+              <w:pStyle w:val="Compact"/>
+              <w:jc w:val="center"/>
+            </w:pPr>
+            <w:r>
+              <w:t xml:space="preserve">Owner</w:t>
+            </w:r>
+          </w:p>
+        </w:tc>
+        <w:tc>
+          <w:tcPr/>
+          <w:p>
+            <w:pPr>
+              <w:pStyle w:val="Compact"/>
+              <w:jc w:val="left"/>
+            </w:pPr>
+            <w:r>
+              <w:t xml:space="preserve">Mitigation Strategy</w:t>
+            </w:r>
+          </w:p>
+        </w:tc>
+      </w:tr>
+      <w:tr>
+        <w:tc>
+          <w:tcPr/>
+          <w:p>
+            <w:pPr>
+              <w:pStyle w:val="Compact"/>
+              <w:jc w:val="center"/>
+            </w:pPr>
+            <w:r>
+              <w:rPr>
+                <w:b/>
+                <w:bCs/>
+              </w:rPr>
+              <w:t xml:space="preserve">RSK-01</w:t>
+            </w:r>
+          </w:p>
+        </w:tc>
+        <w:tc>
+          <w:tcPr/>
+          <w:p>
+            <w:pPr>
+              <w:pStyle w:val="Compact"/>
+              <w:jc w:val="left"/>
+            </w:pPr>
+            <w:r>
+              <w:rPr>
+                <w:b/>
+                <w:bCs/>
+              </w:rPr>
+              <w:t xml:space="preserve">Team member illness / drop-out</w:t>
+            </w:r>
+          </w:p>
+        </w:tc>
+        <w:tc>
+          <w:tcPr/>
+          <w:p>
+            <w:pPr>
+              <w:pStyle w:val="Compact"/>
+              <w:jc w:val="center"/>
+            </w:pPr>
+            <w:r>
+              <w:t xml:space="preserve">L</w:t>
+            </w:r>
+          </w:p>
+        </w:tc>
+        <w:tc>
+          <w:tcPr/>
+          <w:p>
+            <w:pPr>
+              <w:pStyle w:val="Compact"/>
+              <w:jc w:val="center"/>
+            </w:pPr>
+            <w:r>
+              <w:t xml:space="preserve">H</w:t>
+            </w:r>
+          </w:p>
+        </w:tc>
+        <w:tc>
+          <w:tcPr/>
+          <w:p>
+            <w:pPr>
+              <w:pStyle w:val="Compact"/>
+              <w:jc w:val="center"/>
+            </w:pPr>
+            <w:r>
+              <w:t xml:space="preserve">Everyone</w:t>
+            </w:r>
+          </w:p>
+        </w:tc>
+        <w:tc>
+          <w:tcPr/>
+          <w:p>
+            <w:pPr>
+              <w:pStyle w:val="Compact"/>
+              <w:jc w:val="left"/>
+            </w:pPr>
+            <w:r>
+              <w:t xml:space="preserve">Peer code review for every PR, pair programming on the critical path, modular architecture.</w:t>
+            </w:r>
+          </w:p>
+        </w:tc>
+      </w:tr>
+      <w:tr>
+        <w:tc>
+          <w:tcPr/>
+          <w:p>
+            <w:pPr>
+              <w:pStyle w:val="Compact"/>
+              <w:jc w:val="center"/>
+            </w:pPr>
+            <w:r>
+              <w:rPr>
+                <w:b/>
+                <w:bCs/>
+              </w:rPr>
+              <w:t xml:space="preserve">RSK-02</w:t>
+            </w:r>
+          </w:p>
+        </w:tc>
+        <w:tc>
+          <w:tcPr/>
+          <w:p>
+            <w:pPr>
+              <w:pStyle w:val="Compact"/>
+              <w:jc w:val="left"/>
+            </w:pPr>
+            <w:r>
+              <w:rPr>
+                <w:b/>
+                <w:bCs/>
+              </w:rPr>
+              <w:t xml:space="preserve">Insufficient accuracy for the reconstructing algorithm</w:t>
+            </w:r>
+          </w:p>
+        </w:tc>
+        <w:tc>
+          <w:tcPr/>
+          <w:p>
+            <w:pPr>
+              <w:pStyle w:val="Compact"/>
+              <w:jc w:val="center"/>
+            </w:pPr>
+            <w:r>
+              <w:t xml:space="preserve">M</w:t>
+            </w:r>
+          </w:p>
+        </w:tc>
+        <w:tc>
+          <w:tcPr/>
+          <w:p>
+            <w:pPr>
+              <w:pStyle w:val="Compact"/>
+              <w:jc w:val="center"/>
+            </w:pPr>
+            <w:r>
+              <w:t xml:space="preserve">H</w:t>
+            </w:r>
+          </w:p>
+        </w:tc>
+        <w:tc>
+          <w:tcPr/>
+          <w:p>
+            <w:pPr>
+              <w:pStyle w:val="Compact"/>
+              <w:jc w:val="center"/>
+            </w:pPr>
+            <w:r>
+              <w:t xml:space="preserve">Everyone</w:t>
+            </w:r>
+          </w:p>
+        </w:tc>
+        <w:tc>
+          <w:tcPr/>
+          <w:p>
+            <w:pPr>
+              <w:pStyle w:val="Compact"/>
+              <w:jc w:val="left"/>
+            </w:pPr>
+            <w:r>
+              <w:t xml:space="preserve">Explore different algorithms; if the problem persists focus on an analysis of algorithmic limitations and failure cases.</w:t>
+            </w:r>
+          </w:p>
+        </w:tc>
+      </w:tr>
+      <w:tr>
+        <w:tc>
+          <w:tcPr/>
+          <w:p>
+            <w:pPr>
+              <w:pStyle w:val="Compact"/>
+              <w:jc w:val="center"/>
+            </w:pPr>
+            <w:r>
+              <w:rPr>
+                <w:b/>
+                <w:bCs/>
+              </w:rPr>
+              <w:t xml:space="preserve">RSK-03</w:t>
+            </w:r>
+          </w:p>
+        </w:tc>
+        <w:tc>
+          <w:tcPr/>
+          <w:p>
+            <w:pPr>
+              <w:pStyle w:val="Compact"/>
+              <w:jc w:val="left"/>
+            </w:pPr>
+            <w:r>
+              <w:rPr>
+                <w:b/>
+                <w:bCs/>
+              </w:rPr>
+              <w:t xml:space="preserve">Environment incompatibility in the MiNI laboratory</w:t>
+            </w:r>
+          </w:p>
+        </w:tc>
+        <w:tc>
+          <w:tcPr/>
+          <w:p>
+            <w:pPr>
+              <w:pStyle w:val="Compact"/>
+              <w:jc w:val="center"/>
+            </w:pPr>
+            <w:r>
+              <w:t xml:space="preserve">M</w:t>
+            </w:r>
+          </w:p>
+        </w:tc>
+        <w:tc>
+          <w:tcPr/>
+          <w:p>
+            <w:pPr>
+              <w:pStyle w:val="Compact"/>
+              <w:jc w:val="center"/>
+            </w:pPr>
+            <w:r>
+              <w:t xml:space="preserve">Crit</w:t>
+            </w:r>
+          </w:p>
+        </w:tc>
+        <w:tc>
+          <w:tcPr/>
+          <w:p>
+            <w:pPr>
+              <w:pStyle w:val="Compact"/>
+              <w:jc w:val="center"/>
+            </w:pPr>
+            <w:r>
+              <w:t xml:space="preserve">Martyna Sadowska</w:t>
+            </w:r>
+          </w:p>
+        </w:tc>
+        <w:tc>
+          <w:tcPr/>
+          <w:p>
+            <w:pPr>
+              <w:pStyle w:val="Compact"/>
+              <w:jc w:val="left"/>
+            </w:pPr>
+            <w:r>
+              <w:t xml:space="preserve">Test deployment on lab machines after implementing Module 1 and another after Module 2, not the night before acceptance.</w:t>
+            </w:r>
+          </w:p>
+        </w:tc>
+      </w:tr>
+      <w:tr>
+        <w:tc>
+          <w:tcPr/>
+          <w:p>
+            <w:pPr>
+              <w:pStyle w:val="Compact"/>
+              <w:jc w:val="center"/>
+            </w:pPr>
+            <w:r>
+              <w:rPr>
+                <w:b/>
+                <w:bCs/>
+              </w:rPr>
+              <w:t xml:space="preserve">RSK-04</w:t>
+            </w:r>
+          </w:p>
+        </w:tc>
+        <w:tc>
+          <w:tcPr/>
+          <w:p>
+            <w:pPr>
+              <w:pStyle w:val="Compact"/>
+              <w:jc w:val="left"/>
+            </w:pPr>
+            <w:r>
+              <w:rPr>
+                <w:b/>
+                <w:bCs/>
+              </w:rPr>
+              <w:t xml:space="preserve">Hardware failure (loss of data / code on laptop)</w:t>
+            </w:r>
+          </w:p>
+        </w:tc>
+        <w:tc>
+          <w:tcPr/>
+          <w:p>
+            <w:pPr>
+              <w:pStyle w:val="Compact"/>
+              <w:jc w:val="center"/>
+            </w:pPr>
+            <w:r>
+              <w:t xml:space="preserve">M</w:t>
+            </w:r>
+          </w:p>
+        </w:tc>
+        <w:tc>
+          <w:tcPr/>
+          <w:p>
+            <w:pPr>
+              <w:pStyle w:val="Compact"/>
+              <w:jc w:val="center"/>
+            </w:pPr>
+            <w:r>
+              <w:t xml:space="preserve">Crit</w:t>
+            </w:r>
+          </w:p>
+        </w:tc>
+        <w:tc>
+          <w:tcPr/>
+          <w:p>
+            <w:pPr>
+              <w:pStyle w:val="Compact"/>
+              <w:jc w:val="center"/>
+            </w:pPr>
+            <w:r>
+              <w:t xml:space="preserve">Everyone</w:t>
+            </w:r>
+          </w:p>
+        </w:tc>
+        <w:tc>
+          <w:tcPr/>
+          <w:p>
+            <w:pPr>
+              <w:pStyle w:val="Compact"/>
+              <w:jc w:val="left"/>
+            </w:pPr>
+            <w:r>
+              <w:t xml:space="preserve">Pushes to remote repository (GitHub) after each change.</w:t>
+            </w:r>
+          </w:p>
+        </w:tc>
+      </w:tr>
+      <w:tr>
+        <w:tc>
+          <w:tcPr/>
+          <w:p>
+            <w:pPr>
+              <w:pStyle w:val="Compact"/>
+              <w:jc w:val="center"/>
+            </w:pPr>
+            <w:r>
+              <w:rPr>
+                <w:b/>
+                <w:bCs/>
+              </w:rPr>
+              <w:t xml:space="preserve">RSK-05</w:t>
+            </w:r>
+          </w:p>
+        </w:tc>
+        <w:tc>
+          <w:tcPr/>
+          <w:p>
+            <w:pPr>
+              <w:pStyle w:val="Compact"/>
+              <w:jc w:val="left"/>
+            </w:pPr>
+            <w:r>
+              <w:rPr>
+                <w:b/>
+                <w:bCs/>
+              </w:rPr>
+              <w:t xml:space="preserve">Thesis writing workload accumulation in January</w:t>
+            </w:r>
+          </w:p>
+        </w:tc>
+        <w:tc>
+          <w:tcPr/>
+          <w:p>
+            <w:pPr>
+              <w:pStyle w:val="Compact"/>
+              <w:jc w:val="center"/>
+            </w:pPr>
+            <w:r>
+              <w:t xml:space="preserve">H</w:t>
+            </w:r>
+          </w:p>
+        </w:tc>
+        <w:tc>
+          <w:tcPr/>
+          <w:p>
+            <w:pPr>
+              <w:pStyle w:val="Compact"/>
+              <w:jc w:val="center"/>
+            </w:pPr>
+            <w:r>
+              <w:t xml:space="preserve">H</w:t>
+            </w:r>
+          </w:p>
+        </w:tc>
+        <w:tc>
+          <w:tcPr/>
+          <w:p>
+            <w:pPr>
+              <w:pStyle w:val="Compact"/>
+              <w:jc w:val="center"/>
+            </w:pPr>
+            <w:r>
+              <w:t xml:space="preserve">Everyone</w:t>
+            </w:r>
+          </w:p>
+        </w:tc>
+        <w:tc>
+          <w:tcPr/>
+          <w:p>
+            <w:pPr>
+              <w:pStyle w:val="Compact"/>
+              <w:jc w:val="left"/>
+            </w:pPr>
+            <w:r>
+              <w:t xml:space="preserve">Incremental drafting of thesis chapters; peer reviews within the team.</w:t>
+            </w:r>
+          </w:p>
+        </w:tc>
+      </w:tr>
+      <w:tr>
+        <w:tc>
+          <w:tcPr/>
+          <w:p>
+            <w:pPr>
+              <w:pStyle w:val="Compact"/>
+              <w:jc w:val="center"/>
+            </w:pPr>
+            <w:r>
+              <w:rPr>
+                <w:b/>
+                <w:bCs/>
+              </w:rPr>
+              <w:t xml:space="preserve">RSK-06</w:t>
+            </w:r>
+          </w:p>
+        </w:tc>
+        <w:tc>
+          <w:tcPr/>
+          <w:p>
+            <w:pPr>
+              <w:pStyle w:val="Compact"/>
+              <w:jc w:val="left"/>
+            </w:pPr>
+            <w:r>
+              <w:rPr>
+                <w:b/>
+                <w:bCs/>
+              </w:rPr>
+              <w:t xml:space="preserve">Unacceptably long execution time</w:t>
+            </w:r>
+          </w:p>
+        </w:tc>
+        <w:tc>
+          <w:tcPr/>
+          <w:p>
+            <w:pPr>
+              <w:pStyle w:val="Compact"/>
+              <w:jc w:val="center"/>
+            </w:pPr>
+            <w:r>
+              <w:t xml:space="preserve">H</w:t>
+            </w:r>
+          </w:p>
+        </w:tc>
+        <w:tc>
+          <w:tcPr/>
+          <w:p>
+            <w:pPr>
+              <w:pStyle w:val="Compact"/>
+              <w:jc w:val="center"/>
+            </w:pPr>
+            <w:r>
+              <w:t xml:space="preserve">M</w:t>
+            </w:r>
+          </w:p>
+        </w:tc>
+        <w:tc>
+          <w:tcPr/>
+          <w:p>
+            <w:pPr>
+              <w:pStyle w:val="Compact"/>
+              <w:jc w:val="center"/>
+            </w:pPr>
+            <w:r>
+              <w:t xml:space="preserve">Hanna Szczerbińska</w:t>
+            </w:r>
+          </w:p>
+        </w:tc>
+        <w:tc>
+          <w:tcPr/>
+          <w:p>
+            <w:pPr>
+              <w:pStyle w:val="Compact"/>
+              <w:jc w:val="left"/>
+            </w:pPr>
+            <w:r>
+              <w:t xml:space="preserve">Implementing early stopping to the algorithms and accepting the worse results.</w:t>
+            </w:r>
+          </w:p>
+        </w:tc>
+      </w:tr>
+      <w:tr>
+        <w:tc>
+          <w:tcPr/>
+          <w:p>
+            <w:pPr>
+              <w:pStyle w:val="Compact"/>
+              <w:jc w:val="center"/>
+            </w:pPr>
+            <w:r>
+              <w:rPr>
+                <w:b/>
+                <w:bCs/>
+              </w:rPr>
+              <w:t xml:space="preserve">RSK-07</w:t>
+            </w:r>
+          </w:p>
+        </w:tc>
+        <w:tc>
+          <w:tcPr/>
+          <w:p>
+            <w:pPr>
+              <w:pStyle w:val="Compact"/>
+              <w:jc w:val="left"/>
+            </w:pPr>
+            <w:r>
+              <w:rPr>
+                <w:b/>
+                <w:bCs/>
+              </w:rPr>
+              <w:t xml:space="preserve">Rotation of the fragments resulting in quality loss and document illegibility.</w:t>
+            </w:r>
+          </w:p>
+        </w:tc>
+        <w:tc>
+          <w:tcPr/>
+          <w:p>
+            <w:pPr>
+              <w:pStyle w:val="Compact"/>
+              <w:jc w:val="center"/>
+            </w:pPr>
+            <w:r>
+              <w:t xml:space="preserve">M</w:t>
+            </w:r>
+          </w:p>
+        </w:tc>
+        <w:tc>
+          <w:tcPr/>
+          <w:p>
+            <w:pPr>
+              <w:pStyle w:val="Compact"/>
+              <w:jc w:val="center"/>
+            </w:pPr>
+            <w:r>
+              <w:t xml:space="preserve">M</w:t>
+            </w:r>
+          </w:p>
+        </w:tc>
+        <w:tc>
+          <w:tcPr/>
+          <w:p>
+            <w:pPr>
+              <w:pStyle w:val="Compact"/>
+              <w:jc w:val="center"/>
+            </w:pPr>
+            <w:r>
+              <w:t xml:space="preserve">Zuzanna Zalewska</w:t>
+            </w:r>
+          </w:p>
+        </w:tc>
+        <w:tc>
+          <w:tcPr/>
+          <w:p>
+            <w:pPr>
+              <w:pStyle w:val="Compact"/>
+              <w:jc w:val="left"/>
+            </w:pPr>
+            <w:r>
+              <w:t xml:space="preserve">Remembering the fragments’ original visual, rotating it only once to match the found rotation and accepting the loss of information resulting in this operation.</w:t>
+            </w:r>
+          </w:p>
+        </w:tc>
+      </w:tr>
+      <w:tr>
+        <w:tc>
+          <w:tcPr/>
+          <w:p>
+            <w:pPr>
+              <w:pStyle w:val="Compact"/>
+              <w:jc w:val="center"/>
+            </w:pPr>
+            <w:r>
+              <w:rPr>
+                <w:b/>
+                <w:bCs/>
+              </w:rPr>
+              <w:t xml:space="preserve">RSK-08</w:t>
+            </w:r>
+          </w:p>
+        </w:tc>
+        <w:tc>
+          <w:tcPr/>
+          <w:p>
+            <w:pPr>
+              <w:pStyle w:val="Compact"/>
+              <w:jc w:val="left"/>
+            </w:pPr>
+            <w:r>
+              <w:rPr>
+                <w:b/>
+                <w:bCs/>
+              </w:rPr>
+              <w:t xml:space="preserve">Loss of information on the edges of fragments as a result of inacurate cut or assembling.</w:t>
+            </w:r>
+          </w:p>
+        </w:tc>
+        <w:tc>
+          <w:tcPr/>
+          <w:p>
+            <w:pPr>
+              <w:pStyle w:val="Compact"/>
+              <w:jc w:val="center"/>
+            </w:pPr>
+            <w:r>
+              <w:t xml:space="preserve">M</w:t>
+            </w:r>
+          </w:p>
+        </w:tc>
+        <w:tc>
+          <w:tcPr/>
+          <w:p>
+            <w:pPr>
+              <w:pStyle w:val="Compact"/>
+              <w:jc w:val="center"/>
+            </w:pPr>
+            <w:r>
+              <w:t xml:space="preserve">L</w:t>
+            </w:r>
+          </w:p>
+        </w:tc>
+        <w:tc>
+          <w:tcPr/>
+          <w:p>
+            <w:pPr>
+              <w:pStyle w:val="Compact"/>
+              <w:jc w:val="center"/>
+            </w:pPr>
+            <w:r>
+              <w:t xml:space="preserve">Zuzanna Zalewska</w:t>
+            </w:r>
+          </w:p>
+        </w:tc>
+        <w:tc>
+          <w:tcPr/>
+          <w:p>
+            <w:pPr>
+              <w:pStyle w:val="Compact"/>
+              <w:jc w:val="left"/>
+            </w:pPr>
+            <w:r>
+              <w:t xml:space="preserve">Accepting the problem as an opportunity to test the algorithms in a real-world scenario (manual paper shredding).</w:t>
+            </w:r>
+          </w:p>
+        </w:tc>
+      </w:tr>
+      <w:tr>
+        <w:tc>
+          <w:tcPr/>
+          <w:p>
+            <w:pPr>
+              <w:pStyle w:val="Compact"/>
+              <w:jc w:val="center"/>
+            </w:pPr>
+            <w:r>
+              <w:rPr>
+                <w:b/>
+                <w:bCs/>
+              </w:rPr>
+              <w:t xml:space="preserve">RSK-09</w:t>
+            </w:r>
+          </w:p>
+        </w:tc>
+        <w:tc>
+          <w:tcPr/>
+          <w:p>
+            <w:pPr>
+              <w:pStyle w:val="Compact"/>
+              <w:jc w:val="left"/>
+            </w:pPr>
+            <w:r>
+              <w:rPr>
+                <w:b/>
+                <w:bCs/>
+              </w:rPr>
+              <w:t xml:space="preserve">Excessive RAM requirements for running the program smoothly</w:t>
+            </w:r>
+          </w:p>
+        </w:tc>
+        <w:tc>
+          <w:tcPr/>
+          <w:p>
+            <w:pPr>
+              <w:pStyle w:val="Compact"/>
+              <w:jc w:val="center"/>
+            </w:pPr>
+            <w:r>
+              <w:t xml:space="preserve">M</w:t>
+            </w:r>
+          </w:p>
+        </w:tc>
+        <w:tc>
+          <w:tcPr/>
+          <w:p>
+            <w:pPr>
+              <w:pStyle w:val="Compact"/>
+              <w:jc w:val="center"/>
+            </w:pPr>
+            <w:r>
+              <w:t xml:space="preserve">M</w:t>
+            </w:r>
+          </w:p>
+        </w:tc>
+        <w:tc>
+          <w:tcPr/>
+          <w:p>
+            <w:pPr>
+              <w:pStyle w:val="Compact"/>
+              <w:jc w:val="center"/>
+            </w:pPr>
+            <w:r>
+              <w:t xml:space="preserve">Martyna Sadowska</w:t>
+            </w:r>
+          </w:p>
+        </w:tc>
+        <w:tc>
+          <w:tcPr/>
+          <w:p>
+            <w:pPr>
+              <w:pStyle w:val="Compact"/>
+              <w:jc w:val="left"/>
+            </w:pPr>
+            <w:r>
+              <w:t xml:space="preserve">Switching to the faculty MiNI GPU cluster</w:t>
+            </w:r>
+          </w:p>
+        </w:tc>
+      </w:tr>
+      <w:tr>
+        <w:tc>
+          <w:tcPr/>
+          <w:p>
+            <w:pPr>
+              <w:pStyle w:val="Compact"/>
+              <w:jc w:val="center"/>
+            </w:pPr>
+            <w:r>
+              <w:rPr>
+                <w:b/>
+                <w:bCs/>
+              </w:rPr>
+              <w:t xml:space="preserve">RSK-10</w:t>
+            </w:r>
+          </w:p>
+        </w:tc>
+        <w:tc>
+          <w:tcPr/>
+          <w:p>
+            <w:pPr>
+              <w:pStyle w:val="Compact"/>
+              <w:jc w:val="left"/>
+            </w:pPr>
+            <w:r>
+              <w:rPr>
+                <w:b/>
+                <w:bCs/>
+              </w:rPr>
+              <w:t xml:space="preserve">Excessive hyperparameter tuning time</w:t>
+            </w:r>
+          </w:p>
+        </w:tc>
+        <w:tc>
+          <w:tcPr/>
+          <w:p>
+            <w:pPr>
+              <w:pStyle w:val="Compact"/>
+              <w:jc w:val="center"/>
+            </w:pPr>
+            <w:r>
+              <w:t xml:space="preserve">M</w:t>
+            </w:r>
+          </w:p>
+        </w:tc>
+        <w:tc>
+          <w:tcPr/>
+          <w:p>
+            <w:pPr>
+              <w:pStyle w:val="Compact"/>
+              <w:jc w:val="center"/>
+            </w:pPr>
+            <w:r>
+              <w:t xml:space="preserve">M</w:t>
+            </w:r>
+          </w:p>
+        </w:tc>
+        <w:tc>
+          <w:tcPr/>
+          <w:p>
+            <w:pPr>
+              <w:pStyle w:val="Compact"/>
+              <w:jc w:val="center"/>
+            </w:pPr>
+            <w:r>
+              <w:t xml:space="preserve">Hanna Szczerbińska</w:t>
+            </w:r>
+          </w:p>
+        </w:tc>
+        <w:tc>
+          <w:tcPr/>
+          <w:p>
+            <w:pPr>
+              <w:pStyle w:val="Compact"/>
+              <w:jc w:val="left"/>
+            </w:pPr>
+            <w:r>
+              <w:t xml:space="preserve">Finding a different algorithm or accepting the suboptimal hyperparameters.</w:t>
+            </w:r>
+          </w:p>
+        </w:tc>
+      </w:tr>
+      <w:tr>
+        <w:tc>
+          <w:tcPr/>
+          <w:p>
+            <w:pPr>
+              <w:pStyle w:val="Compact"/>
+              <w:jc w:val="center"/>
+            </w:pPr>
+            <w:r>
+              <w:rPr>
+                <w:b/>
+                <w:bCs/>
+              </w:rPr>
+              <w:t xml:space="preserve">RSK-11</w:t>
+            </w:r>
+          </w:p>
+        </w:tc>
+        <w:tc>
+          <w:tcPr/>
+          <w:p>
+            <w:pPr>
+              <w:pStyle w:val="Compact"/>
+              <w:jc w:val="left"/>
+            </w:pPr>
+            <w:r>
+              <w:rPr>
+                <w:b/>
+                <w:bCs/>
+              </w:rPr>
+              <w:t xml:space="preserve">No measurable metrics for assessing the accuracy of splitting and reconstructing the document.</w:t>
+            </w:r>
+          </w:p>
+        </w:tc>
+        <w:tc>
+          <w:tcPr/>
+          <w:p>
+            <w:pPr>
+              <w:pStyle w:val="Compact"/>
+              <w:jc w:val="center"/>
+            </w:pPr>
+            <w:r>
+              <w:t xml:space="preserve">H</w:t>
+            </w:r>
+          </w:p>
+        </w:tc>
+        <w:tc>
+          <w:tcPr/>
+          <w:p>
+            <w:pPr>
+              <w:pStyle w:val="Compact"/>
+              <w:jc w:val="center"/>
+            </w:pPr>
+            <w:r>
+              <w:t xml:space="preserve">M</w:t>
+            </w:r>
+          </w:p>
+        </w:tc>
+        <w:tc>
+          <w:tcPr/>
+          <w:p>
+            <w:pPr>
+              <w:pStyle w:val="Compact"/>
+              <w:jc w:val="center"/>
+            </w:pPr>
+            <w:r>
+              <w:t xml:space="preserve">Zuzanna Zalewska</w:t>
+            </w:r>
+          </w:p>
+        </w:tc>
+        <w:tc>
+          <w:tcPr/>
+          <w:p>
+            <w:pPr>
+              <w:pStyle w:val="Compact"/>
+              <w:jc w:val="left"/>
+            </w:pPr>
+            <w:r>
+              <w:t xml:space="preserve">Relying solely on manual visual assessment.</w:t>
+            </w:r>
+          </w:p>
+        </w:tc>
+      </w:tr>
+      <w:tr>
+        <w:tc>
+          <w:tcPr/>
+          <w:p>
+            <w:pPr>
+              <w:pStyle w:val="Compact"/>
+              <w:jc w:val="center"/>
+            </w:pPr>
+            <w:r>
+              <w:rPr>
+                <w:b/>
+                <w:bCs/>
+              </w:rPr>
+              <w:t xml:space="preserve">RSK-12</w:t>
+            </w:r>
+          </w:p>
+        </w:tc>
+        <w:tc>
+          <w:tcPr/>
+          <w:p>
+            <w:pPr>
+              <w:pStyle w:val="Compact"/>
+              <w:jc w:val="left"/>
+            </w:pPr>
+            <w:r>
+              <w:rPr>
+                <w:b/>
+                <w:bCs/>
+              </w:rPr>
+              <w:t xml:space="preserve">Inability of the chosen UI library to meet our design requirements</w:t>
+            </w:r>
+          </w:p>
+        </w:tc>
+        <w:tc>
+          <w:tcPr/>
+          <w:p>
+            <w:pPr>
+              <w:pStyle w:val="Compact"/>
+              <w:jc w:val="center"/>
+            </w:pPr>
+            <w:r>
+              <w:t xml:space="preserve">L</w:t>
+            </w:r>
+          </w:p>
+        </w:tc>
+        <w:tc>
+          <w:tcPr/>
+          <w:p>
+            <w:pPr>
+              <w:pStyle w:val="Compact"/>
+              <w:jc w:val="center"/>
+            </w:pPr>
+            <w:r>
+              <w:t xml:space="preserve">L</w:t>
+            </w:r>
+          </w:p>
+        </w:tc>
+        <w:tc>
+          <w:tcPr/>
+          <w:p>
+            <w:pPr>
+              <w:pStyle w:val="Compact"/>
+              <w:jc w:val="center"/>
+            </w:pPr>
+            <w:r>
+              <w:t xml:space="preserve">Martyna Sadowska</w:t>
+            </w:r>
+          </w:p>
+        </w:tc>
+        <w:tc>
+          <w:tcPr/>
+          <w:p>
+            <w:pPr>
+              <w:pStyle w:val="Compact"/>
+              <w:jc w:val="left"/>
+            </w:pPr>
+            <w:r>
+              <w:t xml:space="preserve">UI redesign or library change.</w:t>
+            </w:r>
+          </w:p>
+        </w:tc>
+      </w:tr>
+      <w:tr>
+        <w:tc>
+          <w:tcPr/>
+          <w:p>
+            <w:pPr>
+              <w:pStyle w:val="Compact"/>
+              <w:jc w:val="center"/>
+            </w:pPr>
+            <w:r>
+              <w:rPr>
+                <w:b/>
+                <w:bCs/>
+              </w:rPr>
+              <w:t xml:space="preserve">RSK-13</w:t>
+            </w:r>
+          </w:p>
+        </w:tc>
+        <w:tc>
+          <w:tcPr/>
+          <w:p>
+            <w:pPr>
+              <w:pStyle w:val="Compact"/>
+              <w:jc w:val="left"/>
+            </w:pPr>
+            <w:r>
+              <w:rPr>
+                <w:b/>
+                <w:bCs/>
+              </w:rPr>
+              <w:t xml:space="preserve">To high difficulty of the chosen UI library</w:t>
+            </w:r>
+          </w:p>
+        </w:tc>
+        <w:tc>
+          <w:tcPr/>
+          <w:p>
+            <w:pPr>
+              <w:pStyle w:val="Compact"/>
+              <w:jc w:val="center"/>
+            </w:pPr>
+            <w:r>
+              <w:t xml:space="preserve">L</w:t>
+            </w:r>
+          </w:p>
+        </w:tc>
+        <w:tc>
+          <w:tcPr/>
+          <w:p>
+            <w:pPr>
+              <w:pStyle w:val="Compact"/>
+              <w:jc w:val="center"/>
+            </w:pPr>
+            <w:r>
+              <w:t xml:space="preserve">L</w:t>
+            </w:r>
+          </w:p>
+        </w:tc>
+        <w:tc>
+          <w:tcPr/>
+          <w:p>
+            <w:pPr>
+              <w:pStyle w:val="Compact"/>
+              <w:jc w:val="center"/>
+            </w:pPr>
+            <w:r>
+              <w:t xml:space="preserve">Martyna Sadowska</w:t>
+            </w:r>
+          </w:p>
+        </w:tc>
+        <w:tc>
+          <w:tcPr/>
+          <w:p>
+            <w:pPr>
+              <w:pStyle w:val="Compact"/>
+              <w:jc w:val="left"/>
+            </w:pPr>
+            <w:r>
+              <w:t xml:space="preserve">Library change.</w:t>
+            </w:r>
+          </w:p>
+        </w:tc>
+      </w:tr>
+    </w:tbl>
     <w:p>
       <w:r>
         <w:pict>
@@ -2665,22 +3818,200 @@
         </w:pict>
       </w:r>
     </w:p>
+    <w:bookmarkEnd w:id="23"/>
+    <w:bookmarkStart w:id="24" w:name="Xa88a2e08350a03dd12e5fe85d19706a0dbf0032"/>
+    <w:p>
+      <w:pPr>
+        <w:pStyle w:val="Heading3"/>
+      </w:pPr>
+      <w:r>
+        <w:t xml:space="preserve">7.1 Contingency Plans for High-Risk Modules (Plan B Protocols)</w:t>
+      </w:r>
+    </w:p>
+    <w:bookmarkEnd w:id="24"/>
+    <w:bookmarkStart w:id="25" w:name="X9e4205ddf69e0c62040c2c12a32ca22f4926f25"/>
+    <w:p>
+      <w:pPr>
+        <w:pStyle w:val="Heading3"/>
+      </w:pPr>
+      <w:r>
+        <w:rPr>
+          <w:b/>
+          <w:bCs/>
+        </w:rPr>
+        <w:t xml:space="preserve">Contingency Protocol 1: Live Demo Failure during Defense</w:t>
+      </w:r>
+    </w:p>
+    <w:p>
+      <w:pPr>
+        <w:pStyle w:val="Compact"/>
+        <w:numPr>
+          <w:ilvl w:val="0"/>
+          <w:numId w:val="1018"/>
+        </w:numPr>
+      </w:pPr>
+      <w:r>
+        <w:rPr>
+          <w:b/>
+          <w:bCs/>
+        </w:rPr>
+        <w:t xml:space="preserve">Plan A (Primary):</w:t>
+      </w:r>
+      <w:r>
+        <w:t xml:space="preserve"> </w:t>
+      </w:r>
+      <w:r>
+        <w:t xml:space="preserve">Run a pre-recorded video demo with live narration during the 10-minute presentation.</w:t>
+      </w:r>
+    </w:p>
+    <w:p>
+      <w:pPr>
+        <w:pStyle w:val="Compact"/>
+        <w:numPr>
+          <w:ilvl w:val="0"/>
+          <w:numId w:val="1018"/>
+        </w:numPr>
+      </w:pPr>
+      <w:r>
+        <w:rPr>
+          <w:b/>
+          <w:bCs/>
+        </w:rPr>
+        <w:t xml:space="preserve">Plan B Trigger:</w:t>
+      </w:r>
+      <w:r>
+        <w:t xml:space="preserve"> </w:t>
+      </w:r>
+      <w:r>
+        <w:t xml:space="preserve">Projector connectivity issues, network failure.</w:t>
+      </w:r>
+    </w:p>
+    <w:p>
+      <w:pPr>
+        <w:pStyle w:val="Compact"/>
+        <w:numPr>
+          <w:ilvl w:val="0"/>
+          <w:numId w:val="1018"/>
+        </w:numPr>
+      </w:pPr>
+      <w:r>
+        <w:rPr>
+          <w:b/>
+          <w:bCs/>
+        </w:rPr>
+        <w:t xml:space="preserve">Plan B (Contingency):</w:t>
+      </w:r>
+      <w:r>
+        <w:t xml:space="preserve"> </w:t>
+      </w:r>
+      <w:r>
+        <w:t xml:space="preserve">Immediately switch to a presentation with screenshots showcasing the application’s core functionality.</w:t>
+      </w:r>
+    </w:p>
+    <w:bookmarkEnd w:id="25"/>
+    <w:bookmarkStart w:id="26" w:name="X2aa830ac7c49fe597f7a171bc0c25da51d0c228"/>
+    <w:p>
+      <w:pPr>
+        <w:pStyle w:val="Heading3"/>
+      </w:pPr>
+      <w:r>
+        <w:rPr>
+          <w:b/>
+          <w:bCs/>
+        </w:rPr>
+        <w:t xml:space="preserve">Contingency Protocol 2: Literature Dataset Issues</w:t>
+      </w:r>
+    </w:p>
+    <w:p>
+      <w:pPr>
+        <w:pStyle w:val="Compact"/>
+        <w:numPr>
+          <w:ilvl w:val="0"/>
+          <w:numId w:val="1019"/>
+        </w:numPr>
+      </w:pPr>
+      <w:r>
+        <w:rPr>
+          <w:b/>
+          <w:bCs/>
+        </w:rPr>
+        <w:t xml:space="preserve">Plan A (Primary):</w:t>
+      </w:r>
+      <w:r>
+        <w:t xml:space="preserve"> </w:t>
+      </w:r>
+      <w:r>
+        <w:t xml:space="preserve">Use existing datasets from literature.</w:t>
+      </w:r>
+    </w:p>
+    <w:p>
+      <w:pPr>
+        <w:pStyle w:val="Compact"/>
+        <w:numPr>
+          <w:ilvl w:val="0"/>
+          <w:numId w:val="1019"/>
+        </w:numPr>
+      </w:pPr>
+      <w:r>
+        <w:rPr>
+          <w:b/>
+          <w:bCs/>
+        </w:rPr>
+        <w:t xml:space="preserve">Plan B Trigger:</w:t>
+      </w:r>
+      <w:r>
+        <w:t xml:space="preserve"> </w:t>
+      </w:r>
+      <w:r>
+        <w:t xml:space="preserve">Restricted access to external datasets or unsatisfactory results from them.</w:t>
+      </w:r>
+    </w:p>
+    <w:p>
+      <w:pPr>
+        <w:pStyle w:val="Compact"/>
+        <w:numPr>
+          <w:ilvl w:val="0"/>
+          <w:numId w:val="1019"/>
+        </w:numPr>
+      </w:pPr>
+      <w:r>
+        <w:rPr>
+          <w:b/>
+          <w:bCs/>
+        </w:rPr>
+        <w:t xml:space="preserve">Plan B (Contingency):</w:t>
+      </w:r>
+      <w:r>
+        <w:t xml:space="preserve"> </w:t>
+      </w:r>
+      <w:r>
+        <w:t xml:space="preserve">Start constructing a custom dataset by shredding and scanning physical documents.</w:t>
+      </w:r>
+    </w:p>
+    <w:p>
+      <w:r>
+        <w:pict>
+          <v:rect style="width:0;height:1.5pt" o:hralign="center" o:hrstd="t" o:hr="t"/>
+        </w:pict>
+      </w:r>
+    </w:p>
+    <w:bookmarkEnd w:id="26"/>
+    <w:bookmarkEnd w:id="27"/>
+    <w:bookmarkStart w:id="28" w:name="formal-supervisor-acceptance"/>
     <w:p>
       <w:pPr>
         <w:pStyle w:val="Heading2"/>
       </w:pPr>
-      <w:bookmarkStart w:id="27" w:name="_e7661c3f8e43572b2cbb74e30a10316b34a2af0"/>
       <w:r>
         <w:t xml:space="preserve">8. Formal Supervisor Acceptance</w:t>
       </w:r>
-      <w:bookmarkEnd w:id="27"/>
-    </w:p>
-    <w:p>
-      <w:pPr>
-        <w:pStyle w:val="Compact"/>
-        <w:numPr>
-          <w:ilvl w:val="0"/>
-          <w:numId w:val="1018"/>
+    </w:p>
+    <w:p>
+      <w:pPr>
+        <w:pStyle w:val="Compact"/>
+        <w:numPr>
+          <w:ilvl w:val="0"/>
+          <w:numId w:val="1020"/>
         </w:numPr>
       </w:pPr>
       <w:r>
@@ -2731,6 +4062,8 @@
         <w:t xml:space="preserve">October 18, 2026</w:t>
       </w:r>
     </w:p>
+    <w:bookmarkEnd w:id="28"/>
+    <w:bookmarkEnd w:id="29"/>
     <w:sectPr>
       <w:footnotePr>
         <w:numRestart w:val="eachSect"/>
@@ -3214,6 +4547,12 @@
     <w:abstractNumId w:val="991"/>
   </w:num>
   <w:num w:numId="1018">
+    <w:abstractNumId w:val="991"/>
+  </w:num>
+  <w:num w:numId="1019">
+    <w:abstractNumId w:val="991"/>
+  </w:num>
+  <w:num w:numId="1020">
     <w:abstractNumId w:val="993"/>
   </w:num>
 </w:numbering>
@@ -3224,10 +4563,10 @@
   <w:docDefaults>
     <w:rPrDefault>
       <w:rPr>
-        <w:rFonts w:asciiTheme="minorHAnsi" w:eastAsiaTheme="minorEastAsia" w:hAnsiTheme="minorHAnsi" w:cstheme="minorBidi"/>
+        <w:rFonts w:asciiTheme="minorHAnsi" w:cstheme="minorBidi" w:eastAsiaTheme="minorEastAsia" w:hAnsiTheme="minorHAnsi"/>
         <w:sz w:val="24"/>
         <w:szCs w:val="24"/>
-        <w:lang w:val="en-US" w:eastAsia="zh-CN" w:bidi="ar-SA"/>
+        <w:lang w:bidi="ar-SA" w:eastAsia="zh-CN" w:val="en-US"/>
       </w:rPr>
     </w:rPrDefault>
     <w:pPrDefault>
@@ -3236,35 +4575,35 @@
       </w:pPr>
     </w:pPrDefault>
   </w:docDefaults>
-  <w:latentStyles w:defLockedState="0" w:defUIPriority="0" w:defSemiHidden="0" w:defUnhideWhenUsed="0" w:defQFormat="0" w:count="276"/>
-  <w:style w:type="paragraph" w:default="1" w:styleId="Normal">
+  <w:latentStyles w:count="276" w:defLockedState="0" w:defQFormat="0" w:defSemiHidden="0" w:defUIPriority="0" w:defUnhideWhenUsed="0"/>
+  <w:style w:default="1" w:styleId="Normal" w:type="paragraph">
     <w:name w:val="Normal"/>
     <w:qFormat/>
   </w:style>
-  <w:style w:type="paragraph" w:styleId="BodyText">
+  <w:style w:styleId="BodyText" w:type="paragraph">
     <w:name w:val="Body Text"/>
     <w:basedOn w:val="Normal"/>
     <w:link w:val="BodyTextChar"/>
     <w:qFormat/>
     <w:pPr>
-      <w:spacing w:before="180" w:after="180"/>
+      <w:spacing w:after="180" w:before="180"/>
     </w:pPr>
   </w:style>
-  <w:style w:type="paragraph" w:customStyle="1" w:styleId="FirstParagraph">
+  <w:style w:customStyle="1" w:styleId="FirstParagraph" w:type="paragraph">
     <w:name w:val="First Paragraph"/>
     <w:basedOn w:val="BodyText"/>
     <w:next w:val="BodyText"/>
     <w:qFormat/>
   </w:style>
-  <w:style w:type="paragraph" w:customStyle="1" w:styleId="Compact">
+  <w:style w:customStyle="1" w:styleId="Compact" w:type="paragraph">
     <w:name w:val="Compact"/>
     <w:basedOn w:val="BodyText"/>
     <w:qFormat/>
     <w:pPr>
-      <w:spacing w:before="36" w:after="36"/>
+      <w:spacing w:after="36" w:before="36"/>
     </w:pPr>
   </w:style>
-  <w:style w:type="paragraph" w:styleId="Title">
+  <w:style w:styleId="Title" w:type="paragraph">
     <w:name w:val="Title"/>
     <w:basedOn w:val="Normal"/>
     <w:next w:val="BodyText"/>
@@ -3278,24 +4617,24 @@
       <w:jc w:val="center"/>
     </w:pPr>
     <w:rPr>
-      <w:rFonts w:asciiTheme="majorHAnsi" w:eastAsiaTheme="majorEastAsia" w:hAnsiTheme="majorHAnsi" w:cstheme="majorBidi"/>
+      <w:rFonts w:asciiTheme="majorHAnsi" w:cstheme="majorBidi" w:eastAsiaTheme="majorEastAsia" w:hAnsiTheme="majorHAnsi"/>
       <w:sz w:val="56"/>
       <w:szCs w:val="56"/>
     </w:rPr>
   </w:style>
-  <w:style w:type="character" w:customStyle="1" w:styleId="TitleChar">
+  <w:style w:customStyle="1" w:styleId="TitleChar" w:type="character">
     <w:name w:val="Title Char"/>
     <w:basedOn w:val="DefaultParagraphFont"/>
     <w:link w:val="Title"/>
     <w:uiPriority w:val="10"/>
     <w:rsid w:val="00A10FD9"/>
     <w:rPr>
-      <w:rFonts w:asciiTheme="majorHAnsi" w:eastAsiaTheme="majorEastAsia" w:hAnsiTheme="majorHAnsi" w:cstheme="majorBidi"/>
+      <w:rFonts w:asciiTheme="majorHAnsi" w:cstheme="majorBidi" w:eastAsiaTheme="majorEastAsia" w:hAnsiTheme="majorHAnsi"/>
       <w:sz w:val="56"/>
       <w:szCs w:val="56"/>
     </w:rPr>
   </w:style>
-  <w:style w:type="paragraph" w:styleId="Subtitle">
+  <w:style w:styleId="Subtitle" w:type="paragraph">
     <w:name w:val="Subtitle"/>
     <w:basedOn w:val="Title"/>
     <w:next w:val="BodyText"/>
@@ -3309,27 +4648,27 @@
       </w:numPr>
     </w:pPr>
     <w:rPr>
-      <w:rFonts w:eastAsiaTheme="majorEastAsia" w:cstheme="majorBidi"/>
+      <w:rFonts w:cstheme="majorBidi" w:eastAsiaTheme="majorEastAsia"/>
       <w:spacing w:val="15"/>
       <w:sz w:val="28"/>
       <w:szCs w:val="28"/>
     </w:rPr>
   </w:style>
-  <w:style w:type="character" w:customStyle="1" w:styleId="SubtitleChar">
+  <w:style w:customStyle="1" w:styleId="SubtitleChar" w:type="character">
     <w:name w:val="Subtitle Char"/>
     <w:basedOn w:val="DefaultParagraphFont"/>
     <w:link w:val="Subtitle"/>
     <w:uiPriority w:val="11"/>
     <w:rsid w:val="00A10FD9"/>
     <w:rPr>
-      <w:rFonts w:eastAsiaTheme="majorEastAsia" w:cstheme="majorBidi"/>
-      <w:color w:val="595959" w:themeColor="text1" w:themeTint="A6"/>
+      <w:rFonts w:cstheme="majorBidi" w:eastAsiaTheme="majorEastAsia"/>
+      <w:color w:themeColor="text1" w:themeTint="A6" w:val="595959"/>
       <w:spacing w:val="15"/>
       <w:sz w:val="28"/>
       <w:szCs w:val="28"/>
     </w:rPr>
   </w:style>
-  <w:style w:type="paragraph" w:customStyle="1" w:styleId="Author">
+  <w:style w:customStyle="1" w:styleId="Author" w:type="paragraph">
     <w:name w:val="Author"/>
     <w:basedOn w:val="Title"/>
     <w:next w:val="BodyText"/>
@@ -3343,7 +4682,7 @@
       <w:szCs w:val="24"/>
     </w:rPr>
   </w:style>
-  <w:style w:type="paragraph" w:styleId="Date">
+  <w:style w:styleId="Date" w:type="paragraph">
     <w:name w:val="Date"/>
     <w:basedOn w:val="Title"/>
     <w:next w:val="BodyText"/>
@@ -3357,7 +4696,7 @@
       <w:szCs w:val="24"/>
     </w:rPr>
   </w:style>
-  <w:style w:type="paragraph" w:customStyle="1" w:styleId="AbstractTitle">
+  <w:style w:customStyle="1" w:styleId="AbstractTitle" w:type="paragraph">
     <w:name w:val="Abstract Title"/>
     <w:basedOn w:val="Normal"/>
     <w:next w:val="Abstract"/>
@@ -3365,7 +4704,7 @@
     <w:pPr>
       <w:keepNext/>
       <w:keepLines/>
-      <w:spacing w:before="300" w:after="0"/>
+      <w:spacing w:after="0" w:before="300"/>
       <w:jc w:val="center"/>
     </w:pPr>
     <w:rPr>
@@ -3374,7 +4713,7 @@
       <w:szCs w:val="20"/>
     </w:rPr>
   </w:style>
-  <w:style w:type="paragraph" w:customStyle="1" w:styleId="Abstract">
+  <w:style w:customStyle="1" w:styleId="Abstract" w:type="paragraph">
     <w:name w:val="Abstract"/>
     <w:basedOn w:val="Normal"/>
     <w:next w:val="BodyText"/>
@@ -3382,14 +4721,14 @@
     <w:pPr>
       <w:keepNext/>
       <w:keepLines/>
-      <w:spacing w:before="100" w:after="300"/>
+      <w:spacing w:after="300" w:before="100"/>
     </w:pPr>
     <w:rPr>
       <w:sz w:val="20"/>
       <w:szCs w:val="20"/>
     </w:rPr>
   </w:style>
-  <w:style w:type="paragraph" w:styleId="Bibliography">
+  <w:style w:styleId="Bibliography" w:type="paragraph">
     <w:name w:val="Bibliography"/>
     <w:basedOn w:val="Normal"/>
     <w:next w:val="Bibliography"/>
@@ -3397,7 +4736,7 @@
     <w:pPr/>
     <w:rPr/>
   </w:style>
-  <w:style w:type="paragraph" w:styleId="Heading1">
+  <w:style w:styleId="Heading1" w:type="paragraph">
     <w:name w:val="heading 1"/>
     <w:basedOn w:val="Normal"/>
     <w:next w:val="BodyText"/>
@@ -3408,17 +4747,17 @@
     <w:pPr>
       <w:keepNext/>
       <w:keepLines/>
-      <w:spacing w:before="360" w:after="80"/>
+      <w:spacing w:after="80" w:before="360"/>
       <w:outlineLvl w:val="0"/>
     </w:pPr>
     <w:rPr>
-      <w:rFonts w:asciiTheme="majorHAnsi" w:eastAsiaTheme="majorEastAsia" w:hAnsiTheme="majorHAnsi" w:cstheme="majorBidi"/>
-      <w:color w:val="0F4761" w:themeColor="accent1" w:themeShade="BF"/>
+      <w:rFonts w:asciiTheme="majorHAnsi" w:cstheme="majorBidi" w:eastAsiaTheme="majorEastAsia" w:hAnsiTheme="majorHAnsi"/>
+      <w:color w:themeColor="accent1" w:themeShade="BF" w:val="0F4761"/>
       <w:sz w:val="40"/>
       <w:szCs w:val="40"/>
     </w:rPr>
   </w:style>
-  <w:style w:type="paragraph" w:styleId="Heading2">
+  <w:style w:styleId="Heading2" w:type="paragraph">
     <w:name w:val="heading 2"/>
     <w:basedOn w:val="Normal"/>
     <w:next w:val="BodyText"/>
@@ -3431,17 +4770,17 @@
     <w:pPr>
       <w:keepNext/>
       <w:keepLines/>
-      <w:spacing w:before="160" w:after="80"/>
+      <w:spacing w:after="80" w:before="160"/>
       <w:outlineLvl w:val="1"/>
     </w:pPr>
     <w:rPr>
-      <w:rFonts w:asciiTheme="majorHAnsi" w:eastAsiaTheme="majorEastAsia" w:hAnsiTheme="majorHAnsi" w:cstheme="majorBidi"/>
-      <w:color w:val="0F4761" w:themeColor="accent1" w:themeShade="BF"/>
+      <w:rFonts w:asciiTheme="majorHAnsi" w:cstheme="majorBidi" w:eastAsiaTheme="majorEastAsia" w:hAnsiTheme="majorHAnsi"/>
+      <w:color w:themeColor="accent1" w:themeShade="BF" w:val="0F4761"/>
       <w:sz w:val="32"/>
       <w:szCs w:val="32"/>
     </w:rPr>
   </w:style>
-  <w:style w:type="paragraph" w:styleId="Heading3">
+  <w:style w:styleId="Heading3" w:type="paragraph">
     <w:name w:val="heading 3"/>
     <w:basedOn w:val="Normal"/>
     <w:next w:val="BodyText"/>
@@ -3454,17 +4793,17 @@
     <w:pPr>
       <w:keepNext/>
       <w:keepLines/>
-      <w:spacing w:before="160" w:after="80"/>
+      <w:spacing w:after="80" w:before="160"/>
       <w:outlineLvl w:val="2"/>
     </w:pPr>
     <w:rPr>
-      <w:rFonts w:eastAsiaTheme="majorEastAsia" w:cstheme="majorBidi"/>
-      <w:color w:val="0F4761" w:themeColor="accent1" w:themeShade="BF"/>
+      <w:rFonts w:cstheme="majorBidi" w:eastAsiaTheme="majorEastAsia"/>
+      <w:color w:themeColor="accent1" w:themeShade="BF" w:val="0F4761"/>
       <w:sz w:val="28"/>
       <w:szCs w:val="28"/>
     </w:rPr>
   </w:style>
-  <w:style w:type="paragraph" w:styleId="Heading4">
+  <w:style w:styleId="Heading4" w:type="paragraph">
     <w:name w:val="heading 4"/>
     <w:basedOn w:val="Normal"/>
     <w:next w:val="BodyText"/>
@@ -3477,17 +4816,17 @@
     <w:pPr>
       <w:keepNext/>
       <w:keepLines/>
-      <w:spacing w:before="80" w:after="40"/>
+      <w:spacing w:after="40" w:before="80"/>
       <w:outlineLvl w:val="3"/>
     </w:pPr>
     <w:rPr>
-      <w:rFonts w:eastAsiaTheme="majorEastAsia" w:cstheme="majorBidi"/>
+      <w:rFonts w:cstheme="majorBidi" w:eastAsiaTheme="majorEastAsia"/>
       <w:i/>
       <w:iCs/>
-      <w:color w:val="0F4761" w:themeColor="accent1" w:themeShade="BF"/>
-    </w:rPr>
-  </w:style>
-  <w:style w:type="paragraph" w:styleId="Heading5">
+      <w:color w:themeColor="accent1" w:themeShade="BF" w:val="0F4761"/>
+    </w:rPr>
+  </w:style>
+  <w:style w:styleId="Heading5" w:type="paragraph">
     <w:name w:val="heading 5"/>
     <w:basedOn w:val="Normal"/>
     <w:next w:val="BodyText"/>
@@ -3500,15 +4839,15 @@
     <w:pPr>
       <w:keepNext/>
       <w:keepLines/>
-      <w:spacing w:before="80" w:after="40"/>
+      <w:spacing w:after="40" w:before="80"/>
       <w:outlineLvl w:val="4"/>
     </w:pPr>
     <w:rPr>
-      <w:rFonts w:eastAsiaTheme="majorEastAsia" w:cstheme="majorBidi"/>
-      <w:color w:val="0F4761" w:themeColor="accent1" w:themeShade="BF"/>
-    </w:rPr>
-  </w:style>
-  <w:style w:type="paragraph" w:styleId="Heading6">
+      <w:rFonts w:cstheme="majorBidi" w:eastAsiaTheme="majorEastAsia"/>
+      <w:color w:themeColor="accent1" w:themeShade="BF" w:val="0F4761"/>
+    </w:rPr>
+  </w:style>
+  <w:style w:styleId="Heading6" w:type="paragraph">
     <w:name w:val="heading 6"/>
     <w:basedOn w:val="Normal"/>
     <w:next w:val="BodyText"/>
@@ -3521,17 +4860,17 @@
     <w:pPr>
       <w:keepNext/>
       <w:keepLines/>
-      <w:spacing w:before="40" w:after="0"/>
+      <w:spacing w:after="0" w:before="40"/>
       <w:outlineLvl w:val="5"/>
     </w:pPr>
     <w:rPr>
-      <w:rFonts w:eastAsiaTheme="majorEastAsia" w:cstheme="majorBidi"/>
+      <w:rFonts w:cstheme="majorBidi" w:eastAsiaTheme="majorEastAsia"/>
       <w:i/>
       <w:iCs/>
-      <w:color w:val="595959" w:themeColor="text1" w:themeTint="A6"/>
-    </w:rPr>
-  </w:style>
-  <w:style w:type="paragraph" w:styleId="Heading7">
+      <w:color w:themeColor="text1" w:themeTint="A6" w:val="595959"/>
+    </w:rPr>
+  </w:style>
+  <w:style w:styleId="Heading7" w:type="paragraph">
     <w:name w:val="heading 7"/>
     <w:basedOn w:val="Normal"/>
     <w:next w:val="BodyText"/>
@@ -3544,15 +4883,15 @@
     <w:pPr>
       <w:keepNext/>
       <w:keepLines/>
-      <w:spacing w:before="40" w:after="0"/>
+      <w:spacing w:after="0" w:before="40"/>
       <w:outlineLvl w:val="6"/>
     </w:pPr>
     <w:rPr>
-      <w:rFonts w:eastAsiaTheme="majorEastAsia" w:cstheme="majorBidi"/>
-      <w:color w:val="595959" w:themeColor="text1" w:themeTint="A6"/>
-    </w:rPr>
-  </w:style>
-  <w:style w:type="paragraph" w:styleId="Heading8">
+      <w:rFonts w:cstheme="majorBidi" w:eastAsiaTheme="majorEastAsia"/>
+      <w:color w:themeColor="text1" w:themeTint="A6" w:val="595959"/>
+    </w:rPr>
+  </w:style>
+  <w:style w:styleId="Heading8" w:type="paragraph">
     <w:name w:val="heading 8"/>
     <w:basedOn w:val="Normal"/>
     <w:next w:val="BodyText"/>
@@ -3569,13 +4908,13 @@
       <w:outlineLvl w:val="7"/>
     </w:pPr>
     <w:rPr>
-      <w:rFonts w:eastAsiaTheme="majorEastAsia" w:cstheme="majorBidi"/>
+      <w:rFonts w:cstheme="majorBidi" w:eastAsiaTheme="majorEastAsia"/>
       <w:i/>
       <w:iCs/>
-      <w:color w:val="272727" w:themeColor="text1" w:themeTint="D8"/>
-    </w:rPr>
-  </w:style>
-  <w:style w:type="paragraph" w:styleId="Heading9">
+      <w:color w:themeColor="text1" w:themeTint="D8" w:val="272727"/>
+    </w:rPr>
+  </w:style>
+  <w:style w:styleId="Heading9" w:type="paragraph">
     <w:name w:val="heading 9"/>
     <w:basedOn w:val="Normal"/>
     <w:next w:val="BodyText"/>
@@ -3592,24 +4931,24 @@
       <w:outlineLvl w:val="8"/>
     </w:pPr>
     <w:rPr>
-      <w:rFonts w:eastAsiaTheme="majorEastAsia" w:cstheme="majorBidi"/>
-      <w:color w:val="272727" w:themeColor="text1" w:themeTint="D8"/>
-    </w:rPr>
-  </w:style>
-  <w:style w:type="character" w:customStyle="1" w:styleId="Heading1Char">
+      <w:rFonts w:cstheme="majorBidi" w:eastAsiaTheme="majorEastAsia"/>
+      <w:color w:themeColor="text1" w:themeTint="D8" w:val="272727"/>
+    </w:rPr>
+  </w:style>
+  <w:style w:customStyle="1" w:styleId="Heading1Char" w:type="character">
     <w:name w:val="Heading 1 Char"/>
     <w:basedOn w:val="DefaultParagraphFont"/>
     <w:link w:val="Heading1"/>
     <w:uiPriority w:val="9"/>
     <w:rsid w:val="00A10FD9"/>
     <w:rPr>
-      <w:rFonts w:asciiTheme="majorHAnsi" w:eastAsiaTheme="majorEastAsia" w:hAnsiTheme="majorHAnsi" w:cstheme="majorBidi"/>
-      <w:color w:val="0F4761" w:themeColor="accent1" w:themeShade="BF"/>
+      <w:rFonts w:asciiTheme="majorHAnsi" w:cstheme="majorBidi" w:eastAsiaTheme="majorEastAsia" w:hAnsiTheme="majorHAnsi"/>
+      <w:color w:themeColor="accent1" w:themeShade="BF" w:val="0F4761"/>
       <w:sz w:val="40"/>
       <w:szCs w:val="40"/>
     </w:rPr>
   </w:style>
-  <w:style w:type="character" w:customStyle="1" w:styleId="Heading2Char">
+  <w:style w:customStyle="1" w:styleId="Heading2Char" w:type="character">
     <w:name w:val="Heading 2 Char"/>
     <w:basedOn w:val="DefaultParagraphFont"/>
     <w:link w:val="Heading2"/>
@@ -3617,13 +4956,13 @@
     <w:semiHidden/>
     <w:rsid w:val="00A10FD9"/>
     <w:rPr>
-      <w:rFonts w:asciiTheme="majorHAnsi" w:eastAsiaTheme="majorEastAsia" w:hAnsiTheme="majorHAnsi" w:cstheme="majorBidi"/>
-      <w:color w:val="0F4761" w:themeColor="accent1" w:themeShade="BF"/>
+      <w:rFonts w:asciiTheme="majorHAnsi" w:cstheme="majorBidi" w:eastAsiaTheme="majorEastAsia" w:hAnsiTheme="majorHAnsi"/>
+      <w:color w:themeColor="accent1" w:themeShade="BF" w:val="0F4761"/>
       <w:sz w:val="32"/>
       <w:szCs w:val="32"/>
     </w:rPr>
   </w:style>
-  <w:style w:type="character" w:customStyle="1" w:styleId="Heading3Char">
+  <w:style w:customStyle="1" w:styleId="Heading3Char" w:type="character">
     <w:name w:val="Heading 3 Char"/>
     <w:basedOn w:val="DefaultParagraphFont"/>
     <w:link w:val="Heading3"/>
@@ -3631,13 +4970,13 @@
     <w:semiHidden/>
     <w:rsid w:val="00A10FD9"/>
     <w:rPr>
-      <w:rFonts w:eastAsiaTheme="majorEastAsia" w:cstheme="majorBidi"/>
-      <w:color w:val="0F4761" w:themeColor="accent1" w:themeShade="BF"/>
+      <w:rFonts w:cstheme="majorBidi" w:eastAsiaTheme="majorEastAsia"/>
+      <w:color w:themeColor="accent1" w:themeShade="BF" w:val="0F4761"/>
       <w:sz w:val="28"/>
       <w:szCs w:val="28"/>
     </w:rPr>
   </w:style>
-  <w:style w:type="character" w:customStyle="1" w:styleId="Heading4Char">
+  <w:style w:customStyle="1" w:styleId="Heading4Char" w:type="character">
     <w:name w:val="Heading 4 Char"/>
     <w:basedOn w:val="DefaultParagraphFont"/>
     <w:link w:val="Heading4"/>
@@ -3645,13 +4984,13 @@
     <w:semiHidden/>
     <w:rsid w:val="00A10FD9"/>
     <w:rPr>
-      <w:rFonts w:eastAsiaTheme="majorEastAsia" w:cstheme="majorBidi"/>
+      <w:rFonts w:cstheme="majorBidi" w:eastAsiaTheme="majorEastAsia"/>
       <w:i/>
       <w:iCs/>
-      <w:color w:val="0F4761" w:themeColor="accent1" w:themeShade="BF"/>
-    </w:rPr>
-  </w:style>
-  <w:style w:type="character" w:customStyle="1" w:styleId="Heading5Char">
+      <w:color w:themeColor="accent1" w:themeShade="BF" w:val="0F4761"/>
+    </w:rPr>
+  </w:style>
+  <w:style w:customStyle="1" w:styleId="Heading5Char" w:type="character">
     <w:name w:val="Heading 5 Char"/>
     <w:basedOn w:val="DefaultParagraphFont"/>
     <w:link w:val="Heading5"/>
@@ -3659,11 +4998,11 @@
     <w:semiHidden/>
     <w:rsid w:val="00A10FD9"/>
     <w:rPr>
-      <w:rFonts w:eastAsiaTheme="majorEastAsia" w:cstheme="majorBidi"/>
-      <w:color w:val="0F4761" w:themeColor="accent1" w:themeShade="BF"/>
-    </w:rPr>
-  </w:style>
-  <w:style w:type="character" w:customStyle="1" w:styleId="Heading6Char">
+      <w:rFonts w:cstheme="majorBidi" w:eastAsiaTheme="majorEastAsia"/>
+      <w:color w:themeColor="accent1" w:themeShade="BF" w:val="0F4761"/>
+    </w:rPr>
+  </w:style>
+  <w:style w:customStyle="1" w:styleId="Heading6Char" w:type="character">
     <w:name w:val="Heading 6 Char"/>
     <w:basedOn w:val="DefaultParagraphFont"/>
     <w:link w:val="Heading6"/>
@@ -3671,13 +5010,13 @@
     <w:semiHidden/>
     <w:rsid w:val="00A10FD9"/>
     <w:rPr>
-      <w:rFonts w:eastAsiaTheme="majorEastAsia" w:cstheme="majorBidi"/>
+      <w:rFonts w:cstheme="majorBidi" w:eastAsiaTheme="majorEastAsia"/>
       <w:i/>
       <w:iCs/>
-      <w:color w:val="595959" w:themeColor="text1" w:themeTint="A6"/>
-    </w:rPr>
-  </w:style>
-  <w:style w:type="character" w:customStyle="1" w:styleId="Heading7Char">
+      <w:color w:themeColor="text1" w:themeTint="A6" w:val="595959"/>
+    </w:rPr>
+  </w:style>
+  <w:style w:customStyle="1" w:styleId="Heading7Char" w:type="character">
     <w:name w:val="Heading 7 Char"/>
     <w:basedOn w:val="DefaultParagraphFont"/>
     <w:link w:val="Heading7"/>
@@ -3685,11 +5024,11 @@
     <w:semiHidden/>
     <w:rsid w:val="00A10FD9"/>
     <w:rPr>
-      <w:rFonts w:eastAsiaTheme="majorEastAsia" w:cstheme="majorBidi"/>
-      <w:color w:val="595959" w:themeColor="text1" w:themeTint="A6"/>
-    </w:rPr>
-  </w:style>
-  <w:style w:type="character" w:customStyle="1" w:styleId="Heading8Char">
+      <w:rFonts w:cstheme="majorBidi" w:eastAsiaTheme="majorEastAsia"/>
+      <w:color w:themeColor="text1" w:themeTint="A6" w:val="595959"/>
+    </w:rPr>
+  </w:style>
+  <w:style w:customStyle="1" w:styleId="Heading8Char" w:type="character">
     <w:name w:val="Heading 8 Char"/>
     <w:basedOn w:val="DefaultParagraphFont"/>
     <w:link w:val="Heading8"/>
@@ -3697,13 +5036,13 @@
     <w:semiHidden/>
     <w:rsid w:val="00A10FD9"/>
     <w:rPr>
-      <w:rFonts w:eastAsiaTheme="majorEastAsia" w:cstheme="majorBidi"/>
+      <w:rFonts w:cstheme="majorBidi" w:eastAsiaTheme="majorEastAsia"/>
       <w:i/>
       <w:iCs/>
-      <w:color w:val="272727" w:themeColor="text1" w:themeTint="D8"/>
-    </w:rPr>
-  </w:style>
-  <w:style w:type="character" w:customStyle="1" w:styleId="Heading9Char">
+      <w:color w:themeColor="text1" w:themeTint="D8" w:val="272727"/>
+    </w:rPr>
+  </w:style>
+  <w:style w:customStyle="1" w:styleId="Heading9Char" w:type="character">
     <w:name w:val="Heading 9 Char"/>
     <w:basedOn w:val="DefaultParagraphFont"/>
     <w:link w:val="Heading9"/>
@@ -3711,11 +5050,11 @@
     <w:semiHidden/>
     <w:rsid w:val="00A10FD9"/>
     <w:rPr>
-      <w:rFonts w:eastAsiaTheme="majorEastAsia" w:cstheme="majorBidi"/>
-      <w:color w:val="272727" w:themeColor="text1" w:themeTint="D8"/>
-    </w:rPr>
-  </w:style>
-  <w:style w:type="paragraph" w:styleId="BlockText">
+      <w:rFonts w:cstheme="majorBidi" w:eastAsiaTheme="majorEastAsia"/>
+      <w:color w:themeColor="text1" w:themeTint="D8" w:val="272727"/>
+    </w:rPr>
+  </w:style>
+  <w:style w:styleId="BlockText" w:type="paragraph">
     <w:name w:val="Block Text"/>
     <w:basedOn w:val="BodyText"/>
     <w:next w:val="BodyText"/>
@@ -3723,11 +5062,11 @@
     <w:unhideWhenUsed/>
     <w:qFormat/>
     <w:pPr>
-      <w:spacing w:before="100" w:after="100"/>
+      <w:spacing w:after="100" w:before="100"/>
       <w:ind w:firstLine="0" w:left="480" w:right="480"/>
     </w:pPr>
   </w:style>
-  <w:style w:type="paragraph" w:styleId="FootnoteText">
+  <w:style w:styleId="FootnoteText" w:type="paragraph">
     <w:name w:val="Footnote Text"/>
     <w:basedOn w:val="Normal"/>
     <w:next w:val="FootnoteText"/>
@@ -3735,7 +5074,7 @@
     <w:unhideWhenUsed/>
     <w:qFormat/>
   </w:style>
-  <w:style w:type="paragraph" w:styleId="FootnoteBlockText">
+  <w:style w:styleId="FootnoteBlockText" w:type="paragraph">
     <w:name w:val="Footnote Block Text"/>
     <w:basedOn w:val="FootnoteText"/>
     <w:next w:val="FootnoteText"/>
@@ -3743,26 +5082,28 @@
     <w:unhideWhenUsed/>
     <w:qFormat/>
     <w:pPr>
-      <w:spacing w:before="100" w:after="100"/>
+      <w:spacing w:after="100" w:before="100"/>
       <w:ind w:firstLine="0" w:left="480" w:right="480"/>
     </w:pPr>
   </w:style>
-  <w:style w:type="character" w:default="1" w:styleId="DefaultParagraphFont">
+  <w:style w:default="1" w:styleId="DefaultParagraphFont" w:type="character">
     <w:name w:val="Default Paragraph Font"/>
     <w:semiHidden/>
     <w:unhideWhenUsed/>
   </w:style>
-  <w:style w:type="table" w:default="1" w:styleId="Table">
+  <w:style w:default="1" w:styleId="Table" w:type="table">
     <w:name w:val="Table"/>
     <w:basedOn w:val="TableNormal"/>
+    <w:semiHidden/>
+    <w:unhideWhenUsed/>
     <w:qFormat/>
     <w:tblPr>
-      <w:tblInd w:w="0" w:type="dxa"/>
+      <w:tblInd w:type="dxa" w:w="0"/>
       <w:tblCellMar>
-        <w:top w:w="0" w:type="dxa"/>
-        <w:left w:w="108" w:type="dxa"/>
-        <w:bottom w:w="0" w:type="dxa"/>
-        <w:right w:w="108" w:type="dxa"/>
+        <w:top w:type="dxa" w:w="0"/>
+        <w:left w:type="dxa" w:w="108"/>
+        <w:bottom w:type="dxa" w:w="0"/>
+        <w:right w:type="dxa" w:w="108"/>
       </w:tblCellMar>
     </w:tblPr>
     <w:tblStylePr w:type="firstRow">
@@ -3774,7 +5115,7 @@
       </w:tcPr>
     </w:tblStylePr>
   </w:style>
-  <w:style w:type="paragraph" w:customStyle="1" w:styleId="DefinitionTerm">
+  <w:style w:customStyle="1" w:styleId="DefinitionTerm" w:type="paragraph">
     <w:name w:val="Definition Term"/>
     <w:basedOn w:val="Normal"/>
     <w:next w:val="Definition"/>
@@ -3787,49 +5128,49 @@
       <w:b/>
     </w:rPr>
   </w:style>
-  <w:style w:type="paragraph" w:customStyle="1" w:styleId="Definition">
+  <w:style w:customStyle="1" w:styleId="Definition" w:type="paragraph">
     <w:name w:val="Definition"/>
     <w:basedOn w:val="Normal"/>
   </w:style>
-  <w:style w:type="paragraph" w:styleId="Caption">
+  <w:style w:styleId="Caption" w:type="paragraph">
     <w:name w:val="Caption"/>
     <w:basedOn w:val="Normal"/>
     <w:link w:val="BodyTextChar"/>
     <w:pPr>
-      <w:spacing w:before="0" w:after="120"/>
+      <w:spacing w:after="120" w:before="0"/>
     </w:pPr>
     <w:rPr>
       <w:i/>
     </w:rPr>
   </w:style>
-  <w:style w:type="paragraph" w:customStyle="1" w:styleId="TableCaption">
+  <w:style w:customStyle="1" w:styleId="TableCaption" w:type="paragraph">
     <w:name w:val="Table Caption"/>
     <w:basedOn w:val="Caption"/>
     <w:pPr>
       <w:keepNext/>
     </w:pPr>
   </w:style>
-  <w:style w:type="paragraph" w:customStyle="1" w:styleId="ImageCaption">
+  <w:style w:customStyle="1" w:styleId="ImageCaption" w:type="paragraph">
     <w:name w:val="Image Caption"/>
     <w:basedOn w:val="Caption"/>
   </w:style>
-  <w:style w:type="paragraph" w:customStyle="1" w:styleId="Figure">
+  <w:style w:customStyle="1" w:styleId="Figure" w:type="paragraph">
     <w:name w:val="Figure"/>
     <w:basedOn w:val="Normal"/>
   </w:style>
-  <w:style w:type="paragraph" w:customStyle="1" w:styleId="CaptionedFigure">
+  <w:style w:customStyle="1" w:styleId="CaptionedFigure" w:type="paragraph">
     <w:name w:val="Captioned Figure"/>
     <w:basedOn w:val="Figure"/>
     <w:pPr>
       <w:keepNext/>
     </w:pPr>
   </w:style>
-  <w:style w:type="character" w:customStyle="1" w:styleId="BodyTextChar">
+  <w:style w:customStyle="1" w:styleId="BodyTextChar" w:type="character">
     <w:name w:val="Body Text Char"/>
     <w:basedOn w:val="DefaultParagraphFont"/>
     <w:link w:val="BodyText"/>
   </w:style>
-  <w:style w:type="character" w:customStyle="1" w:styleId="VerbatimChar">
+  <w:style w:customStyle="1" w:styleId="VerbatimChar" w:type="character">
     <w:name w:val="Verbatim Char"/>
     <w:basedOn w:val="BodyTextChar"/>
     <w:rPr>
@@ -3837,25 +5178,25 @@
       <w:sz w:val="22"/>
     </w:rPr>
   </w:style>
-  <w:style w:type="character" w:customStyle="1" w:styleId="SectionNumber">
+  <w:style w:customStyle="1" w:styleId="SectionNumber" w:type="character">
     <w:name w:val="Section Number"/>
     <w:basedOn w:val="BodyTextChar"/>
   </w:style>
-  <w:style w:type="character" w:styleId="FootnoteReference">
+  <w:style w:styleId="FootnoteReference" w:type="character">
     <w:name w:val="Footnote Reference"/>
     <w:basedOn w:val="BodyTextChar"/>
     <w:rPr>
       <w:vertAlign w:val="superscript"/>
     </w:rPr>
   </w:style>
-  <w:style w:type="character" w:styleId="Hyperlink">
+  <w:style w:styleId="Hyperlink" w:type="character">
     <w:name w:val="Hyperlink"/>
     <w:basedOn w:val="BodyTextChar"/>
     <w:rPr>
-      <w:color w:val="4F81BD" w:themeColor="accent1"/>
-    </w:rPr>
-  </w:style>
-  <w:style w:type="paragraph" w:styleId="TOCHeading">
+      <w:color w:themeColor="accent1" w:val="4F81BD"/>
+    </w:rPr>
+  </w:style>
+  <w:style w:styleId="TOCHeading" w:type="paragraph">
     <w:name w:val="TOC Heading"/>
     <w:basedOn w:val="Heading1"/>
     <w:next w:val="BodyText"/>
@@ -3867,10 +5208,10 @@
       <w:outlineLvl w:val="9"/>
     </w:pPr>
     <w:rPr>
-      <w:rFonts w:asciiTheme="majorHAnsi" w:eastAsiaTheme="majorEastAsia" w:hAnsiTheme="majorHAnsi" w:cstheme="majorBidi"/>
+      <w:rFonts w:asciiTheme="majorHAnsi" w:cstheme="majorBidi" w:eastAsiaTheme="majorEastAsia" w:hAnsiTheme="majorHAnsi"/>
       <w:b w:val="0"/>
       <w:bCs w:val="0"/>
-      <w:color w:val="365F91" w:themeColor="accent1" w:themeShade="BF"/>
+      <w:color w:themeColor="accent1" w:themeShade="BF" w:val="365F91"/>
     </w:rPr>
   </w:style>
   <w:style w:type="paragraph" w:customStyle="1" w:styleId="SourceCode">

</xml_diff>

<commit_message>
deleted some terms from glossary
</commit_message>
<xml_diff>
--- a/docs/engineering_project_report.docx
+++ b/docs/engineering_project_report.docx
@@ -2458,66 +2458,6 @@
                 <w:b/>
                 <w:bCs/>
               </w:rPr>
-              <w:t xml:space="preserve">Hypertable</w:t>
-            </w:r>
-          </w:p>
-        </w:tc>
-        <w:tc>
-          <w:tcPr/>
-          <w:p>
-            <w:pPr>
-              <w:pStyle w:val="Compact"/>
-              <w:jc w:val="left"/>
-            </w:pPr>
-            <w:r>
-              <w:t xml:space="preserve">A TimescaleDB abstraction that presents time-series data as a single continuous PostgreSQL table while transparently partitioning it into time-based chunks under the hood.</w:t>
-            </w:r>
-          </w:p>
-        </w:tc>
-      </w:tr>
-      <w:tr>
-        <w:tc>
-          <w:tcPr/>
-          <w:p>
-            <w:pPr>
-              <w:pStyle w:val="Compact"/>
-              <w:jc w:val="left"/>
-            </w:pPr>
-            <w:r>
-              <w:rPr>
-                <w:b/>
-                <w:bCs/>
-              </w:rPr>
-              <w:t xml:space="preserve">Isolation Forest</w:t>
-            </w:r>
-          </w:p>
-        </w:tc>
-        <w:tc>
-          <w:tcPr/>
-          <w:p>
-            <w:pPr>
-              <w:pStyle w:val="Compact"/>
-              <w:jc w:val="left"/>
-            </w:pPr>
-            <w:r>
-              <w:t xml:space="preserve">An unsupervised machine learning algorithm for anomaly detection that isolates observations by randomly selecting a feature and split value, where anomalies require fewer splits to isolate.</w:t>
-            </w:r>
-          </w:p>
-        </w:tc>
-      </w:tr>
-      <w:tr>
-        <w:tc>
-          <w:tcPr/>
-          <w:p>
-            <w:pPr>
-              <w:pStyle w:val="Compact"/>
-              <w:jc w:val="left"/>
-            </w:pPr>
-            <w:r>
-              <w:rPr>
-                <w:b/>
-                <w:bCs/>
-              </w:rPr>
               <w:t xml:space="preserve">MVP (Minimum Viable Product)</w:t>
             </w:r>
           </w:p>
@@ -2531,96 +2471,6 @@
             </w:pPr>
             <w:r>
               <w:t xml:space="preserve">The minimal functional scope of the project fulfilling all foundational requirements for academic project evaluation and defense.</w:t>
-            </w:r>
-          </w:p>
-        </w:tc>
-      </w:tr>
-      <w:tr>
-        <w:tc>
-          <w:tcPr/>
-          <w:p>
-            <w:pPr>
-              <w:pStyle w:val="Compact"/>
-              <w:jc w:val="left"/>
-            </w:pPr>
-            <w:r>
-              <w:rPr>
-                <w:b/>
-                <w:bCs/>
-              </w:rPr>
-              <w:t xml:space="preserve">p95 Latency</w:t>
-            </w:r>
-          </w:p>
-        </w:tc>
-        <w:tc>
-          <w:tcPr/>
-          <w:p>
-            <w:pPr>
-              <w:pStyle w:val="Compact"/>
-              <w:jc w:val="left"/>
-            </w:pPr>
-            <w:r>
-              <w:t xml:space="preserve">The 95th percentile of response time distribution, indicating that 95% of all incoming requests are served in less than the specified duration.</w:t>
-            </w:r>
-          </w:p>
-        </w:tc>
-      </w:tr>
-      <w:tr>
-        <w:tc>
-          <w:tcPr/>
-          <w:p>
-            <w:pPr>
-              <w:pStyle w:val="Compact"/>
-              <w:jc w:val="left"/>
-            </w:pPr>
-            <w:r>
-              <w:rPr>
-                <w:b/>
-                <w:bCs/>
-              </w:rPr>
-              <w:t xml:space="preserve">Rolling Z-Score</w:t>
-            </w:r>
-          </w:p>
-        </w:tc>
-        <w:tc>
-          <w:tcPr/>
-          <w:p>
-            <w:pPr>
-              <w:pStyle w:val="Compact"/>
-              <w:jc w:val="left"/>
-            </w:pPr>
-            <w:r>
-              <w:t xml:space="preserve">A localized statistical metric representing the number of standard deviations a given observation deviates from the moving mean over a sliding temporal window.</w:t>
-            </w:r>
-          </w:p>
-        </w:tc>
-      </w:tr>
-      <w:tr>
-        <w:tc>
-          <w:tcPr/>
-          <w:p>
-            <w:pPr>
-              <w:pStyle w:val="Compact"/>
-              <w:jc w:val="left"/>
-            </w:pPr>
-            <w:r>
-              <w:rPr>
-                <w:b/>
-                <w:bCs/>
-              </w:rPr>
-              <w:t xml:space="preserve">Telemetry</w:t>
-            </w:r>
-          </w:p>
-        </w:tc>
-        <w:tc>
-          <w:tcPr/>
-          <w:p>
-            <w:pPr>
-              <w:pStyle w:val="Compact"/>
-              <w:jc w:val="left"/>
-            </w:pPr>
-            <w:r>
-              <w:t xml:space="preserve">Automated remote collection and transmission of operational measurement data from distributed sensors or agents to a central receiving station.</w:t>
             </w:r>
           </w:p>
         </w:tc>

</xml_diff>

<commit_message>
generated pdf doc and tex
</commit_message>
<xml_diff>
--- a/docs/engineering_project_report.docx
+++ b/docs/engineering_project_report.docx
@@ -2,15 +2,14 @@
 <file path=word/document.xml><?xml version="1.0" encoding="utf-8"?>
 <w:document xmlns:w="http://schemas.openxmlformats.org/wordprocessingml/2006/main" xmlns:m="http://schemas.openxmlformats.org/officeDocument/2006/math" xmlns:r="http://schemas.openxmlformats.org/officeDocument/2006/relationships" xmlns:o="urn:schemas-microsoft-com:office:office" xmlns:v="urn:schemas-microsoft-com:vml" xmlns:w10="urn:schemas-microsoft-com:office:word" xmlns:a="http://schemas.openxmlformats.org/drawingml/2006/main" xmlns:pic="http://schemas.openxmlformats.org/drawingml/2006/picture" xmlns:wp="http://schemas.openxmlformats.org/drawingml/2006/wordprocessingDrawing">
   <w:body>
+    <w:bookmarkStart w:id="30" w:name="Xcbf66d44cddd739ff66a8f4ebd6e07e67a6b8c0"/>
     <w:p>
       <w:pPr>
         <w:pStyle w:val="Heading1"/>
       </w:pPr>
-      <w:bookmarkStart w:id="9" w:name="_cbf66d44cddd739ff66a8f4ebd6e07e67a6b8c0"/>
       <w:r>
         <w:t xml:space="preserve">Stage 1 Document: Requirements Specification and Project Scope</w:t>
       </w:r>
-      <w:bookmarkEnd w:id="9"/>
     </w:p>
     <w:p>
       <w:pPr>
@@ -44,15 +43,14 @@
         <w:t xml:space="preserve">Warsaw University of Technology</w:t>
       </w:r>
     </w:p>
+    <w:bookmarkStart w:id="9" w:name="document-metadata-and-change-history"/>
     <w:p>
       <w:pPr>
         <w:pStyle w:val="Heading2"/>
       </w:pPr>
-      <w:bookmarkStart w:id="10" w:name="_359c456ad8a5e19f4e9450cf8fc98d79a9b3b06"/>
       <w:r>
         <w:t xml:space="preserve">1. Document Metadata and Change History</w:t>
       </w:r>
-      <w:bookmarkEnd w:id="10"/>
     </w:p>
     <w:tbl>
       <w:tblPr>
@@ -157,7 +155,7 @@
               <w:jc w:val="center"/>
             </w:pPr>
             <w:r>
-              <w:t xml:space="preserve">Zuzanna Zalewska</w:t>
+              <w:t xml:space="preserve">ZZ</w:t>
             </w:r>
           </w:p>
         </w:tc>
@@ -211,7 +209,7 @@
               <w:jc w:val="center"/>
             </w:pPr>
             <w:r>
-              <w:t xml:space="preserve">Zuzanna Zalewska</w:t>
+              <w:t xml:space="preserve">ZZ</w:t>
             </w:r>
           </w:p>
         </w:tc>
@@ -265,7 +263,7 @@
               <w:jc w:val="center"/>
             </w:pPr>
             <w:r>
-              <w:t xml:space="preserve">Martyna Sadowska</w:t>
+              <w:t xml:space="preserve">MS</w:t>
             </w:r>
           </w:p>
         </w:tc>
@@ -319,7 +317,7 @@
               <w:jc w:val="center"/>
             </w:pPr>
             <w:r>
-              <w:t xml:space="preserve">Hanna Szczerbinska</w:t>
+              <w:t xml:space="preserve">HS</w:t>
             </w:r>
           </w:p>
         </w:tc>
@@ -382,7 +380,7 @@
         <w:t xml:space="preserve"> </w:t>
       </w:r>
       <w:r>
-        <w:t xml:space="preserve">Martyna Sadowska, Hanna Szczerbińska, Zuzanna Zalewska</w:t>
+        <w:t xml:space="preserve">Martyna Sadowska (MS), Hanna Szczerbińska (HS), Zuzanna Zalewska (ZZ)</w:t>
       </w:r>
     </w:p>
     <w:p>
@@ -407,15 +405,15 @@
         <w:t xml:space="preserve">Janusz Rafałko, Ph.D.</w:t>
       </w:r>
     </w:p>
+    <w:bookmarkEnd w:id="9"/>
+    <w:bookmarkStart w:id="10" w:name="X208661bb300c19ea44f94b3286f175eadce5de7"/>
     <w:p>
       <w:pPr>
         <w:pStyle w:val="Heading2"/>
       </w:pPr>
-      <w:bookmarkStart w:id="11" w:name="_208661bb300c19ea44f94b3286f175eadce5de7"/>
       <w:r>
         <w:t xml:space="preserve">2. One-Sentence Engineering / Research Problem Formulation</w:t>
       </w:r>
-      <w:bookmarkEnd w:id="11"/>
     </w:p>
     <w:p>
       <w:pPr>
@@ -429,25 +427,24 @@
         <w:t xml:space="preserve">“The objective of this project is to design, implement, and evaluate a system capable of reconstructing fragmented (shredded or torn) documents based on an image of their pieces, as well as artificially splitting a document into such pieces.”</w:t>
       </w:r>
     </w:p>
+    <w:bookmarkEnd w:id="10"/>
+    <w:bookmarkStart w:id="13" w:name="X849c5ef3e6a95175330fde1820214ed9a3f2f63"/>
     <w:p>
       <w:pPr>
         <w:pStyle w:val="Heading2"/>
       </w:pPr>
-      <w:bookmarkStart w:id="12" w:name="_849c5ef3e6a95175330fde1820214ed9a3f2f63"/>
       <w:r>
         <w:t xml:space="preserve">3. Project Scope: MVP vs. Future Work (Scope Management)</w:t>
       </w:r>
-      <w:bookmarkEnd w:id="12"/>
-    </w:p>
+    </w:p>
+    <w:bookmarkStart w:id="11" w:name="minimum-viable-product-mvp-passing-scope"/>
     <w:p>
       <w:pPr>
         <w:pStyle w:val="Heading3"/>
       </w:pPr>
-      <w:bookmarkStart w:id="13" w:name="_1e9c6e17298c255f6f09138aa09bd283f770454"/>
       <w:r>
         <w:t xml:space="preserve">3.1. Minimum Viable Product (MVP – Passing Scope)</w:t>
       </w:r>
-      <w:bookmarkEnd w:id="13"/>
     </w:p>
     <w:p>
       <w:pPr>
@@ -565,15 +562,15 @@
         <w:t xml:space="preserve">Displays the reconstructed output, allows for iterative improvement (adjusting either the processing time or algorithm used), and saves the final result locally.</w:t>
       </w:r>
     </w:p>
+    <w:bookmarkEnd w:id="11"/>
+    <w:bookmarkStart w:id="12" w:name="out-of-scope-future-work"/>
     <w:p>
       <w:pPr>
         <w:pStyle w:val="Heading3"/>
       </w:pPr>
-      <w:bookmarkStart w:id="14" w:name="_da33a321df5d4b4c544dd8a8c7335a1a5f37196"/>
       <w:r>
         <w:t xml:space="preserve">3.2. Out of Scope (Future Work)</w:t>
       </w:r>
-      <w:bookmarkEnd w:id="14"/>
     </w:p>
     <w:p>
       <w:pPr>
@@ -611,21 +608,22 @@
         <w:t xml:space="preserve">Reconstruction of several documents whose fragments are combined.</w:t>
       </w:r>
     </w:p>
+    <w:bookmarkEnd w:id="12"/>
+    <w:bookmarkEnd w:id="13"/>
+    <w:bookmarkStart w:id="20" w:name="X32c7745bee60674eb057a95928e5168c201f3b9"/>
     <w:p>
       <w:pPr>
         <w:pStyle w:val="Heading2"/>
       </w:pPr>
-      <w:bookmarkStart w:id="15" w:name="_32c7745bee60674eb057a95928e5168c201f3b9"/>
       <w:r>
         <w:t xml:space="preserve">4. Functional Requirements (User Stories &amp; Acceptance Criteria)</w:t>
       </w:r>
-      <w:bookmarkEnd w:id="15"/>
-    </w:p>
+    </w:p>
+    <w:bookmarkStart w:id="14" w:name="X57417cdd8d8443ebed76ce7719983dd2c07d353"/>
     <w:p>
       <w:pPr>
         <w:pStyle w:val="Heading3"/>
       </w:pPr>
-      <w:bookmarkStart w:id="16" w:name="_57417cdd8d8443ebed76ce7719983dd2c07d353"/>
       <w:r>
         <w:rPr>
           <w:b/>
@@ -633,7 +631,6 @@
         </w:rPr>
         <w:t xml:space="preserve">US-01: Loading a document image for splitting</w:t>
       </w:r>
-      <w:bookmarkEnd w:id="16"/>
     </w:p>
     <w:p>
       <w:pPr>
@@ -839,11 +836,12 @@
         <w:t xml:space="preserve">The system displays an error message indicating the accepted formats.</w:t>
       </w:r>
     </w:p>
+    <w:bookmarkEnd w:id="14"/>
+    <w:bookmarkStart w:id="15" w:name="Xf47538c0b533229e806588be09ef0bf151e1dc4"/>
     <w:p>
       <w:pPr>
         <w:pStyle w:val="Heading3"/>
       </w:pPr>
-      <w:bookmarkStart w:id="17" w:name="_f47538c0b533229e806588be09ef0bf151e1dc4"/>
       <w:r>
         <w:rPr>
           <w:b/>
@@ -851,7 +849,6 @@
         </w:rPr>
         <w:t xml:space="preserve">US-02: Splitting a document into fragments</w:t>
       </w:r>
-      <w:bookmarkEnd w:id="17"/>
     </w:p>
     <w:p>
       <w:pPr>
@@ -1050,11 +1047,12 @@
         <w:t xml:space="preserve">The system generates a new set of borders using the currently selected algorithm and its parameters.</w:t>
       </w:r>
     </w:p>
+    <w:bookmarkEnd w:id="15"/>
+    <w:bookmarkStart w:id="16" w:name="us-03-generating-a-fragmented-image"/>
     <w:p>
       <w:pPr>
         <w:pStyle w:val="Heading3"/>
       </w:pPr>
-      <w:bookmarkStart w:id="18" w:name="_f97a41c56bb88b6e431db06e70a2b1a15570e21"/>
       <w:r>
         <w:rPr>
           <w:b/>
@@ -1062,7 +1060,6 @@
         </w:rPr>
         <w:t xml:space="preserve">US-03: Generating a fragmented image</w:t>
       </w:r>
-      <w:bookmarkEnd w:id="18"/>
     </w:p>
     <w:p>
       <w:pPr>
@@ -1252,11 +1249,12 @@
         <w:t xml:space="preserve">The result is saved to the chosen disk location.</w:t>
       </w:r>
     </w:p>
+    <w:bookmarkEnd w:id="16"/>
+    <w:bookmarkStart w:id="17" w:name="Xe74ca91d32794644ddf35cae32992f3ab071ad1"/>
     <w:p>
       <w:pPr>
         <w:pStyle w:val="Heading3"/>
       </w:pPr>
-      <w:bookmarkStart w:id="19" w:name="_e74ca91d32794644ddf35cae32992f3ab071ad1"/>
       <w:r>
         <w:rPr>
           <w:b/>
@@ -1264,7 +1262,6 @@
         </w:rPr>
         <w:t xml:space="preserve">US-04: Extracting fragments from an input image</w:t>
       </w:r>
-      <w:bookmarkEnd w:id="19"/>
     </w:p>
     <w:p>
       <w:pPr>
@@ -1470,11 +1467,12 @@
         <w:t xml:space="preserve">The system displays an appropriate error message.</w:t>
       </w:r>
     </w:p>
+    <w:bookmarkEnd w:id="17"/>
+    <w:bookmarkStart w:id="18" w:name="X7d55e9282812fdebaa20850db5960c1af453bcd"/>
     <w:p>
       <w:pPr>
         <w:pStyle w:val="Heading3"/>
       </w:pPr>
-      <w:bookmarkStart w:id="20" w:name="_7d55e9282812fdebaa20850db5960c1af453bcd"/>
       <w:r>
         <w:rPr>
           <w:b/>
@@ -1482,7 +1480,6 @@
         </w:rPr>
         <w:t xml:space="preserve">US-05: Reconstructing a document from fragments</w:t>
       </w:r>
-      <w:bookmarkEnd w:id="20"/>
     </w:p>
     <w:p>
       <w:pPr>
@@ -1628,11 +1625,12 @@
         <w:t xml:space="preserve">The system displays the reconstructed document image.</w:t>
       </w:r>
     </w:p>
+    <w:bookmarkEnd w:id="18"/>
+    <w:bookmarkStart w:id="19" w:name="X8e4fbef483609392b257fbf02c771a1538f7008"/>
     <w:p>
       <w:pPr>
         <w:pStyle w:val="Heading3"/>
       </w:pPr>
-      <w:bookmarkStart w:id="21" w:name="_8e4fbef483609392b257fbf02c771a1538f7008"/>
       <w:r>
         <w:rPr>
           <w:b/>
@@ -1640,7 +1638,6 @@
         </w:rPr>
         <w:t xml:space="preserve">US-06: Iterative enhancement of reconstruction</w:t>
       </w:r>
-      <w:bookmarkEnd w:id="21"/>
     </w:p>
     <w:p>
       <w:pPr>
@@ -1907,15 +1904,16 @@
         <w:t xml:space="preserve">The system allows saving the result locally.</w:t>
       </w:r>
     </w:p>
+    <w:bookmarkEnd w:id="19"/>
+    <w:bookmarkEnd w:id="20"/>
+    <w:bookmarkStart w:id="21" w:name="X74a6988351e924c576c6f7673b837877495fc73"/>
     <w:p>
       <w:pPr>
         <w:pStyle w:val="Heading2"/>
       </w:pPr>
-      <w:bookmarkStart w:id="22" w:name="_74a6988351e924c576c6f7673b837877495fc73"/>
       <w:r>
         <w:t xml:space="preserve">5. Quantifiable Non-Functional Requirements (NFRs)</w:t>
       </w:r>
-      <w:bookmarkEnd w:id="22"/>
     </w:p>
     <w:tbl>
       <w:tblPr>
@@ -1925,10 +1923,10 @@
         <w:tblLook w:firstRow="1" w:lastRow="0" w:firstColumn="0" w:lastColumn="0" w:noHBand="0" w:noVBand="0" w:val="0020"/>
       </w:tblPr>
       <w:tblGrid>
-        <w:gridCol w:w="1584"/>
-        <w:gridCol w:w="2112"/>
-        <w:gridCol w:w="2112"/>
-        <w:gridCol w:w="2112"/>
+        <w:gridCol w:w="1131"/>
+        <w:gridCol w:w="2262"/>
+        <w:gridCol w:w="2262"/>
+        <w:gridCol w:w="2262"/>
       </w:tblGrid>
       <w:tr>
         <w:trPr>
@@ -1939,7 +1937,7 @@
           <w:p>
             <w:pPr>
               <w:pStyle w:val="Compact"/>
-              <w:jc w:val="center"/>
+              <w:jc w:val="left"/>
             </w:pPr>
             <w:r>
               <w:t xml:space="preserve">ID</w:t>
@@ -1989,7 +1987,7 @@
           <w:p>
             <w:pPr>
               <w:pStyle w:val="Compact"/>
-              <w:jc w:val="center"/>
+              <w:jc w:val="left"/>
             </w:pPr>
             <w:r>
               <w:rPr>
@@ -2047,7 +2045,7 @@
           <w:p>
             <w:pPr>
               <w:pStyle w:val="Compact"/>
-              <w:jc w:val="center"/>
+              <w:jc w:val="left"/>
             </w:pPr>
             <w:r>
               <w:rPr>
@@ -2105,7 +2103,7 @@
           <w:p>
             <w:pPr>
               <w:pStyle w:val="Compact"/>
-              <w:jc w:val="center"/>
+              <w:jc w:val="left"/>
             </w:pPr>
             <w:r>
               <w:rPr>
@@ -2163,7 +2161,7 @@
           <w:p>
             <w:pPr>
               <w:pStyle w:val="Compact"/>
-              <w:jc w:val="center"/>
+              <w:jc w:val="left"/>
             </w:pPr>
             <w:r>
               <w:rPr>
@@ -2221,7 +2219,7 @@
           <w:p>
             <w:pPr>
               <w:pStyle w:val="Compact"/>
-              <w:jc w:val="center"/>
+              <w:jc w:val="left"/>
             </w:pPr>
             <w:r>
               <w:rPr>
@@ -2279,7 +2277,7 @@
           <w:p>
             <w:pPr>
               <w:pStyle w:val="Compact"/>
-              <w:jc w:val="center"/>
+              <w:jc w:val="left"/>
             </w:pPr>
             <w:r>
               <w:rPr>
@@ -2337,7 +2335,7 @@
           <w:p>
             <w:pPr>
               <w:pStyle w:val="Compact"/>
-              <w:jc w:val="center"/>
+              <w:jc w:val="left"/>
             </w:pPr>
             <w:r>
               <w:rPr>
@@ -2390,15 +2388,24 @@
         </w:tc>
       </w:tr>
     </w:tbl>
+    <w:bookmarkEnd w:id="21"/>
+    <w:bookmarkStart w:id="26" w:name="preliminary-risk-register"/>
     <w:p>
       <w:pPr>
         <w:pStyle w:val="Heading2"/>
       </w:pPr>
-      <w:bookmarkStart w:id="23" w:name="_glossary"/>
-      <w:r>
-        <w:t xml:space="preserve">6. Glossary</w:t>
-      </w:r>
-      <w:bookmarkEnd w:id="23"/>
+      <w:r>
+        <w:t xml:space="preserve">6. Preliminary Risk Register</w:t>
+      </w:r>
+    </w:p>
+    <w:bookmarkStart w:id="22" w:name="project-and-technical-risk-register"/>
+    <w:p>
+      <w:pPr>
+        <w:pStyle w:val="Heading3"/>
+      </w:pPr>
+      <w:r>
+        <w:t xml:space="preserve">6.1 Project and Technical Risk Register</w:t>
+      </w:r>
     </w:p>
     <w:tbl>
       <w:tblPr>
@@ -2408,8 +2415,12 @@
         <w:tblLook w:firstRow="1" w:lastRow="0" w:firstColumn="0" w:lastColumn="0" w:noHBand="0" w:noVBand="0" w:val="0020"/>
       </w:tblPr>
       <w:tblGrid>
-        <w:gridCol w:w="2863"/>
-        <w:gridCol w:w="5056"/>
+        <w:gridCol w:w="709"/>
+        <w:gridCol w:w="2364"/>
+        <w:gridCol w:w="650"/>
+        <w:gridCol w:w="650"/>
+        <w:gridCol w:w="709"/>
+        <w:gridCol w:w="2837"/>
       </w:tblGrid>
       <w:tr>
         <w:trPr>
@@ -2420,22 +2431,70 @@
           <w:p>
             <w:pPr>
               <w:pStyle w:val="Compact"/>
-              <w:jc w:val="center"/>
-            </w:pPr>
-            <w:r>
-              <w:t xml:space="preserve">Term</w:t>
-            </w:r>
-          </w:p>
-        </w:tc>
-        <w:tc>
-          <w:tcPr/>
-          <w:p>
-            <w:pPr>
-              <w:pStyle w:val="Compact"/>
-              <w:jc w:val="center"/>
-            </w:pPr>
-            <w:r>
-              <w:t xml:space="preserve">Definition</w:t>
+              <w:jc w:val="left"/>
+            </w:pPr>
+            <w:r>
+              <w:t xml:space="preserve">ID</w:t>
+            </w:r>
+          </w:p>
+        </w:tc>
+        <w:tc>
+          <w:tcPr/>
+          <w:p>
+            <w:pPr>
+              <w:pStyle w:val="Compact"/>
+              <w:jc w:val="left"/>
+            </w:pPr>
+            <w:r>
+              <w:t xml:space="preserve">Risk Event</w:t>
+            </w:r>
+          </w:p>
+        </w:tc>
+        <w:tc>
+          <w:tcPr/>
+          <w:p>
+            <w:pPr>
+              <w:pStyle w:val="Compact"/>
+              <w:jc w:val="left"/>
+            </w:pPr>
+            <w:r>
+              <w:t xml:space="preserve">Likelihood (L/M/H)</w:t>
+            </w:r>
+          </w:p>
+        </w:tc>
+        <w:tc>
+          <w:tcPr/>
+          <w:p>
+            <w:pPr>
+              <w:pStyle w:val="Compact"/>
+              <w:jc w:val="left"/>
+            </w:pPr>
+            <w:r>
+              <w:t xml:space="preserve">Impact (L/M/ H/Crit)</w:t>
+            </w:r>
+          </w:p>
+        </w:tc>
+        <w:tc>
+          <w:tcPr/>
+          <w:p>
+            <w:pPr>
+              <w:pStyle w:val="Compact"/>
+              <w:jc w:val="left"/>
+            </w:pPr>
+            <w:r>
+              <w:t xml:space="preserve">Owner</w:t>
+            </w:r>
+          </w:p>
+        </w:tc>
+        <w:tc>
+          <w:tcPr/>
+          <w:p>
+            <w:pPr>
+              <w:pStyle w:val="Compact"/>
+              <w:jc w:val="left"/>
+            </w:pPr>
+            <w:r>
+              <w:t xml:space="preserve">Mitigation Strategy</w:t>
             </w:r>
           </w:p>
         </w:tc>
@@ -2446,56 +2505,78 @@
           <w:p>
             <w:pPr>
               <w:pStyle w:val="Compact"/>
-              <w:jc w:val="center"/>
+              <w:jc w:val="left"/>
             </w:pPr>
             <w:r>
               <w:rPr>
                 <w:b/>
                 <w:bCs/>
               </w:rPr>
-              <w:t xml:space="preserve">APD (Archiwum Prac Dyplomowych)</w:t>
-            </w:r>
-          </w:p>
-        </w:tc>
-        <w:tc>
-          <w:tcPr/>
-          <w:p>
-            <w:pPr>
-              <w:pStyle w:val="Compact"/>
-              <w:jc w:val="center"/>
-            </w:pPr>
-            <w:r>
-              <w:t xml:space="preserve">University Thesis Archive; official web portal of Warsaw University of Technology used for thesis submission, anti-plagiarism verification, and archiving.</w:t>
-            </w:r>
-          </w:p>
-        </w:tc>
-      </w:tr>
-      <w:tr>
-        <w:tc>
-          <w:tcPr/>
-          <w:p>
-            <w:pPr>
-              <w:pStyle w:val="Compact"/>
-              <w:jc w:val="center"/>
+              <w:t xml:space="preserve">RSK-01</w:t>
+            </w:r>
+          </w:p>
+        </w:tc>
+        <w:tc>
+          <w:tcPr/>
+          <w:p>
+            <w:pPr>
+              <w:pStyle w:val="Compact"/>
+              <w:jc w:val="left"/>
             </w:pPr>
             <w:r>
               <w:rPr>
                 <w:b/>
                 <w:bCs/>
               </w:rPr>
-              <w:t xml:space="preserve">MVP (Minimum Viable Product)</w:t>
-            </w:r>
-          </w:p>
-        </w:tc>
-        <w:tc>
-          <w:tcPr/>
-          <w:p>
-            <w:pPr>
-              <w:pStyle w:val="Compact"/>
-              <w:jc w:val="center"/>
-            </w:pPr>
-            <w:r>
-              <w:t xml:space="preserve">The minimal functional scope of the project fulfilling all foundational requirements for academic project evaluation and defense.</w:t>
+              <w:t xml:space="preserve">Team member illness / drop-out</w:t>
+            </w:r>
+          </w:p>
+        </w:tc>
+        <w:tc>
+          <w:tcPr/>
+          <w:p>
+            <w:pPr>
+              <w:pStyle w:val="Compact"/>
+              <w:jc w:val="left"/>
+            </w:pPr>
+            <w:r>
+              <w:t xml:space="preserve">L</w:t>
+            </w:r>
+          </w:p>
+        </w:tc>
+        <w:tc>
+          <w:tcPr/>
+          <w:p>
+            <w:pPr>
+              <w:pStyle w:val="Compact"/>
+              <w:jc w:val="left"/>
+            </w:pPr>
+            <w:r>
+              <w:t xml:space="preserve">H</w:t>
+            </w:r>
+          </w:p>
+        </w:tc>
+        <w:tc>
+          <w:tcPr/>
+          <w:p>
+            <w:pPr>
+              <w:pStyle w:val="Compact"/>
+              <w:jc w:val="left"/>
+            </w:pPr>
+            <w:r>
+              <w:t xml:space="preserve">Everyone</w:t>
+            </w:r>
+          </w:p>
+        </w:tc>
+        <w:tc>
+          <w:tcPr/>
+          <w:p>
+            <w:pPr>
+              <w:pStyle w:val="Compact"/>
+              <w:jc w:val="left"/>
+            </w:pPr>
+            <w:r>
+              <w:t xml:space="preserve">Peer code review for every PR, pair programming on the critical path, modular architecture.</w:t>
             </w:r>
           </w:p>
         </w:tc>
@@ -2506,80 +2587,1197 @@
           <w:p>
             <w:pPr>
               <w:pStyle w:val="Compact"/>
-              <w:jc w:val="center"/>
+              <w:jc w:val="left"/>
             </w:pPr>
             <w:r>
               <w:rPr>
                 <w:b/>
                 <w:bCs/>
               </w:rPr>
-              <w:t xml:space="preserve">Module 1</w:t>
-            </w:r>
-          </w:p>
-        </w:tc>
-        <w:tc>
-          <w:tcPr/>
-          <w:p>
-            <w:pPr>
-              <w:pStyle w:val="Compact"/>
-              <w:jc w:val="center"/>
-            </w:pPr>
-            <w:r>
-              <w:t xml:space="preserve">The document-splitting module, whose scope includes splitting an image into several fragments and arranging those fragments against a background.</w:t>
-            </w:r>
-          </w:p>
-        </w:tc>
-      </w:tr>
-      <w:tr>
-        <w:tc>
-          <w:tcPr/>
-          <w:p>
-            <w:pPr>
-              <w:pStyle w:val="Compact"/>
-              <w:jc w:val="center"/>
+              <w:t xml:space="preserve">RSK-02</w:t>
+            </w:r>
+          </w:p>
+        </w:tc>
+        <w:tc>
+          <w:tcPr/>
+          <w:p>
+            <w:pPr>
+              <w:pStyle w:val="Compact"/>
+              <w:jc w:val="left"/>
             </w:pPr>
             <w:r>
               <w:rPr>
                 <w:b/>
                 <w:bCs/>
               </w:rPr>
-              <w:t xml:space="preserve">Module 2</w:t>
-            </w:r>
-          </w:p>
-        </w:tc>
-        <w:tc>
-          <w:tcPr/>
-          <w:p>
-            <w:pPr>
-              <w:pStyle w:val="Compact"/>
-              <w:jc w:val="center"/>
-            </w:pPr>
-            <w:r>
-              <w:t xml:space="preserve">The document reconstruction module, whose scope includes extracting individual fragments from an image and reconstructing the original document based on the fragments’ shape and content.</w:t>
+              <w:t xml:space="preserve">Insufficient accuracy for the reconstructing algorithm</w:t>
+            </w:r>
+          </w:p>
+        </w:tc>
+        <w:tc>
+          <w:tcPr/>
+          <w:p>
+            <w:pPr>
+              <w:pStyle w:val="Compact"/>
+              <w:jc w:val="left"/>
+            </w:pPr>
+            <w:r>
+              <w:t xml:space="preserve">M</w:t>
+            </w:r>
+          </w:p>
+        </w:tc>
+        <w:tc>
+          <w:tcPr/>
+          <w:p>
+            <w:pPr>
+              <w:pStyle w:val="Compact"/>
+              <w:jc w:val="left"/>
+            </w:pPr>
+            <w:r>
+              <w:t xml:space="preserve">H</w:t>
+            </w:r>
+          </w:p>
+        </w:tc>
+        <w:tc>
+          <w:tcPr/>
+          <w:p>
+            <w:pPr>
+              <w:pStyle w:val="Compact"/>
+              <w:jc w:val="left"/>
+            </w:pPr>
+            <w:r>
+              <w:t xml:space="preserve">Everyone</w:t>
+            </w:r>
+          </w:p>
+        </w:tc>
+        <w:tc>
+          <w:tcPr/>
+          <w:p>
+            <w:pPr>
+              <w:pStyle w:val="Compact"/>
+              <w:jc w:val="left"/>
+            </w:pPr>
+            <w:r>
+              <w:t xml:space="preserve">Explore different algorithms; if the problem persists focus on an analysis of algorithmic limitations and failure cases.</w:t>
+            </w:r>
+          </w:p>
+        </w:tc>
+      </w:tr>
+      <w:tr>
+        <w:tc>
+          <w:tcPr/>
+          <w:p>
+            <w:pPr>
+              <w:pStyle w:val="Compact"/>
+              <w:jc w:val="left"/>
+            </w:pPr>
+            <w:r>
+              <w:rPr>
+                <w:b/>
+                <w:bCs/>
+              </w:rPr>
+              <w:t xml:space="preserve">RSK-03</w:t>
+            </w:r>
+          </w:p>
+        </w:tc>
+        <w:tc>
+          <w:tcPr/>
+          <w:p>
+            <w:pPr>
+              <w:pStyle w:val="Compact"/>
+              <w:jc w:val="left"/>
+            </w:pPr>
+            <w:r>
+              <w:rPr>
+                <w:b/>
+                <w:bCs/>
+              </w:rPr>
+              <w:t xml:space="preserve">Environment incompatibility in the MiNI laboratory</w:t>
+            </w:r>
+          </w:p>
+        </w:tc>
+        <w:tc>
+          <w:tcPr/>
+          <w:p>
+            <w:pPr>
+              <w:pStyle w:val="Compact"/>
+              <w:jc w:val="left"/>
+            </w:pPr>
+            <w:r>
+              <w:t xml:space="preserve">M</w:t>
+            </w:r>
+          </w:p>
+        </w:tc>
+        <w:tc>
+          <w:tcPr/>
+          <w:p>
+            <w:pPr>
+              <w:pStyle w:val="Compact"/>
+              <w:jc w:val="left"/>
+            </w:pPr>
+            <w:r>
+              <w:t xml:space="preserve">Crit</w:t>
+            </w:r>
+          </w:p>
+        </w:tc>
+        <w:tc>
+          <w:tcPr/>
+          <w:p>
+            <w:pPr>
+              <w:pStyle w:val="Compact"/>
+              <w:jc w:val="left"/>
+            </w:pPr>
+            <w:r>
+              <w:t xml:space="preserve">MS</w:t>
+            </w:r>
+          </w:p>
+        </w:tc>
+        <w:tc>
+          <w:tcPr/>
+          <w:p>
+            <w:pPr>
+              <w:pStyle w:val="Compact"/>
+              <w:jc w:val="left"/>
+            </w:pPr>
+            <w:r>
+              <w:t xml:space="preserve">Test deployment on lab machines after implementing Module 1 and another after Module 2, not the night before acceptance.</w:t>
+            </w:r>
+          </w:p>
+        </w:tc>
+      </w:tr>
+      <w:tr>
+        <w:tc>
+          <w:tcPr/>
+          <w:p>
+            <w:pPr>
+              <w:pStyle w:val="Compact"/>
+              <w:jc w:val="left"/>
+            </w:pPr>
+            <w:r>
+              <w:rPr>
+                <w:b/>
+                <w:bCs/>
+              </w:rPr>
+              <w:t xml:space="preserve">RSK-04</w:t>
+            </w:r>
+          </w:p>
+        </w:tc>
+        <w:tc>
+          <w:tcPr/>
+          <w:p>
+            <w:pPr>
+              <w:pStyle w:val="Compact"/>
+              <w:jc w:val="left"/>
+            </w:pPr>
+            <w:r>
+              <w:rPr>
+                <w:b/>
+                <w:bCs/>
+              </w:rPr>
+              <w:t xml:space="preserve">Hardware failure (loss of data / code on laptop)</w:t>
+            </w:r>
+          </w:p>
+        </w:tc>
+        <w:tc>
+          <w:tcPr/>
+          <w:p>
+            <w:pPr>
+              <w:pStyle w:val="Compact"/>
+              <w:jc w:val="left"/>
+            </w:pPr>
+            <w:r>
+              <w:t xml:space="preserve">M</w:t>
+            </w:r>
+          </w:p>
+        </w:tc>
+        <w:tc>
+          <w:tcPr/>
+          <w:p>
+            <w:pPr>
+              <w:pStyle w:val="Compact"/>
+              <w:jc w:val="left"/>
+            </w:pPr>
+            <w:r>
+              <w:t xml:space="preserve">Crit</w:t>
+            </w:r>
+          </w:p>
+        </w:tc>
+        <w:tc>
+          <w:tcPr/>
+          <w:p>
+            <w:pPr>
+              <w:pStyle w:val="Compact"/>
+              <w:jc w:val="left"/>
+            </w:pPr>
+            <w:r>
+              <w:t xml:space="preserve">Everyone</w:t>
+            </w:r>
+          </w:p>
+        </w:tc>
+        <w:tc>
+          <w:tcPr/>
+          <w:p>
+            <w:pPr>
+              <w:pStyle w:val="Compact"/>
+              <w:jc w:val="left"/>
+            </w:pPr>
+            <w:r>
+              <w:t xml:space="preserve">Pushes to remote repository (GitHub) after each change.</w:t>
+            </w:r>
+          </w:p>
+        </w:tc>
+      </w:tr>
+      <w:tr>
+        <w:tc>
+          <w:tcPr/>
+          <w:p>
+            <w:pPr>
+              <w:pStyle w:val="Compact"/>
+              <w:jc w:val="left"/>
+            </w:pPr>
+            <w:r>
+              <w:rPr>
+                <w:b/>
+                <w:bCs/>
+              </w:rPr>
+              <w:t xml:space="preserve">RSK-05</w:t>
+            </w:r>
+          </w:p>
+        </w:tc>
+        <w:tc>
+          <w:tcPr/>
+          <w:p>
+            <w:pPr>
+              <w:pStyle w:val="Compact"/>
+              <w:jc w:val="left"/>
+            </w:pPr>
+            <w:r>
+              <w:rPr>
+                <w:b/>
+                <w:bCs/>
+              </w:rPr>
+              <w:t xml:space="preserve">Thesis writing workload accumulation in January</w:t>
+            </w:r>
+          </w:p>
+        </w:tc>
+        <w:tc>
+          <w:tcPr/>
+          <w:p>
+            <w:pPr>
+              <w:pStyle w:val="Compact"/>
+              <w:jc w:val="left"/>
+            </w:pPr>
+            <w:r>
+              <w:t xml:space="preserve">H</w:t>
+            </w:r>
+          </w:p>
+        </w:tc>
+        <w:tc>
+          <w:tcPr/>
+          <w:p>
+            <w:pPr>
+              <w:pStyle w:val="Compact"/>
+              <w:jc w:val="left"/>
+            </w:pPr>
+            <w:r>
+              <w:t xml:space="preserve">H</w:t>
+            </w:r>
+          </w:p>
+        </w:tc>
+        <w:tc>
+          <w:tcPr/>
+          <w:p>
+            <w:pPr>
+              <w:pStyle w:val="Compact"/>
+              <w:jc w:val="left"/>
+            </w:pPr>
+            <w:r>
+              <w:t xml:space="preserve">Everyone</w:t>
+            </w:r>
+          </w:p>
+        </w:tc>
+        <w:tc>
+          <w:tcPr/>
+          <w:p>
+            <w:pPr>
+              <w:pStyle w:val="Compact"/>
+              <w:jc w:val="left"/>
+            </w:pPr>
+            <w:r>
+              <w:t xml:space="preserve">Incremental drafting of thesis chapters; peer reviews within the team.</w:t>
+            </w:r>
+          </w:p>
+        </w:tc>
+      </w:tr>
+      <w:tr>
+        <w:tc>
+          <w:tcPr/>
+          <w:p>
+            <w:pPr>
+              <w:pStyle w:val="Compact"/>
+              <w:jc w:val="left"/>
+            </w:pPr>
+            <w:r>
+              <w:rPr>
+                <w:b/>
+                <w:bCs/>
+              </w:rPr>
+              <w:t xml:space="preserve">RSK-06</w:t>
+            </w:r>
+          </w:p>
+        </w:tc>
+        <w:tc>
+          <w:tcPr/>
+          <w:p>
+            <w:pPr>
+              <w:pStyle w:val="Compact"/>
+              <w:jc w:val="left"/>
+            </w:pPr>
+            <w:r>
+              <w:rPr>
+                <w:b/>
+                <w:bCs/>
+              </w:rPr>
+              <w:t xml:space="preserve">Unacceptably long execution time</w:t>
+            </w:r>
+          </w:p>
+        </w:tc>
+        <w:tc>
+          <w:tcPr/>
+          <w:p>
+            <w:pPr>
+              <w:pStyle w:val="Compact"/>
+              <w:jc w:val="left"/>
+            </w:pPr>
+            <w:r>
+              <w:t xml:space="preserve">H</w:t>
+            </w:r>
+          </w:p>
+        </w:tc>
+        <w:tc>
+          <w:tcPr/>
+          <w:p>
+            <w:pPr>
+              <w:pStyle w:val="Compact"/>
+              <w:jc w:val="left"/>
+            </w:pPr>
+            <w:r>
+              <w:t xml:space="preserve">M</w:t>
+            </w:r>
+          </w:p>
+        </w:tc>
+        <w:tc>
+          <w:tcPr/>
+          <w:p>
+            <w:pPr>
+              <w:pStyle w:val="Compact"/>
+              <w:jc w:val="left"/>
+            </w:pPr>
+            <w:r>
+              <w:t xml:space="preserve">HS</w:t>
+            </w:r>
+          </w:p>
+        </w:tc>
+        <w:tc>
+          <w:tcPr/>
+          <w:p>
+            <w:pPr>
+              <w:pStyle w:val="Compact"/>
+              <w:jc w:val="left"/>
+            </w:pPr>
+            <w:r>
+              <w:t xml:space="preserve">Implementing early stopping to the algorithms and accepting the worse results.</w:t>
+            </w:r>
+          </w:p>
+        </w:tc>
+      </w:tr>
+      <w:tr>
+        <w:tc>
+          <w:tcPr/>
+          <w:p>
+            <w:pPr>
+              <w:pStyle w:val="Compact"/>
+              <w:jc w:val="left"/>
+            </w:pPr>
+            <w:r>
+              <w:rPr>
+                <w:b/>
+                <w:bCs/>
+              </w:rPr>
+              <w:t xml:space="preserve">RSK-07</w:t>
+            </w:r>
+          </w:p>
+        </w:tc>
+        <w:tc>
+          <w:tcPr/>
+          <w:p>
+            <w:pPr>
+              <w:pStyle w:val="Compact"/>
+              <w:jc w:val="left"/>
+            </w:pPr>
+            <w:r>
+              <w:rPr>
+                <w:b/>
+                <w:bCs/>
+              </w:rPr>
+              <w:t xml:space="preserve">Rotation of the fragments resulting in quality loss and document illegibility.</w:t>
+            </w:r>
+          </w:p>
+        </w:tc>
+        <w:tc>
+          <w:tcPr/>
+          <w:p>
+            <w:pPr>
+              <w:pStyle w:val="Compact"/>
+              <w:jc w:val="left"/>
+            </w:pPr>
+            <w:r>
+              <w:t xml:space="preserve">M</w:t>
+            </w:r>
+          </w:p>
+        </w:tc>
+        <w:tc>
+          <w:tcPr/>
+          <w:p>
+            <w:pPr>
+              <w:pStyle w:val="Compact"/>
+              <w:jc w:val="left"/>
+            </w:pPr>
+            <w:r>
+              <w:t xml:space="preserve">M</w:t>
+            </w:r>
+          </w:p>
+        </w:tc>
+        <w:tc>
+          <w:tcPr/>
+          <w:p>
+            <w:pPr>
+              <w:pStyle w:val="Compact"/>
+              <w:jc w:val="left"/>
+            </w:pPr>
+            <w:r>
+              <w:t xml:space="preserve">ZZ</w:t>
+            </w:r>
+          </w:p>
+        </w:tc>
+        <w:tc>
+          <w:tcPr/>
+          <w:p>
+            <w:pPr>
+              <w:pStyle w:val="Compact"/>
+              <w:jc w:val="left"/>
+            </w:pPr>
+            <w:r>
+              <w:t xml:space="preserve">Remembering the fragments’ original visual, rotating it only once to match the found rotation and accepting the loss of information resulting in this operation.</w:t>
+            </w:r>
+          </w:p>
+        </w:tc>
+      </w:tr>
+      <w:tr>
+        <w:tc>
+          <w:tcPr/>
+          <w:p>
+            <w:pPr>
+              <w:pStyle w:val="Compact"/>
+              <w:jc w:val="left"/>
+            </w:pPr>
+            <w:r>
+              <w:rPr>
+                <w:b/>
+                <w:bCs/>
+              </w:rPr>
+              <w:t xml:space="preserve">RSK-08</w:t>
+            </w:r>
+          </w:p>
+        </w:tc>
+        <w:tc>
+          <w:tcPr/>
+          <w:p>
+            <w:pPr>
+              <w:pStyle w:val="Compact"/>
+              <w:jc w:val="left"/>
+            </w:pPr>
+            <w:r>
+              <w:rPr>
+                <w:b/>
+                <w:bCs/>
+              </w:rPr>
+              <w:t xml:space="preserve">Loss of information on the edges of fragments as a result of inacurate cut or assembling.</w:t>
+            </w:r>
+          </w:p>
+        </w:tc>
+        <w:tc>
+          <w:tcPr/>
+          <w:p>
+            <w:pPr>
+              <w:pStyle w:val="Compact"/>
+              <w:jc w:val="left"/>
+            </w:pPr>
+            <w:r>
+              <w:t xml:space="preserve">M</w:t>
+            </w:r>
+          </w:p>
+        </w:tc>
+        <w:tc>
+          <w:tcPr/>
+          <w:p>
+            <w:pPr>
+              <w:pStyle w:val="Compact"/>
+              <w:jc w:val="left"/>
+            </w:pPr>
+            <w:r>
+              <w:t xml:space="preserve">L</w:t>
+            </w:r>
+          </w:p>
+        </w:tc>
+        <w:tc>
+          <w:tcPr/>
+          <w:p>
+            <w:pPr>
+              <w:pStyle w:val="Compact"/>
+              <w:jc w:val="left"/>
+            </w:pPr>
+            <w:r>
+              <w:t xml:space="preserve">ZZ</w:t>
+            </w:r>
+          </w:p>
+        </w:tc>
+        <w:tc>
+          <w:tcPr/>
+          <w:p>
+            <w:pPr>
+              <w:pStyle w:val="Compact"/>
+              <w:jc w:val="left"/>
+            </w:pPr>
+            <w:r>
+              <w:t xml:space="preserve">Accepting the problem as an opportunity to test the algorithms in a real-world scenario (manual paper shredding).</w:t>
+            </w:r>
+          </w:p>
+        </w:tc>
+      </w:tr>
+      <w:tr>
+        <w:tc>
+          <w:tcPr/>
+          <w:p>
+            <w:pPr>
+              <w:pStyle w:val="Compact"/>
+              <w:jc w:val="left"/>
+            </w:pPr>
+            <w:r>
+              <w:rPr>
+                <w:b/>
+                <w:bCs/>
+              </w:rPr>
+              <w:t xml:space="preserve">RSK-09</w:t>
+            </w:r>
+          </w:p>
+        </w:tc>
+        <w:tc>
+          <w:tcPr/>
+          <w:p>
+            <w:pPr>
+              <w:pStyle w:val="Compact"/>
+              <w:jc w:val="left"/>
+            </w:pPr>
+            <w:r>
+              <w:rPr>
+                <w:b/>
+                <w:bCs/>
+              </w:rPr>
+              <w:t xml:space="preserve">Excessive RAM requirements for running the program smoothly</w:t>
+            </w:r>
+          </w:p>
+        </w:tc>
+        <w:tc>
+          <w:tcPr/>
+          <w:p>
+            <w:pPr>
+              <w:pStyle w:val="Compact"/>
+              <w:jc w:val="left"/>
+            </w:pPr>
+            <w:r>
+              <w:t xml:space="preserve">M</w:t>
+            </w:r>
+          </w:p>
+        </w:tc>
+        <w:tc>
+          <w:tcPr/>
+          <w:p>
+            <w:pPr>
+              <w:pStyle w:val="Compact"/>
+              <w:jc w:val="left"/>
+            </w:pPr>
+            <w:r>
+              <w:t xml:space="preserve">M</w:t>
+            </w:r>
+          </w:p>
+        </w:tc>
+        <w:tc>
+          <w:tcPr/>
+          <w:p>
+            <w:pPr>
+              <w:pStyle w:val="Compact"/>
+              <w:jc w:val="left"/>
+            </w:pPr>
+            <w:r>
+              <w:t xml:space="preserve">MS</w:t>
+            </w:r>
+          </w:p>
+        </w:tc>
+        <w:tc>
+          <w:tcPr/>
+          <w:p>
+            <w:pPr>
+              <w:pStyle w:val="Compact"/>
+              <w:jc w:val="left"/>
+            </w:pPr>
+            <w:r>
+              <w:t xml:space="preserve">Switching to the faculty MiNI GPU cluster</w:t>
+            </w:r>
+          </w:p>
+        </w:tc>
+      </w:tr>
+      <w:tr>
+        <w:tc>
+          <w:tcPr/>
+          <w:p>
+            <w:pPr>
+              <w:pStyle w:val="Compact"/>
+              <w:jc w:val="left"/>
+            </w:pPr>
+            <w:r>
+              <w:rPr>
+                <w:b/>
+                <w:bCs/>
+              </w:rPr>
+              <w:t xml:space="preserve">RSK-10</w:t>
+            </w:r>
+          </w:p>
+        </w:tc>
+        <w:tc>
+          <w:tcPr/>
+          <w:p>
+            <w:pPr>
+              <w:pStyle w:val="Compact"/>
+              <w:jc w:val="left"/>
+            </w:pPr>
+            <w:r>
+              <w:rPr>
+                <w:b/>
+                <w:bCs/>
+              </w:rPr>
+              <w:t xml:space="preserve">Excessive hyperparameter tuning time</w:t>
+            </w:r>
+          </w:p>
+        </w:tc>
+        <w:tc>
+          <w:tcPr/>
+          <w:p>
+            <w:pPr>
+              <w:pStyle w:val="Compact"/>
+              <w:jc w:val="left"/>
+            </w:pPr>
+            <w:r>
+              <w:t xml:space="preserve">M</w:t>
+            </w:r>
+          </w:p>
+        </w:tc>
+        <w:tc>
+          <w:tcPr/>
+          <w:p>
+            <w:pPr>
+              <w:pStyle w:val="Compact"/>
+              <w:jc w:val="left"/>
+            </w:pPr>
+            <w:r>
+              <w:t xml:space="preserve">M</w:t>
+            </w:r>
+          </w:p>
+        </w:tc>
+        <w:tc>
+          <w:tcPr/>
+          <w:p>
+            <w:pPr>
+              <w:pStyle w:val="Compact"/>
+              <w:jc w:val="left"/>
+            </w:pPr>
+            <w:r>
+              <w:t xml:space="preserve">HS</w:t>
+            </w:r>
+          </w:p>
+        </w:tc>
+        <w:tc>
+          <w:tcPr/>
+          <w:p>
+            <w:pPr>
+              <w:pStyle w:val="Compact"/>
+              <w:jc w:val="left"/>
+            </w:pPr>
+            <w:r>
+              <w:t xml:space="preserve">Finding a different algorithm or accepting the suboptimal hyperparameters.</w:t>
+            </w:r>
+          </w:p>
+        </w:tc>
+      </w:tr>
+      <w:tr>
+        <w:tc>
+          <w:tcPr/>
+          <w:p>
+            <w:pPr>
+              <w:pStyle w:val="Compact"/>
+              <w:jc w:val="left"/>
+            </w:pPr>
+            <w:r>
+              <w:rPr>
+                <w:b/>
+                <w:bCs/>
+              </w:rPr>
+              <w:t xml:space="preserve">RSK-11</w:t>
+            </w:r>
+          </w:p>
+        </w:tc>
+        <w:tc>
+          <w:tcPr/>
+          <w:p>
+            <w:pPr>
+              <w:pStyle w:val="Compact"/>
+              <w:jc w:val="left"/>
+            </w:pPr>
+            <w:r>
+              <w:rPr>
+                <w:b/>
+                <w:bCs/>
+              </w:rPr>
+              <w:t xml:space="preserve">No measurable metrics for assessing the accuracy of splitting and reconstructing the document.</w:t>
+            </w:r>
+          </w:p>
+        </w:tc>
+        <w:tc>
+          <w:tcPr/>
+          <w:p>
+            <w:pPr>
+              <w:pStyle w:val="Compact"/>
+              <w:jc w:val="left"/>
+            </w:pPr>
+            <w:r>
+              <w:t xml:space="preserve">H</w:t>
+            </w:r>
+          </w:p>
+        </w:tc>
+        <w:tc>
+          <w:tcPr/>
+          <w:p>
+            <w:pPr>
+              <w:pStyle w:val="Compact"/>
+              <w:jc w:val="left"/>
+            </w:pPr>
+            <w:r>
+              <w:t xml:space="preserve">M</w:t>
+            </w:r>
+          </w:p>
+        </w:tc>
+        <w:tc>
+          <w:tcPr/>
+          <w:p>
+            <w:pPr>
+              <w:pStyle w:val="Compact"/>
+              <w:jc w:val="left"/>
+            </w:pPr>
+            <w:r>
+              <w:t xml:space="preserve">ZZ</w:t>
+            </w:r>
+          </w:p>
+        </w:tc>
+        <w:tc>
+          <w:tcPr/>
+          <w:p>
+            <w:pPr>
+              <w:pStyle w:val="Compact"/>
+              <w:jc w:val="left"/>
+            </w:pPr>
+            <w:r>
+              <w:t xml:space="preserve">Relying solely on manual visual assessment.</w:t>
+            </w:r>
+          </w:p>
+        </w:tc>
+      </w:tr>
+      <w:tr>
+        <w:tc>
+          <w:tcPr/>
+          <w:p>
+            <w:pPr>
+              <w:pStyle w:val="Compact"/>
+              <w:jc w:val="left"/>
+            </w:pPr>
+            <w:r>
+              <w:rPr>
+                <w:b/>
+                <w:bCs/>
+              </w:rPr>
+              <w:t xml:space="preserve">RSK-12</w:t>
+            </w:r>
+          </w:p>
+        </w:tc>
+        <w:tc>
+          <w:tcPr/>
+          <w:p>
+            <w:pPr>
+              <w:pStyle w:val="Compact"/>
+              <w:jc w:val="left"/>
+            </w:pPr>
+            <w:r>
+              <w:rPr>
+                <w:b/>
+                <w:bCs/>
+              </w:rPr>
+              <w:t xml:space="preserve">Inability of the chosen UI library to meet our design requirements</w:t>
+            </w:r>
+          </w:p>
+        </w:tc>
+        <w:tc>
+          <w:tcPr/>
+          <w:p>
+            <w:pPr>
+              <w:pStyle w:val="Compact"/>
+              <w:jc w:val="left"/>
+            </w:pPr>
+            <w:r>
+              <w:t xml:space="preserve">L</w:t>
+            </w:r>
+          </w:p>
+        </w:tc>
+        <w:tc>
+          <w:tcPr/>
+          <w:p>
+            <w:pPr>
+              <w:pStyle w:val="Compact"/>
+              <w:jc w:val="left"/>
+            </w:pPr>
+            <w:r>
+              <w:t xml:space="preserve">L</w:t>
+            </w:r>
+          </w:p>
+        </w:tc>
+        <w:tc>
+          <w:tcPr/>
+          <w:p>
+            <w:pPr>
+              <w:pStyle w:val="Compact"/>
+              <w:jc w:val="left"/>
+            </w:pPr>
+            <w:r>
+              <w:t xml:space="preserve">MS</w:t>
+            </w:r>
+          </w:p>
+        </w:tc>
+        <w:tc>
+          <w:tcPr/>
+          <w:p>
+            <w:pPr>
+              <w:pStyle w:val="Compact"/>
+              <w:jc w:val="left"/>
+            </w:pPr>
+            <w:r>
+              <w:t xml:space="preserve">UI redesign or library change.</w:t>
+            </w:r>
+          </w:p>
+        </w:tc>
+      </w:tr>
+      <w:tr>
+        <w:tc>
+          <w:tcPr/>
+          <w:p>
+            <w:pPr>
+              <w:pStyle w:val="Compact"/>
+              <w:jc w:val="left"/>
+            </w:pPr>
+            <w:r>
+              <w:rPr>
+                <w:b/>
+                <w:bCs/>
+              </w:rPr>
+              <w:t xml:space="preserve">RSK-13</w:t>
+            </w:r>
+          </w:p>
+        </w:tc>
+        <w:tc>
+          <w:tcPr/>
+          <w:p>
+            <w:pPr>
+              <w:pStyle w:val="Compact"/>
+              <w:jc w:val="left"/>
+            </w:pPr>
+            <w:r>
+              <w:rPr>
+                <w:b/>
+                <w:bCs/>
+              </w:rPr>
+              <w:t xml:space="preserve">To high difficulty of the chosen UI library</w:t>
+            </w:r>
+          </w:p>
+        </w:tc>
+        <w:tc>
+          <w:tcPr/>
+          <w:p>
+            <w:pPr>
+              <w:pStyle w:val="Compact"/>
+              <w:jc w:val="left"/>
+            </w:pPr>
+            <w:r>
+              <w:t xml:space="preserve">L</w:t>
+            </w:r>
+          </w:p>
+        </w:tc>
+        <w:tc>
+          <w:tcPr/>
+          <w:p>
+            <w:pPr>
+              <w:pStyle w:val="Compact"/>
+              <w:jc w:val="left"/>
+            </w:pPr>
+            <w:r>
+              <w:t xml:space="preserve">L</w:t>
+            </w:r>
+          </w:p>
+        </w:tc>
+        <w:tc>
+          <w:tcPr/>
+          <w:p>
+            <w:pPr>
+              <w:pStyle w:val="Compact"/>
+              <w:jc w:val="left"/>
+            </w:pPr>
+            <w:r>
+              <w:t xml:space="preserve">MS</w:t>
+            </w:r>
+          </w:p>
+        </w:tc>
+        <w:tc>
+          <w:tcPr/>
+          <w:p>
+            <w:pPr>
+              <w:pStyle w:val="Compact"/>
+              <w:jc w:val="left"/>
+            </w:pPr>
+            <w:r>
+              <w:t xml:space="preserve">Library change.</w:t>
             </w:r>
           </w:p>
         </w:tc>
       </w:tr>
     </w:tbl>
+    <w:bookmarkEnd w:id="22"/>
+    <w:bookmarkStart w:id="23" w:name="Xa88a2e08350a03dd12e5fe85d19706a0dbf0032"/>
+    <w:p>
+      <w:pPr>
+        <w:pStyle w:val="Heading3"/>
+      </w:pPr>
+      <w:r>
+        <w:t xml:space="preserve">6.2 Contingency Plans for High-Risk Modules (Plan B Protocols)</w:t>
+      </w:r>
+    </w:p>
+    <w:bookmarkEnd w:id="23"/>
+    <w:bookmarkStart w:id="24" w:name="X9e4205ddf69e0c62040c2c12a32ca22f4926f25"/>
+    <w:p>
+      <w:pPr>
+        <w:pStyle w:val="Heading3"/>
+      </w:pPr>
+      <w:r>
+        <w:rPr>
+          <w:b/>
+          <w:bCs/>
+        </w:rPr>
+        <w:t xml:space="preserve">Contingency Protocol 1: Live Demo Failure during Defense</w:t>
+      </w:r>
+    </w:p>
+    <w:p>
+      <w:pPr>
+        <w:pStyle w:val="Compact"/>
+        <w:numPr>
+          <w:ilvl w:val="0"/>
+          <w:numId w:val="1018"/>
+        </w:numPr>
+      </w:pPr>
+      <w:r>
+        <w:rPr>
+          <w:b/>
+          <w:bCs/>
+        </w:rPr>
+        <w:t xml:space="preserve">Plan A (Primary):</w:t>
+      </w:r>
+      <w:r>
+        <w:t xml:space="preserve"> </w:t>
+      </w:r>
+      <w:r>
+        <w:t xml:space="preserve">Run a pre-recorded video demo with live narration during the 10-minute presentation.</w:t>
+      </w:r>
+    </w:p>
+    <w:p>
+      <w:pPr>
+        <w:pStyle w:val="Compact"/>
+        <w:numPr>
+          <w:ilvl w:val="0"/>
+          <w:numId w:val="1018"/>
+        </w:numPr>
+      </w:pPr>
+      <w:r>
+        <w:rPr>
+          <w:b/>
+          <w:bCs/>
+        </w:rPr>
+        <w:t xml:space="preserve">Plan B Trigger:</w:t>
+      </w:r>
+      <w:r>
+        <w:t xml:space="preserve"> </w:t>
+      </w:r>
+      <w:r>
+        <w:t xml:space="preserve">Projector connectivity issues, network failure.</w:t>
+      </w:r>
+    </w:p>
+    <w:p>
+      <w:pPr>
+        <w:pStyle w:val="Compact"/>
+        <w:numPr>
+          <w:ilvl w:val="0"/>
+          <w:numId w:val="1018"/>
+        </w:numPr>
+      </w:pPr>
+      <w:r>
+        <w:rPr>
+          <w:b/>
+          <w:bCs/>
+        </w:rPr>
+        <w:t xml:space="preserve">Plan B (Contingency):</w:t>
+      </w:r>
+      <w:r>
+        <w:t xml:space="preserve"> </w:t>
+      </w:r>
+      <w:r>
+        <w:t xml:space="preserve">Immediately switch to a presentation with screenshots showcasing the application’s core functionality.</w:t>
+      </w:r>
+    </w:p>
+    <w:bookmarkEnd w:id="24"/>
+    <w:bookmarkStart w:id="25" w:name="X2aa830ac7c49fe597f7a171bc0c25da51d0c228"/>
+    <w:p>
+      <w:pPr>
+        <w:pStyle w:val="Heading3"/>
+      </w:pPr>
+      <w:r>
+        <w:rPr>
+          <w:b/>
+          <w:bCs/>
+        </w:rPr>
+        <w:t xml:space="preserve">Contingency Protocol 2: Literature Dataset Issues</w:t>
+      </w:r>
+    </w:p>
+    <w:p>
+      <w:pPr>
+        <w:pStyle w:val="Compact"/>
+        <w:numPr>
+          <w:ilvl w:val="0"/>
+          <w:numId w:val="1019"/>
+        </w:numPr>
+      </w:pPr>
+      <w:r>
+        <w:rPr>
+          <w:b/>
+          <w:bCs/>
+        </w:rPr>
+        <w:t xml:space="preserve">Plan A (Primary):</w:t>
+      </w:r>
+      <w:r>
+        <w:t xml:space="preserve"> </w:t>
+      </w:r>
+      <w:r>
+        <w:t xml:space="preserve">Use existing datasets from literature.</w:t>
+      </w:r>
+    </w:p>
+    <w:p>
+      <w:pPr>
+        <w:pStyle w:val="Compact"/>
+        <w:numPr>
+          <w:ilvl w:val="0"/>
+          <w:numId w:val="1019"/>
+        </w:numPr>
+      </w:pPr>
+      <w:r>
+        <w:rPr>
+          <w:b/>
+          <w:bCs/>
+        </w:rPr>
+        <w:t xml:space="preserve">Plan B Trigger:</w:t>
+      </w:r>
+      <w:r>
+        <w:t xml:space="preserve"> </w:t>
+      </w:r>
+      <w:r>
+        <w:t xml:space="preserve">Restricted access to external datasets or unsatisfactory results from them.</w:t>
+      </w:r>
+    </w:p>
+    <w:p>
+      <w:pPr>
+        <w:pStyle w:val="Compact"/>
+        <w:numPr>
+          <w:ilvl w:val="0"/>
+          <w:numId w:val="1019"/>
+        </w:numPr>
+      </w:pPr>
+      <w:r>
+        <w:rPr>
+          <w:b/>
+          <w:bCs/>
+        </w:rPr>
+        <w:t xml:space="preserve">Plan B (Contingency):</w:t>
+      </w:r>
+      <w:r>
+        <w:t xml:space="preserve"> </w:t>
+      </w:r>
+      <w:r>
+        <w:t xml:space="preserve">Start constructing a custom dataset by shredding and scanning physical documents.</w:t>
+      </w:r>
+    </w:p>
+    <w:bookmarkEnd w:id="25"/>
+    <w:bookmarkEnd w:id="26"/>
+    <w:bookmarkStart w:id="28" w:name="schedule-and-role-allocation"/>
     <w:p>
       <w:pPr>
         <w:pStyle w:val="Heading2"/>
       </w:pPr>
-      <w:bookmarkStart w:id="24" w:name="_8299bd4e6c6e4163d68d42df5afb12b6e234ddd"/>
-      <w:r>
-        <w:t xml:space="preserve">7. Preliminary Risk Register</w:t>
-      </w:r>
-      <w:bookmarkEnd w:id="24"/>
-    </w:p>
-    <w:p>
-      <w:pPr>
-        <w:pStyle w:val="Heading3"/>
-      </w:pPr>
-      <w:bookmarkStart w:id="25" w:name="_e89360a4fd34d34ac35be49d387cccce175a1ce"/>
-      <w:r>
-        <w:t xml:space="preserve">7.1 Project and Technical Risk Register</w:t>
-      </w:r>
-      <w:bookmarkEnd w:id="25"/>
+      <w:r>
+        <w:t xml:space="preserve">7. Schedule and Role Allocation</w:t>
+      </w:r>
+    </w:p>
+    <w:p>
+      <w:pPr>
+        <w:pStyle w:val="FirstParagraph"/>
+      </w:pPr>
+      <w:r>
+        <w:t xml:space="preserve">A detailed schedule, RACI Matrix, and corresponding Gantt Diagram are located in a dedicated document:</w:t>
+      </w:r>
+      <w:r>
+        <w:t xml:space="preserve"> </w:t>
+      </w:r>
+      <w:hyperlink r:id="rId27">
+        <w:r>
+          <w:rPr>
+            <w:rStyle w:val="Hyperlink"/>
+          </w:rPr>
+          <w:t xml:space="preserve">schedule_and_tasks_overview.xlsx</w:t>
+        </w:r>
+      </w:hyperlink>
+      <w:r>
+        <w:t xml:space="preserve">.</w:t>
+      </w:r>
+    </w:p>
+    <w:bookmarkEnd w:id="28"/>
+    <w:bookmarkStart w:id="29" w:name="glossary"/>
+    <w:p>
+      <w:pPr>
+        <w:pStyle w:val="Heading2"/>
+      </w:pPr>
+      <w:r>
+        <w:t xml:space="preserve">8. Glossary</w:t>
+      </w:r>
     </w:p>
     <w:tbl>
       <w:tblPr>
@@ -2589,12 +3787,8 @@
         <w:tblLook w:firstRow="1" w:lastRow="0" w:firstColumn="0" w:lastColumn="0" w:noHBand="0" w:noVBand="0" w:val="0020"/>
       </w:tblPr>
       <w:tblGrid>
-        <w:gridCol w:w="735"/>
-        <w:gridCol w:w="2319"/>
-        <w:gridCol w:w="678"/>
-        <w:gridCol w:w="678"/>
-        <w:gridCol w:w="735"/>
-        <w:gridCol w:w="2772"/>
+        <w:gridCol w:w="2852"/>
+        <w:gridCol w:w="5067"/>
       </w:tblGrid>
       <w:tr>
         <w:trPr>
@@ -2605,70 +3799,22 @@
           <w:p>
             <w:pPr>
               <w:pStyle w:val="Compact"/>
-              <w:jc w:val="center"/>
-            </w:pPr>
-            <w:r>
-              <w:t xml:space="preserve">ID</w:t>
-            </w:r>
-          </w:p>
-        </w:tc>
-        <w:tc>
-          <w:tcPr/>
-          <w:p>
-            <w:pPr>
-              <w:pStyle w:val="Compact"/>
-              <w:jc w:val="center"/>
-            </w:pPr>
-            <w:r>
-              <w:t xml:space="preserve">Risk Event</w:t>
-            </w:r>
-          </w:p>
-        </w:tc>
-        <w:tc>
-          <w:tcPr/>
-          <w:p>
-            <w:pPr>
-              <w:pStyle w:val="Compact"/>
-              <w:jc w:val="center"/>
-            </w:pPr>
-            <w:r>
-              <w:t xml:space="preserve">Likelihood (L/M/H)</w:t>
-            </w:r>
-          </w:p>
-        </w:tc>
-        <w:tc>
-          <w:tcPr/>
-          <w:p>
-            <w:pPr>
-              <w:pStyle w:val="Compact"/>
-              <w:jc w:val="center"/>
-            </w:pPr>
-            <w:r>
-              <w:t xml:space="preserve">Impact (L/M/H/ Crit)</w:t>
-            </w:r>
-          </w:p>
-        </w:tc>
-        <w:tc>
-          <w:tcPr/>
-          <w:p>
-            <w:pPr>
-              <w:pStyle w:val="Compact"/>
-              <w:jc w:val="center"/>
-            </w:pPr>
-            <w:r>
-              <w:t xml:space="preserve">Owner</w:t>
-            </w:r>
-          </w:p>
-        </w:tc>
-        <w:tc>
-          <w:tcPr/>
-          <w:p>
-            <w:pPr>
-              <w:pStyle w:val="Compact"/>
-              <w:jc w:val="center"/>
-            </w:pPr>
-            <w:r>
-              <w:t xml:space="preserve">Mitigation Strategy</w:t>
+              <w:jc w:val="left"/>
+            </w:pPr>
+            <w:r>
+              <w:t xml:space="preserve">Term</w:t>
+            </w:r>
+          </w:p>
+        </w:tc>
+        <w:tc>
+          <w:tcPr/>
+          <w:p>
+            <w:pPr>
+              <w:pStyle w:val="Compact"/>
+              <w:jc w:val="left"/>
+            </w:pPr>
+            <w:r>
+              <w:t xml:space="preserve">Definition</w:t>
             </w:r>
           </w:p>
         </w:tc>
@@ -2679,78 +3825,56 @@
           <w:p>
             <w:pPr>
               <w:pStyle w:val="Compact"/>
-              <w:jc w:val="center"/>
+              <w:jc w:val="left"/>
             </w:pPr>
             <w:r>
               <w:rPr>
                 <w:b/>
                 <w:bCs/>
               </w:rPr>
-              <w:t xml:space="preserve">RSK-01</w:t>
-            </w:r>
-          </w:p>
-        </w:tc>
-        <w:tc>
-          <w:tcPr/>
-          <w:p>
-            <w:pPr>
-              <w:pStyle w:val="Compact"/>
-              <w:jc w:val="center"/>
+              <w:t xml:space="preserve">APD (Archiwum Prac Dyplomowych)</w:t>
+            </w:r>
+          </w:p>
+        </w:tc>
+        <w:tc>
+          <w:tcPr/>
+          <w:p>
+            <w:pPr>
+              <w:pStyle w:val="Compact"/>
+              <w:jc w:val="left"/>
+            </w:pPr>
+            <w:r>
+              <w:t xml:space="preserve">University Thesis Archive; official web portal of Warsaw University of Technology used for thesis submission, anti-plagiarism verification, and archiving.</w:t>
+            </w:r>
+          </w:p>
+        </w:tc>
+      </w:tr>
+      <w:tr>
+        <w:tc>
+          <w:tcPr/>
+          <w:p>
+            <w:pPr>
+              <w:pStyle w:val="Compact"/>
+              <w:jc w:val="left"/>
             </w:pPr>
             <w:r>
               <w:rPr>
                 <w:b/>
                 <w:bCs/>
               </w:rPr>
-              <w:t xml:space="preserve">Team member illness / drop-out</w:t>
-            </w:r>
-          </w:p>
-        </w:tc>
-        <w:tc>
-          <w:tcPr/>
-          <w:p>
-            <w:pPr>
-              <w:pStyle w:val="Compact"/>
-              <w:jc w:val="center"/>
-            </w:pPr>
-            <w:r>
-              <w:t xml:space="preserve">L</w:t>
-            </w:r>
-          </w:p>
-        </w:tc>
-        <w:tc>
-          <w:tcPr/>
-          <w:p>
-            <w:pPr>
-              <w:pStyle w:val="Compact"/>
-              <w:jc w:val="center"/>
-            </w:pPr>
-            <w:r>
-              <w:t xml:space="preserve">H</w:t>
-            </w:r>
-          </w:p>
-        </w:tc>
-        <w:tc>
-          <w:tcPr/>
-          <w:p>
-            <w:pPr>
-              <w:pStyle w:val="Compact"/>
-              <w:jc w:val="center"/>
-            </w:pPr>
-            <w:r>
-              <w:t xml:space="preserve">Everyone</w:t>
-            </w:r>
-          </w:p>
-        </w:tc>
-        <w:tc>
-          <w:tcPr/>
-          <w:p>
-            <w:pPr>
-              <w:pStyle w:val="Compact"/>
-              <w:jc w:val="center"/>
-            </w:pPr>
-            <w:r>
-              <w:t xml:space="preserve">Peer code review for every PR, pair programming on the critical path, modular architecture.</w:t>
+              <w:t xml:space="preserve">MVP (Minimum Viable Product)</w:t>
+            </w:r>
+          </w:p>
+        </w:tc>
+        <w:tc>
+          <w:tcPr/>
+          <w:p>
+            <w:pPr>
+              <w:pStyle w:val="Compact"/>
+              <w:jc w:val="left"/>
+            </w:pPr>
+            <w:r>
+              <w:t xml:space="preserve">The minimal functional scope of the project fulfilling all foundational requirements for academic project evaluation and defense.</w:t>
             </w:r>
           </w:p>
         </w:tc>
@@ -2761,1155 +3885,63 @@
           <w:p>
             <w:pPr>
               <w:pStyle w:val="Compact"/>
-              <w:jc w:val="center"/>
+              <w:jc w:val="left"/>
             </w:pPr>
             <w:r>
               <w:rPr>
                 <w:b/>
                 <w:bCs/>
               </w:rPr>
-              <w:t xml:space="preserve">RSK-02</w:t>
-            </w:r>
-          </w:p>
-        </w:tc>
-        <w:tc>
-          <w:tcPr/>
-          <w:p>
-            <w:pPr>
-              <w:pStyle w:val="Compact"/>
-              <w:jc w:val="center"/>
+              <w:t xml:space="preserve">Module 1</w:t>
+            </w:r>
+          </w:p>
+        </w:tc>
+        <w:tc>
+          <w:tcPr/>
+          <w:p>
+            <w:pPr>
+              <w:pStyle w:val="Compact"/>
+              <w:jc w:val="left"/>
+            </w:pPr>
+            <w:r>
+              <w:t xml:space="preserve">The document-splitting module, whose scope includes splitting an image into several fragments and arranging those fragments against a background.</w:t>
+            </w:r>
+          </w:p>
+        </w:tc>
+      </w:tr>
+      <w:tr>
+        <w:tc>
+          <w:tcPr/>
+          <w:p>
+            <w:pPr>
+              <w:pStyle w:val="Compact"/>
+              <w:jc w:val="left"/>
             </w:pPr>
             <w:r>
               <w:rPr>
                 <w:b/>
                 <w:bCs/>
               </w:rPr>
-              <w:t xml:space="preserve">Insufficient accuracy for the reconstructing algorithm</w:t>
-            </w:r>
-          </w:p>
-        </w:tc>
-        <w:tc>
-          <w:tcPr/>
-          <w:p>
-            <w:pPr>
-              <w:pStyle w:val="Compact"/>
-              <w:jc w:val="center"/>
-            </w:pPr>
-            <w:r>
-              <w:t xml:space="preserve">M</w:t>
-            </w:r>
-          </w:p>
-        </w:tc>
-        <w:tc>
-          <w:tcPr/>
-          <w:p>
-            <w:pPr>
-              <w:pStyle w:val="Compact"/>
-              <w:jc w:val="center"/>
-            </w:pPr>
-            <w:r>
-              <w:t xml:space="preserve">H</w:t>
-            </w:r>
-          </w:p>
-        </w:tc>
-        <w:tc>
-          <w:tcPr/>
-          <w:p>
-            <w:pPr>
-              <w:pStyle w:val="Compact"/>
-              <w:jc w:val="center"/>
-            </w:pPr>
-            <w:r>
-              <w:t xml:space="preserve">Everyone</w:t>
-            </w:r>
-          </w:p>
-        </w:tc>
-        <w:tc>
-          <w:tcPr/>
-          <w:p>
-            <w:pPr>
-              <w:pStyle w:val="Compact"/>
-              <w:jc w:val="center"/>
-            </w:pPr>
-            <w:r>
-              <w:t xml:space="preserve">Explore different algorithms; if the problem persists focus on an analysis of algorithmic limitations and failure cases.</w:t>
-            </w:r>
-          </w:p>
-        </w:tc>
-      </w:tr>
-      <w:tr>
-        <w:tc>
-          <w:tcPr/>
-          <w:p>
-            <w:pPr>
-              <w:pStyle w:val="Compact"/>
-              <w:jc w:val="center"/>
-            </w:pPr>
-            <w:r>
-              <w:rPr>
-                <w:b/>
-                <w:bCs/>
-              </w:rPr>
-              <w:t xml:space="preserve">RSK-03</w:t>
-            </w:r>
-          </w:p>
-        </w:tc>
-        <w:tc>
-          <w:tcPr/>
-          <w:p>
-            <w:pPr>
-              <w:pStyle w:val="Compact"/>
-              <w:jc w:val="center"/>
-            </w:pPr>
-            <w:r>
-              <w:rPr>
-                <w:b/>
-                <w:bCs/>
-              </w:rPr>
-              <w:t xml:space="preserve">Environment incompatibility in the MiNI laboratory</w:t>
-            </w:r>
-          </w:p>
-        </w:tc>
-        <w:tc>
-          <w:tcPr/>
-          <w:p>
-            <w:pPr>
-              <w:pStyle w:val="Compact"/>
-              <w:jc w:val="center"/>
-            </w:pPr>
-            <w:r>
-              <w:t xml:space="preserve">M</w:t>
-            </w:r>
-          </w:p>
-        </w:tc>
-        <w:tc>
-          <w:tcPr/>
-          <w:p>
-            <w:pPr>
-              <w:pStyle w:val="Compact"/>
-              <w:jc w:val="center"/>
-            </w:pPr>
-            <w:r>
-              <w:t xml:space="preserve">Crit</w:t>
-            </w:r>
-          </w:p>
-        </w:tc>
-        <w:tc>
-          <w:tcPr/>
-          <w:p>
-            <w:pPr>
-              <w:pStyle w:val="Compact"/>
-              <w:jc w:val="center"/>
-            </w:pPr>
-            <w:r>
-              <w:t xml:space="preserve">Martyna Sadowska</w:t>
-            </w:r>
-          </w:p>
-        </w:tc>
-        <w:tc>
-          <w:tcPr/>
-          <w:p>
-            <w:pPr>
-              <w:pStyle w:val="Compact"/>
-              <w:jc w:val="center"/>
-            </w:pPr>
-            <w:r>
-              <w:t xml:space="preserve">Test deployment on lab machines after implementing Module 1 and another after Module 2, not the night before acceptance.</w:t>
-            </w:r>
-          </w:p>
-        </w:tc>
-      </w:tr>
-      <w:tr>
-        <w:tc>
-          <w:tcPr/>
-          <w:p>
-            <w:pPr>
-              <w:pStyle w:val="Compact"/>
-              <w:jc w:val="center"/>
-            </w:pPr>
-            <w:r>
-              <w:rPr>
-                <w:b/>
-                <w:bCs/>
-              </w:rPr>
-              <w:t xml:space="preserve">RSK-04</w:t>
-            </w:r>
-          </w:p>
-        </w:tc>
-        <w:tc>
-          <w:tcPr/>
-          <w:p>
-            <w:pPr>
-              <w:pStyle w:val="Compact"/>
-              <w:jc w:val="center"/>
-            </w:pPr>
-            <w:r>
-              <w:rPr>
-                <w:b/>
-                <w:bCs/>
-              </w:rPr>
-              <w:t xml:space="preserve">Hardware failure (loss of data / code on laptop)</w:t>
-            </w:r>
-          </w:p>
-        </w:tc>
-        <w:tc>
-          <w:tcPr/>
-          <w:p>
-            <w:pPr>
-              <w:pStyle w:val="Compact"/>
-              <w:jc w:val="center"/>
-            </w:pPr>
-            <w:r>
-              <w:t xml:space="preserve">M</w:t>
-            </w:r>
-          </w:p>
-        </w:tc>
-        <w:tc>
-          <w:tcPr/>
-          <w:p>
-            <w:pPr>
-              <w:pStyle w:val="Compact"/>
-              <w:jc w:val="center"/>
-            </w:pPr>
-            <w:r>
-              <w:t xml:space="preserve">Crit</w:t>
-            </w:r>
-          </w:p>
-        </w:tc>
-        <w:tc>
-          <w:tcPr/>
-          <w:p>
-            <w:pPr>
-              <w:pStyle w:val="Compact"/>
-              <w:jc w:val="center"/>
-            </w:pPr>
-            <w:r>
-              <w:t xml:space="preserve">Everyone</w:t>
-            </w:r>
-          </w:p>
-        </w:tc>
-        <w:tc>
-          <w:tcPr/>
-          <w:p>
-            <w:pPr>
-              <w:pStyle w:val="Compact"/>
-              <w:jc w:val="center"/>
-            </w:pPr>
-            <w:r>
-              <w:t xml:space="preserve">Pushes to remote repository (GitHub) after each change.</w:t>
-            </w:r>
-          </w:p>
-        </w:tc>
-      </w:tr>
-      <w:tr>
-        <w:tc>
-          <w:tcPr/>
-          <w:p>
-            <w:pPr>
-              <w:pStyle w:val="Compact"/>
-              <w:jc w:val="center"/>
-            </w:pPr>
-            <w:r>
-              <w:rPr>
-                <w:b/>
-                <w:bCs/>
-              </w:rPr>
-              <w:t xml:space="preserve">RSK-05</w:t>
-            </w:r>
-          </w:p>
-        </w:tc>
-        <w:tc>
-          <w:tcPr/>
-          <w:p>
-            <w:pPr>
-              <w:pStyle w:val="Compact"/>
-              <w:jc w:val="center"/>
-            </w:pPr>
-            <w:r>
-              <w:rPr>
-                <w:b/>
-                <w:bCs/>
-              </w:rPr>
-              <w:t xml:space="preserve">Thesis writing workload accumulation in January</w:t>
-            </w:r>
-          </w:p>
-        </w:tc>
-        <w:tc>
-          <w:tcPr/>
-          <w:p>
-            <w:pPr>
-              <w:pStyle w:val="Compact"/>
-              <w:jc w:val="center"/>
-            </w:pPr>
-            <w:r>
-              <w:t xml:space="preserve">H</w:t>
-            </w:r>
-          </w:p>
-        </w:tc>
-        <w:tc>
-          <w:tcPr/>
-          <w:p>
-            <w:pPr>
-              <w:pStyle w:val="Compact"/>
-              <w:jc w:val="center"/>
-            </w:pPr>
-            <w:r>
-              <w:t xml:space="preserve">H</w:t>
-            </w:r>
-          </w:p>
-        </w:tc>
-        <w:tc>
-          <w:tcPr/>
-          <w:p>
-            <w:pPr>
-              <w:pStyle w:val="Compact"/>
-              <w:jc w:val="center"/>
-            </w:pPr>
-            <w:r>
-              <w:t xml:space="preserve">Everyone</w:t>
-            </w:r>
-          </w:p>
-        </w:tc>
-        <w:tc>
-          <w:tcPr/>
-          <w:p>
-            <w:pPr>
-              <w:pStyle w:val="Compact"/>
-              <w:jc w:val="center"/>
-            </w:pPr>
-            <w:r>
-              <w:t xml:space="preserve">Incremental drafting of thesis chapters; peer reviews within the team.</w:t>
-            </w:r>
-          </w:p>
-        </w:tc>
-      </w:tr>
-      <w:tr>
-        <w:tc>
-          <w:tcPr/>
-          <w:p>
-            <w:pPr>
-              <w:pStyle w:val="Compact"/>
-              <w:jc w:val="center"/>
-            </w:pPr>
-            <w:r>
-              <w:rPr>
-                <w:b/>
-                <w:bCs/>
-              </w:rPr>
-              <w:t xml:space="preserve">RSK-06</w:t>
-            </w:r>
-          </w:p>
-        </w:tc>
-        <w:tc>
-          <w:tcPr/>
-          <w:p>
-            <w:pPr>
-              <w:pStyle w:val="Compact"/>
-              <w:jc w:val="center"/>
-            </w:pPr>
-            <w:r>
-              <w:rPr>
-                <w:b/>
-                <w:bCs/>
-              </w:rPr>
-              <w:t xml:space="preserve">Unacceptably long execution time</w:t>
-            </w:r>
-          </w:p>
-        </w:tc>
-        <w:tc>
-          <w:tcPr/>
-          <w:p>
-            <w:pPr>
-              <w:pStyle w:val="Compact"/>
-              <w:jc w:val="center"/>
-            </w:pPr>
-            <w:r>
-              <w:t xml:space="preserve">H</w:t>
-            </w:r>
-          </w:p>
-        </w:tc>
-        <w:tc>
-          <w:tcPr/>
-          <w:p>
-            <w:pPr>
-              <w:pStyle w:val="Compact"/>
-              <w:jc w:val="center"/>
-            </w:pPr>
-            <w:r>
-              <w:t xml:space="preserve">M</w:t>
-            </w:r>
-          </w:p>
-        </w:tc>
-        <w:tc>
-          <w:tcPr/>
-          <w:p>
-            <w:pPr>
-              <w:pStyle w:val="Compact"/>
-              <w:jc w:val="center"/>
-            </w:pPr>
-            <w:r>
-              <w:t xml:space="preserve">Hanna Szczerbińska</w:t>
-            </w:r>
-          </w:p>
-        </w:tc>
-        <w:tc>
-          <w:tcPr/>
-          <w:p>
-            <w:pPr>
-              <w:pStyle w:val="Compact"/>
-              <w:jc w:val="center"/>
-            </w:pPr>
-            <w:r>
-              <w:t xml:space="preserve">Implementing early stopping to the algorithms and accepting the worse results.</w:t>
-            </w:r>
-          </w:p>
-        </w:tc>
-      </w:tr>
-      <w:tr>
-        <w:tc>
-          <w:tcPr/>
-          <w:p>
-            <w:pPr>
-              <w:pStyle w:val="Compact"/>
-              <w:jc w:val="center"/>
-            </w:pPr>
-            <w:r>
-              <w:rPr>
-                <w:b/>
-                <w:bCs/>
-              </w:rPr>
-              <w:t xml:space="preserve">RSK-07</w:t>
-            </w:r>
-          </w:p>
-        </w:tc>
-        <w:tc>
-          <w:tcPr/>
-          <w:p>
-            <w:pPr>
-              <w:pStyle w:val="Compact"/>
-              <w:jc w:val="center"/>
-            </w:pPr>
-            <w:r>
-              <w:rPr>
-                <w:b/>
-                <w:bCs/>
-              </w:rPr>
-              <w:t xml:space="preserve">Rotation of the fragments resulting in quality loss and document illegibility.</w:t>
-            </w:r>
-          </w:p>
-        </w:tc>
-        <w:tc>
-          <w:tcPr/>
-          <w:p>
-            <w:pPr>
-              <w:pStyle w:val="Compact"/>
-              <w:jc w:val="center"/>
-            </w:pPr>
-            <w:r>
-              <w:t xml:space="preserve">M</w:t>
-            </w:r>
-          </w:p>
-        </w:tc>
-        <w:tc>
-          <w:tcPr/>
-          <w:p>
-            <w:pPr>
-              <w:pStyle w:val="Compact"/>
-              <w:jc w:val="center"/>
-            </w:pPr>
-            <w:r>
-              <w:t xml:space="preserve">M</w:t>
-            </w:r>
-          </w:p>
-        </w:tc>
-        <w:tc>
-          <w:tcPr/>
-          <w:p>
-            <w:pPr>
-              <w:pStyle w:val="Compact"/>
-              <w:jc w:val="center"/>
-            </w:pPr>
-            <w:r>
-              <w:t xml:space="preserve">Zuzanna Zalewska</w:t>
-            </w:r>
-          </w:p>
-        </w:tc>
-        <w:tc>
-          <w:tcPr/>
-          <w:p>
-            <w:pPr>
-              <w:pStyle w:val="Compact"/>
-              <w:jc w:val="center"/>
-            </w:pPr>
-            <w:r>
-              <w:t xml:space="preserve">Remembering the fragments’ original visual, rotating it only once to match the found rotation and accepting the loss of information resulting in this operation.</w:t>
-            </w:r>
-          </w:p>
-        </w:tc>
-      </w:tr>
-      <w:tr>
-        <w:tc>
-          <w:tcPr/>
-          <w:p>
-            <w:pPr>
-              <w:pStyle w:val="Compact"/>
-              <w:jc w:val="center"/>
-            </w:pPr>
-            <w:r>
-              <w:rPr>
-                <w:b/>
-                <w:bCs/>
-              </w:rPr>
-              <w:t xml:space="preserve">RSK-08</w:t>
-            </w:r>
-          </w:p>
-        </w:tc>
-        <w:tc>
-          <w:tcPr/>
-          <w:p>
-            <w:pPr>
-              <w:pStyle w:val="Compact"/>
-              <w:jc w:val="center"/>
-            </w:pPr>
-            <w:r>
-              <w:rPr>
-                <w:b/>
-                <w:bCs/>
-              </w:rPr>
-              <w:t xml:space="preserve">Loss of information on the edges of fragments as a result of inacurate cut or assembling.</w:t>
-            </w:r>
-          </w:p>
-        </w:tc>
-        <w:tc>
-          <w:tcPr/>
-          <w:p>
-            <w:pPr>
-              <w:pStyle w:val="Compact"/>
-              <w:jc w:val="center"/>
-            </w:pPr>
-            <w:r>
-              <w:t xml:space="preserve">M</w:t>
-            </w:r>
-          </w:p>
-        </w:tc>
-        <w:tc>
-          <w:tcPr/>
-          <w:p>
-            <w:pPr>
-              <w:pStyle w:val="Compact"/>
-              <w:jc w:val="center"/>
-            </w:pPr>
-            <w:r>
-              <w:t xml:space="preserve">L</w:t>
-            </w:r>
-          </w:p>
-        </w:tc>
-        <w:tc>
-          <w:tcPr/>
-          <w:p>
-            <w:pPr>
-              <w:pStyle w:val="Compact"/>
-              <w:jc w:val="center"/>
-            </w:pPr>
-            <w:r>
-              <w:t xml:space="preserve">Zuzanna Zalewska</w:t>
-            </w:r>
-          </w:p>
-        </w:tc>
-        <w:tc>
-          <w:tcPr/>
-          <w:p>
-            <w:pPr>
-              <w:pStyle w:val="Compact"/>
-              <w:jc w:val="center"/>
-            </w:pPr>
-            <w:r>
-              <w:t xml:space="preserve">Accepting the problem as an opportunity to test the algorithms in a real-world scenario (manual paper shredding).</w:t>
-            </w:r>
-          </w:p>
-        </w:tc>
-      </w:tr>
-      <w:tr>
-        <w:tc>
-          <w:tcPr/>
-          <w:p>
-            <w:pPr>
-              <w:pStyle w:val="Compact"/>
-              <w:jc w:val="center"/>
-            </w:pPr>
-            <w:r>
-              <w:rPr>
-                <w:b/>
-                <w:bCs/>
-              </w:rPr>
-              <w:t xml:space="preserve">RSK-09</w:t>
-            </w:r>
-          </w:p>
-        </w:tc>
-        <w:tc>
-          <w:tcPr/>
-          <w:p>
-            <w:pPr>
-              <w:pStyle w:val="Compact"/>
-              <w:jc w:val="center"/>
-            </w:pPr>
-            <w:r>
-              <w:rPr>
-                <w:b/>
-                <w:bCs/>
-              </w:rPr>
-              <w:t xml:space="preserve">Excessive RAM requirements for running the program smoothly</w:t>
-            </w:r>
-          </w:p>
-        </w:tc>
-        <w:tc>
-          <w:tcPr/>
-          <w:p>
-            <w:pPr>
-              <w:pStyle w:val="Compact"/>
-              <w:jc w:val="center"/>
-            </w:pPr>
-            <w:r>
-              <w:t xml:space="preserve">M</w:t>
-            </w:r>
-          </w:p>
-        </w:tc>
-        <w:tc>
-          <w:tcPr/>
-          <w:p>
-            <w:pPr>
-              <w:pStyle w:val="Compact"/>
-              <w:jc w:val="center"/>
-            </w:pPr>
-            <w:r>
-              <w:t xml:space="preserve">M</w:t>
-            </w:r>
-          </w:p>
-        </w:tc>
-        <w:tc>
-          <w:tcPr/>
-          <w:p>
-            <w:pPr>
-              <w:pStyle w:val="Compact"/>
-              <w:jc w:val="center"/>
-            </w:pPr>
-            <w:r>
-              <w:t xml:space="preserve">Martyna Sadowska</w:t>
-            </w:r>
-          </w:p>
-        </w:tc>
-        <w:tc>
-          <w:tcPr/>
-          <w:p>
-            <w:pPr>
-              <w:pStyle w:val="Compact"/>
-              <w:jc w:val="center"/>
-            </w:pPr>
-            <w:r>
-              <w:t xml:space="preserve">Switching to the faculty MiNI GPU cluster</w:t>
-            </w:r>
-          </w:p>
-        </w:tc>
-      </w:tr>
-      <w:tr>
-        <w:tc>
-          <w:tcPr/>
-          <w:p>
-            <w:pPr>
-              <w:pStyle w:val="Compact"/>
-              <w:jc w:val="center"/>
-            </w:pPr>
-            <w:r>
-              <w:rPr>
-                <w:b/>
-                <w:bCs/>
-              </w:rPr>
-              <w:t xml:space="preserve">RSK-10</w:t>
-            </w:r>
-          </w:p>
-        </w:tc>
-        <w:tc>
-          <w:tcPr/>
-          <w:p>
-            <w:pPr>
-              <w:pStyle w:val="Compact"/>
-              <w:jc w:val="center"/>
-            </w:pPr>
-            <w:r>
-              <w:rPr>
-                <w:b/>
-                <w:bCs/>
-              </w:rPr>
-              <w:t xml:space="preserve">Excessive hyperparameter tuning time</w:t>
-            </w:r>
-          </w:p>
-        </w:tc>
-        <w:tc>
-          <w:tcPr/>
-          <w:p>
-            <w:pPr>
-              <w:pStyle w:val="Compact"/>
-              <w:jc w:val="center"/>
-            </w:pPr>
-            <w:r>
-              <w:t xml:space="preserve">M</w:t>
-            </w:r>
-          </w:p>
-        </w:tc>
-        <w:tc>
-          <w:tcPr/>
-          <w:p>
-            <w:pPr>
-              <w:pStyle w:val="Compact"/>
-              <w:jc w:val="center"/>
-            </w:pPr>
-            <w:r>
-              <w:t xml:space="preserve">M</w:t>
-            </w:r>
-          </w:p>
-        </w:tc>
-        <w:tc>
-          <w:tcPr/>
-          <w:p>
-            <w:pPr>
-              <w:pStyle w:val="Compact"/>
-              <w:jc w:val="center"/>
-            </w:pPr>
-            <w:r>
-              <w:t xml:space="preserve">Hanna Szczerbińska</w:t>
-            </w:r>
-          </w:p>
-        </w:tc>
-        <w:tc>
-          <w:tcPr/>
-          <w:p>
-            <w:pPr>
-              <w:pStyle w:val="Compact"/>
-              <w:jc w:val="center"/>
-            </w:pPr>
-            <w:r>
-              <w:t xml:space="preserve">Finding a different algorithm or accepting the suboptimal hyperparameters.</w:t>
-            </w:r>
-          </w:p>
-        </w:tc>
-      </w:tr>
-      <w:tr>
-        <w:tc>
-          <w:tcPr/>
-          <w:p>
-            <w:pPr>
-              <w:pStyle w:val="Compact"/>
-              <w:jc w:val="center"/>
-            </w:pPr>
-            <w:r>
-              <w:rPr>
-                <w:b/>
-                <w:bCs/>
-              </w:rPr>
-              <w:t xml:space="preserve">RSK-11</w:t>
-            </w:r>
-          </w:p>
-        </w:tc>
-        <w:tc>
-          <w:tcPr/>
-          <w:p>
-            <w:pPr>
-              <w:pStyle w:val="Compact"/>
-              <w:jc w:val="center"/>
-            </w:pPr>
-            <w:r>
-              <w:rPr>
-                <w:b/>
-                <w:bCs/>
-              </w:rPr>
-              <w:t xml:space="preserve">No measurable metrics for assessing the accuracy of splitting and reconstructing the document.</w:t>
-            </w:r>
-          </w:p>
-        </w:tc>
-        <w:tc>
-          <w:tcPr/>
-          <w:p>
-            <w:pPr>
-              <w:pStyle w:val="Compact"/>
-              <w:jc w:val="center"/>
-            </w:pPr>
-            <w:r>
-              <w:t xml:space="preserve">H</w:t>
-            </w:r>
-          </w:p>
-        </w:tc>
-        <w:tc>
-          <w:tcPr/>
-          <w:p>
-            <w:pPr>
-              <w:pStyle w:val="Compact"/>
-              <w:jc w:val="center"/>
-            </w:pPr>
-            <w:r>
-              <w:t xml:space="preserve">M</w:t>
-            </w:r>
-          </w:p>
-        </w:tc>
-        <w:tc>
-          <w:tcPr/>
-          <w:p>
-            <w:pPr>
-              <w:pStyle w:val="Compact"/>
-              <w:jc w:val="center"/>
-            </w:pPr>
-            <w:r>
-              <w:t xml:space="preserve">Zuzanna Zalewska</w:t>
-            </w:r>
-          </w:p>
-        </w:tc>
-        <w:tc>
-          <w:tcPr/>
-          <w:p>
-            <w:pPr>
-              <w:pStyle w:val="Compact"/>
-              <w:jc w:val="center"/>
-            </w:pPr>
-            <w:r>
-              <w:t xml:space="preserve">Relying solely on manual visual assessment.</w:t>
-            </w:r>
-          </w:p>
-        </w:tc>
-      </w:tr>
-      <w:tr>
-        <w:tc>
-          <w:tcPr/>
-          <w:p>
-            <w:pPr>
-              <w:pStyle w:val="Compact"/>
-              <w:jc w:val="center"/>
-            </w:pPr>
-            <w:r>
-              <w:rPr>
-                <w:b/>
-                <w:bCs/>
-              </w:rPr>
-              <w:t xml:space="preserve">RSK-12</w:t>
-            </w:r>
-          </w:p>
-        </w:tc>
-        <w:tc>
-          <w:tcPr/>
-          <w:p>
-            <w:pPr>
-              <w:pStyle w:val="Compact"/>
-              <w:jc w:val="center"/>
-            </w:pPr>
-            <w:r>
-              <w:rPr>
-                <w:b/>
-                <w:bCs/>
-              </w:rPr>
-              <w:t xml:space="preserve">Inability of the chosen UI library to meet our design requirements</w:t>
-            </w:r>
-          </w:p>
-        </w:tc>
-        <w:tc>
-          <w:tcPr/>
-          <w:p>
-            <w:pPr>
-              <w:pStyle w:val="Compact"/>
-              <w:jc w:val="center"/>
-            </w:pPr>
-            <w:r>
-              <w:t xml:space="preserve">L</w:t>
-            </w:r>
-          </w:p>
-        </w:tc>
-        <w:tc>
-          <w:tcPr/>
-          <w:p>
-            <w:pPr>
-              <w:pStyle w:val="Compact"/>
-              <w:jc w:val="center"/>
-            </w:pPr>
-            <w:r>
-              <w:t xml:space="preserve">L</w:t>
-            </w:r>
-          </w:p>
-        </w:tc>
-        <w:tc>
-          <w:tcPr/>
-          <w:p>
-            <w:pPr>
-              <w:pStyle w:val="Compact"/>
-              <w:jc w:val="center"/>
-            </w:pPr>
-            <w:r>
-              <w:t xml:space="preserve">Martyna Sadowska</w:t>
-            </w:r>
-          </w:p>
-        </w:tc>
-        <w:tc>
-          <w:tcPr/>
-          <w:p>
-            <w:pPr>
-              <w:pStyle w:val="Compact"/>
-              <w:jc w:val="center"/>
-            </w:pPr>
-            <w:r>
-              <w:t xml:space="preserve">UI redesign or library change.</w:t>
-            </w:r>
-          </w:p>
-        </w:tc>
-      </w:tr>
-      <w:tr>
-        <w:tc>
-          <w:tcPr/>
-          <w:p>
-            <w:pPr>
-              <w:pStyle w:val="Compact"/>
-              <w:jc w:val="center"/>
-            </w:pPr>
-            <w:r>
-              <w:rPr>
-                <w:b/>
-                <w:bCs/>
-              </w:rPr>
-              <w:t xml:space="preserve">RSK-13</w:t>
-            </w:r>
-          </w:p>
-        </w:tc>
-        <w:tc>
-          <w:tcPr/>
-          <w:p>
-            <w:pPr>
-              <w:pStyle w:val="Compact"/>
-              <w:jc w:val="center"/>
-            </w:pPr>
-            <w:r>
-              <w:rPr>
-                <w:b/>
-                <w:bCs/>
-              </w:rPr>
-              <w:t xml:space="preserve">To high difficulty of the chosen UI library</w:t>
-            </w:r>
-          </w:p>
-        </w:tc>
-        <w:tc>
-          <w:tcPr/>
-          <w:p>
-            <w:pPr>
-              <w:pStyle w:val="Compact"/>
-              <w:jc w:val="center"/>
-            </w:pPr>
-            <w:r>
-              <w:t xml:space="preserve">L</w:t>
-            </w:r>
-          </w:p>
-        </w:tc>
-        <w:tc>
-          <w:tcPr/>
-          <w:p>
-            <w:pPr>
-              <w:pStyle w:val="Compact"/>
-              <w:jc w:val="center"/>
-            </w:pPr>
-            <w:r>
-              <w:t xml:space="preserve">L</w:t>
-            </w:r>
-          </w:p>
-        </w:tc>
-        <w:tc>
-          <w:tcPr/>
-          <w:p>
-            <w:pPr>
-              <w:pStyle w:val="Compact"/>
-              <w:jc w:val="center"/>
-            </w:pPr>
-            <w:r>
-              <w:t xml:space="preserve">Martyna Sadowska</w:t>
-            </w:r>
-          </w:p>
-        </w:tc>
-        <w:tc>
-          <w:tcPr/>
-          <w:p>
-            <w:pPr>
-              <w:pStyle w:val="Compact"/>
-              <w:jc w:val="center"/>
-            </w:pPr>
-            <w:r>
-              <w:t xml:space="preserve">Library change.</w:t>
+              <w:t xml:space="preserve">Module 2</w:t>
+            </w:r>
+          </w:p>
+        </w:tc>
+        <w:tc>
+          <w:tcPr/>
+          <w:p>
+            <w:pPr>
+              <w:pStyle w:val="Compact"/>
+              <w:jc w:val="left"/>
+            </w:pPr>
+            <w:r>
+              <w:t xml:space="preserve">The document reconstruction module, whose scope includes extracting individual fragments from an image and reconstructing the original document based on the fragments’ shape and content.</w:t>
             </w:r>
           </w:p>
         </w:tc>
       </w:tr>
     </w:tbl>
-    <w:p>
-      <w:pPr>
-        <w:pStyle w:val="Heading3"/>
-      </w:pPr>
-      <w:bookmarkStart w:id="26" w:name="_a88a2e08350a03dd12e5fe85d19706a0dbf0032"/>
-      <w:r>
-        <w:t xml:space="preserve">7.1 Contingency Plans for High-Risk Modules (Plan B Protocols)</w:t>
-      </w:r>
-      <w:bookmarkEnd w:id="26"/>
-    </w:p>
-    <w:p>
-      <w:pPr>
-        <w:pStyle w:val="Heading3"/>
-      </w:pPr>
-      <w:bookmarkStart w:id="27" w:name="_9e4205ddf69e0c62040c2c12a32ca22f4926f25"/>
-      <w:r>
-        <w:rPr>
-          <w:b/>
-          <w:bCs/>
-        </w:rPr>
-        <w:t xml:space="preserve">Contingency Protocol 1: Live Demo Failure during Defense</w:t>
-      </w:r>
-      <w:bookmarkEnd w:id="27"/>
-    </w:p>
-    <w:p>
-      <w:pPr>
-        <w:pStyle w:val="Compact"/>
-        <w:numPr>
-          <w:ilvl w:val="0"/>
-          <w:numId w:val="1018"/>
-        </w:numPr>
-      </w:pPr>
-      <w:r>
-        <w:rPr>
-          <w:b/>
-          <w:bCs/>
-        </w:rPr>
-        <w:t xml:space="preserve">Plan A (Primary):</w:t>
-      </w:r>
-      <w:r>
-        <w:t xml:space="preserve"> </w:t>
-      </w:r>
-      <w:r>
-        <w:t xml:space="preserve">Run a pre-recorded video demo with live narration during the 10-minute presentation.</w:t>
-      </w:r>
-    </w:p>
-    <w:p>
-      <w:pPr>
-        <w:pStyle w:val="Compact"/>
-        <w:numPr>
-          <w:ilvl w:val="0"/>
-          <w:numId w:val="1018"/>
-        </w:numPr>
-      </w:pPr>
-      <w:r>
-        <w:rPr>
-          <w:b/>
-          <w:bCs/>
-        </w:rPr>
-        <w:t xml:space="preserve">Plan B Trigger:</w:t>
-      </w:r>
-      <w:r>
-        <w:t xml:space="preserve"> </w:t>
-      </w:r>
-      <w:r>
-        <w:t xml:space="preserve">Projector connectivity issues, network failure.</w:t>
-      </w:r>
-    </w:p>
-    <w:p>
-      <w:pPr>
-        <w:pStyle w:val="Compact"/>
-        <w:numPr>
-          <w:ilvl w:val="0"/>
-          <w:numId w:val="1018"/>
-        </w:numPr>
-      </w:pPr>
-      <w:r>
-        <w:rPr>
-          <w:b/>
-          <w:bCs/>
-        </w:rPr>
-        <w:t xml:space="preserve">Plan B (Contingency):</w:t>
-      </w:r>
-      <w:r>
-        <w:t xml:space="preserve"> </w:t>
-      </w:r>
-      <w:r>
-        <w:t xml:space="preserve">Immediately switch to a presentation with screenshots showcasing the application’s core functionality.</w:t>
-      </w:r>
-    </w:p>
-    <w:p>
-      <w:pPr>
-        <w:pStyle w:val="Heading3"/>
-      </w:pPr>
-      <w:bookmarkStart w:id="28" w:name="_2aa830ac7c49fe597f7a171bc0c25da51d0c228"/>
-      <w:r>
-        <w:rPr>
-          <w:b/>
-          <w:bCs/>
-        </w:rPr>
-        <w:t xml:space="preserve">Contingency Protocol 2: Literature Dataset Issues</w:t>
-      </w:r>
-      <w:bookmarkEnd w:id="28"/>
-    </w:p>
-    <w:p>
-      <w:pPr>
-        <w:pStyle w:val="Compact"/>
-        <w:numPr>
-          <w:ilvl w:val="0"/>
-          <w:numId w:val="1019"/>
-        </w:numPr>
-      </w:pPr>
-      <w:r>
-        <w:rPr>
-          <w:b/>
-          <w:bCs/>
-        </w:rPr>
-        <w:t xml:space="preserve">Plan A (Primary):</w:t>
-      </w:r>
-      <w:r>
-        <w:t xml:space="preserve"> </w:t>
-      </w:r>
-      <w:r>
-        <w:t xml:space="preserve">Use existing datasets from literature.</w:t>
-      </w:r>
-    </w:p>
-    <w:p>
-      <w:pPr>
-        <w:pStyle w:val="Compact"/>
-        <w:numPr>
-          <w:ilvl w:val="0"/>
-          <w:numId w:val="1019"/>
-        </w:numPr>
-      </w:pPr>
-      <w:r>
-        <w:rPr>
-          <w:b/>
-          <w:bCs/>
-        </w:rPr>
-        <w:t xml:space="preserve">Plan B Trigger:</w:t>
-      </w:r>
-      <w:r>
-        <w:t xml:space="preserve"> </w:t>
-      </w:r>
-      <w:r>
-        <w:t xml:space="preserve">Restricted access to external datasets or unsatisfactory results from them.</w:t>
-      </w:r>
-    </w:p>
-    <w:p>
-      <w:pPr>
-        <w:pStyle w:val="Compact"/>
-        <w:numPr>
-          <w:ilvl w:val="0"/>
-          <w:numId w:val="1019"/>
-        </w:numPr>
-      </w:pPr>
-      <w:r>
-        <w:rPr>
-          <w:b/>
-          <w:bCs/>
-        </w:rPr>
-        <w:t xml:space="preserve">Plan B (Contingency):</w:t>
-      </w:r>
-      <w:r>
-        <w:t xml:space="preserve"> </w:t>
-      </w:r>
-      <w:r>
-        <w:t xml:space="preserve">Start constructing a custom dataset by shredding and scanning physical documents.</w:t>
-      </w:r>
-    </w:p>
+    <w:bookmarkEnd w:id="29"/>
+    <w:bookmarkEnd w:id="30"/>
     <w:sectPr>
       <w:footnotePr>
         <w:numRestart w:val="eachSect"/>
@@ -4330,10 +4362,10 @@
   <w:docDefaults>
     <w:rPrDefault>
       <w:rPr>
-        <w:rFonts w:asciiTheme="minorHAnsi" w:eastAsiaTheme="minorEastAsia" w:hAnsiTheme="minorHAnsi" w:cstheme="minorBidi"/>
+        <w:rFonts w:asciiTheme="minorHAnsi" w:cstheme="minorBidi" w:eastAsiaTheme="minorEastAsia" w:hAnsiTheme="minorHAnsi"/>
         <w:sz w:val="24"/>
         <w:szCs w:val="24"/>
-        <w:lang w:val="en-US" w:eastAsia="zh-CN" w:bidi="ar-SA"/>
+        <w:lang w:bidi="ar-SA" w:eastAsia="zh-CN" w:val="en-US"/>
       </w:rPr>
     </w:rPrDefault>
     <w:pPrDefault>
@@ -4342,35 +4374,35 @@
       </w:pPr>
     </w:pPrDefault>
   </w:docDefaults>
-  <w:latentStyles w:defLockedState="0" w:defUIPriority="0" w:defSemiHidden="0" w:defUnhideWhenUsed="0" w:defQFormat="0" w:count="276"/>
-  <w:style w:type="paragraph" w:default="1" w:styleId="Normal">
+  <w:latentStyles w:count="276" w:defLockedState="0" w:defQFormat="0" w:defSemiHidden="0" w:defUIPriority="0" w:defUnhideWhenUsed="0"/>
+  <w:style w:default="1" w:styleId="Normal" w:type="paragraph">
     <w:name w:val="Normal"/>
     <w:qFormat/>
   </w:style>
-  <w:style w:type="paragraph" w:styleId="BodyText">
+  <w:style w:styleId="BodyText" w:type="paragraph">
     <w:name w:val="Body Text"/>
     <w:basedOn w:val="Normal"/>
     <w:link w:val="BodyTextChar"/>
     <w:qFormat/>
     <w:pPr>
-      <w:spacing w:before="180" w:after="180"/>
+      <w:spacing w:after="180" w:before="180"/>
     </w:pPr>
   </w:style>
-  <w:style w:type="paragraph" w:customStyle="1" w:styleId="FirstParagraph">
+  <w:style w:customStyle="1" w:styleId="FirstParagraph" w:type="paragraph">
     <w:name w:val="First Paragraph"/>
     <w:basedOn w:val="BodyText"/>
     <w:next w:val="BodyText"/>
     <w:qFormat/>
   </w:style>
-  <w:style w:type="paragraph" w:customStyle="1" w:styleId="Compact">
+  <w:style w:customStyle="1" w:styleId="Compact" w:type="paragraph">
     <w:name w:val="Compact"/>
     <w:basedOn w:val="BodyText"/>
     <w:qFormat/>
     <w:pPr>
-      <w:spacing w:before="36" w:after="36"/>
+      <w:spacing w:after="36" w:before="36"/>
     </w:pPr>
   </w:style>
-  <w:style w:type="paragraph" w:styleId="Title">
+  <w:style w:styleId="Title" w:type="paragraph">
     <w:name w:val="Title"/>
     <w:basedOn w:val="Normal"/>
     <w:next w:val="BodyText"/>
@@ -4384,24 +4416,24 @@
       <w:jc w:val="center"/>
     </w:pPr>
     <w:rPr>
-      <w:rFonts w:asciiTheme="majorHAnsi" w:eastAsiaTheme="majorEastAsia" w:hAnsiTheme="majorHAnsi" w:cstheme="majorBidi"/>
+      <w:rFonts w:asciiTheme="majorHAnsi" w:cstheme="majorBidi" w:eastAsiaTheme="majorEastAsia" w:hAnsiTheme="majorHAnsi"/>
       <w:sz w:val="56"/>
       <w:szCs w:val="56"/>
     </w:rPr>
   </w:style>
-  <w:style w:type="character" w:customStyle="1" w:styleId="TitleChar">
+  <w:style w:customStyle="1" w:styleId="TitleChar" w:type="character">
     <w:name w:val="Title Char"/>
     <w:basedOn w:val="DefaultParagraphFont"/>
     <w:link w:val="Title"/>
     <w:uiPriority w:val="10"/>
     <w:rsid w:val="00A10FD9"/>
     <w:rPr>
-      <w:rFonts w:asciiTheme="majorHAnsi" w:eastAsiaTheme="majorEastAsia" w:hAnsiTheme="majorHAnsi" w:cstheme="majorBidi"/>
+      <w:rFonts w:asciiTheme="majorHAnsi" w:cstheme="majorBidi" w:eastAsiaTheme="majorEastAsia" w:hAnsiTheme="majorHAnsi"/>
       <w:sz w:val="56"/>
       <w:szCs w:val="56"/>
     </w:rPr>
   </w:style>
-  <w:style w:type="paragraph" w:styleId="Subtitle">
+  <w:style w:styleId="Subtitle" w:type="paragraph">
     <w:name w:val="Subtitle"/>
     <w:basedOn w:val="Title"/>
     <w:next w:val="BodyText"/>
@@ -4415,27 +4447,27 @@
       </w:numPr>
     </w:pPr>
     <w:rPr>
-      <w:rFonts w:eastAsiaTheme="majorEastAsia" w:cstheme="majorBidi"/>
+      <w:rFonts w:cstheme="majorBidi" w:eastAsiaTheme="majorEastAsia"/>
       <w:spacing w:val="15"/>
       <w:sz w:val="28"/>
       <w:szCs w:val="28"/>
     </w:rPr>
   </w:style>
-  <w:style w:type="character" w:customStyle="1" w:styleId="SubtitleChar">
+  <w:style w:customStyle="1" w:styleId="SubtitleChar" w:type="character">
     <w:name w:val="Subtitle Char"/>
     <w:basedOn w:val="DefaultParagraphFont"/>
     <w:link w:val="Subtitle"/>
     <w:uiPriority w:val="11"/>
     <w:rsid w:val="00A10FD9"/>
     <w:rPr>
-      <w:rFonts w:eastAsiaTheme="majorEastAsia" w:cstheme="majorBidi"/>
-      <w:color w:val="595959" w:themeColor="text1" w:themeTint="A6"/>
+      <w:rFonts w:cstheme="majorBidi" w:eastAsiaTheme="majorEastAsia"/>
+      <w:color w:themeColor="text1" w:themeTint="A6" w:val="595959"/>
       <w:spacing w:val="15"/>
       <w:sz w:val="28"/>
       <w:szCs w:val="28"/>
     </w:rPr>
   </w:style>
-  <w:style w:type="paragraph" w:customStyle="1" w:styleId="Author">
+  <w:style w:customStyle="1" w:styleId="Author" w:type="paragraph">
     <w:name w:val="Author"/>
     <w:basedOn w:val="Title"/>
     <w:next w:val="BodyText"/>
@@ -4449,7 +4481,7 @@
       <w:szCs w:val="24"/>
     </w:rPr>
   </w:style>
-  <w:style w:type="paragraph" w:styleId="Date">
+  <w:style w:styleId="Date" w:type="paragraph">
     <w:name w:val="Date"/>
     <w:basedOn w:val="Title"/>
     <w:next w:val="BodyText"/>
@@ -4463,7 +4495,7 @@
       <w:szCs w:val="24"/>
     </w:rPr>
   </w:style>
-  <w:style w:type="paragraph" w:customStyle="1" w:styleId="AbstractTitle">
+  <w:style w:customStyle="1" w:styleId="AbstractTitle" w:type="paragraph">
     <w:name w:val="Abstract Title"/>
     <w:basedOn w:val="Normal"/>
     <w:next w:val="Abstract"/>
@@ -4471,7 +4503,7 @@
     <w:pPr>
       <w:keepNext/>
       <w:keepLines/>
-      <w:spacing w:before="300" w:after="0"/>
+      <w:spacing w:after="0" w:before="300"/>
       <w:jc w:val="center"/>
     </w:pPr>
     <w:rPr>
@@ -4480,7 +4512,7 @@
       <w:szCs w:val="20"/>
     </w:rPr>
   </w:style>
-  <w:style w:type="paragraph" w:customStyle="1" w:styleId="Abstract">
+  <w:style w:customStyle="1" w:styleId="Abstract" w:type="paragraph">
     <w:name w:val="Abstract"/>
     <w:basedOn w:val="Normal"/>
     <w:next w:val="BodyText"/>
@@ -4488,14 +4520,14 @@
     <w:pPr>
       <w:keepNext/>
       <w:keepLines/>
-      <w:spacing w:before="100" w:after="300"/>
+      <w:spacing w:after="300" w:before="100"/>
     </w:pPr>
     <w:rPr>
       <w:sz w:val="20"/>
       <w:szCs w:val="20"/>
     </w:rPr>
   </w:style>
-  <w:style w:type="paragraph" w:styleId="Bibliography">
+  <w:style w:styleId="Bibliography" w:type="paragraph">
     <w:name w:val="Bibliography"/>
     <w:basedOn w:val="Normal"/>
     <w:next w:val="Bibliography"/>
@@ -4503,7 +4535,7 @@
     <w:pPr/>
     <w:rPr/>
   </w:style>
-  <w:style w:type="paragraph" w:styleId="Heading1">
+  <w:style w:styleId="Heading1" w:type="paragraph">
     <w:name w:val="heading 1"/>
     <w:basedOn w:val="Normal"/>
     <w:next w:val="BodyText"/>
@@ -4514,17 +4546,17 @@
     <w:pPr>
       <w:keepNext/>
       <w:keepLines/>
-      <w:spacing w:before="360" w:after="80"/>
+      <w:spacing w:after="80" w:before="360"/>
       <w:outlineLvl w:val="0"/>
     </w:pPr>
     <w:rPr>
-      <w:rFonts w:asciiTheme="majorHAnsi" w:eastAsiaTheme="majorEastAsia" w:hAnsiTheme="majorHAnsi" w:cstheme="majorBidi"/>
-      <w:color w:val="0F4761" w:themeColor="accent1" w:themeShade="BF"/>
+      <w:rFonts w:asciiTheme="majorHAnsi" w:cstheme="majorBidi" w:eastAsiaTheme="majorEastAsia" w:hAnsiTheme="majorHAnsi"/>
+      <w:color w:themeColor="accent1" w:themeShade="BF" w:val="0F4761"/>
       <w:sz w:val="40"/>
       <w:szCs w:val="40"/>
     </w:rPr>
   </w:style>
-  <w:style w:type="paragraph" w:styleId="Heading2">
+  <w:style w:styleId="Heading2" w:type="paragraph">
     <w:name w:val="heading 2"/>
     <w:basedOn w:val="Normal"/>
     <w:next w:val="BodyText"/>
@@ -4537,17 +4569,17 @@
     <w:pPr>
       <w:keepNext/>
       <w:keepLines/>
-      <w:spacing w:before="160" w:after="80"/>
+      <w:spacing w:after="80" w:before="160"/>
       <w:outlineLvl w:val="1"/>
     </w:pPr>
     <w:rPr>
-      <w:rFonts w:asciiTheme="majorHAnsi" w:eastAsiaTheme="majorEastAsia" w:hAnsiTheme="majorHAnsi" w:cstheme="majorBidi"/>
-      <w:color w:val="0F4761" w:themeColor="accent1" w:themeShade="BF"/>
+      <w:rFonts w:asciiTheme="majorHAnsi" w:cstheme="majorBidi" w:eastAsiaTheme="majorEastAsia" w:hAnsiTheme="majorHAnsi"/>
+      <w:color w:themeColor="accent1" w:themeShade="BF" w:val="0F4761"/>
       <w:sz w:val="32"/>
       <w:szCs w:val="32"/>
     </w:rPr>
   </w:style>
-  <w:style w:type="paragraph" w:styleId="Heading3">
+  <w:style w:styleId="Heading3" w:type="paragraph">
     <w:name w:val="heading 3"/>
     <w:basedOn w:val="Normal"/>
     <w:next w:val="BodyText"/>
@@ -4560,17 +4592,17 @@
     <w:pPr>
       <w:keepNext/>
       <w:keepLines/>
-      <w:spacing w:before="160" w:after="80"/>
+      <w:spacing w:after="80" w:before="160"/>
       <w:outlineLvl w:val="2"/>
     </w:pPr>
     <w:rPr>
-      <w:rFonts w:eastAsiaTheme="majorEastAsia" w:cstheme="majorBidi"/>
-      <w:color w:val="0F4761" w:themeColor="accent1" w:themeShade="BF"/>
+      <w:rFonts w:cstheme="majorBidi" w:eastAsiaTheme="majorEastAsia"/>
+      <w:color w:themeColor="accent1" w:themeShade="BF" w:val="0F4761"/>
       <w:sz w:val="28"/>
       <w:szCs w:val="28"/>
     </w:rPr>
   </w:style>
-  <w:style w:type="paragraph" w:styleId="Heading4">
+  <w:style w:styleId="Heading4" w:type="paragraph">
     <w:name w:val="heading 4"/>
     <w:basedOn w:val="Normal"/>
     <w:next w:val="BodyText"/>
@@ -4583,17 +4615,17 @@
     <w:pPr>
       <w:keepNext/>
       <w:keepLines/>
-      <w:spacing w:before="80" w:after="40"/>
+      <w:spacing w:after="40" w:before="80"/>
       <w:outlineLvl w:val="3"/>
     </w:pPr>
     <w:rPr>
-      <w:rFonts w:eastAsiaTheme="majorEastAsia" w:cstheme="majorBidi"/>
+      <w:rFonts w:cstheme="majorBidi" w:eastAsiaTheme="majorEastAsia"/>
       <w:i/>
       <w:iCs/>
-      <w:color w:val="0F4761" w:themeColor="accent1" w:themeShade="BF"/>
-    </w:rPr>
-  </w:style>
-  <w:style w:type="paragraph" w:styleId="Heading5">
+      <w:color w:themeColor="accent1" w:themeShade="BF" w:val="0F4761"/>
+    </w:rPr>
+  </w:style>
+  <w:style w:styleId="Heading5" w:type="paragraph">
     <w:name w:val="heading 5"/>
     <w:basedOn w:val="Normal"/>
     <w:next w:val="BodyText"/>
@@ -4606,15 +4638,15 @@
     <w:pPr>
       <w:keepNext/>
       <w:keepLines/>
-      <w:spacing w:before="80" w:after="40"/>
+      <w:spacing w:after="40" w:before="80"/>
       <w:outlineLvl w:val="4"/>
     </w:pPr>
     <w:rPr>
-      <w:rFonts w:eastAsiaTheme="majorEastAsia" w:cstheme="majorBidi"/>
-      <w:color w:val="0F4761" w:themeColor="accent1" w:themeShade="BF"/>
-    </w:rPr>
-  </w:style>
-  <w:style w:type="paragraph" w:styleId="Heading6">
+      <w:rFonts w:cstheme="majorBidi" w:eastAsiaTheme="majorEastAsia"/>
+      <w:color w:themeColor="accent1" w:themeShade="BF" w:val="0F4761"/>
+    </w:rPr>
+  </w:style>
+  <w:style w:styleId="Heading6" w:type="paragraph">
     <w:name w:val="heading 6"/>
     <w:basedOn w:val="Normal"/>
     <w:next w:val="BodyText"/>
@@ -4627,17 +4659,17 @@
     <w:pPr>
       <w:keepNext/>
       <w:keepLines/>
-      <w:spacing w:before="40" w:after="0"/>
+      <w:spacing w:after="0" w:before="40"/>
       <w:outlineLvl w:val="5"/>
     </w:pPr>
     <w:rPr>
-      <w:rFonts w:eastAsiaTheme="majorEastAsia" w:cstheme="majorBidi"/>
+      <w:rFonts w:cstheme="majorBidi" w:eastAsiaTheme="majorEastAsia"/>
       <w:i/>
       <w:iCs/>
-      <w:color w:val="595959" w:themeColor="text1" w:themeTint="A6"/>
-    </w:rPr>
-  </w:style>
-  <w:style w:type="paragraph" w:styleId="Heading7">
+      <w:color w:themeColor="text1" w:themeTint="A6" w:val="595959"/>
+    </w:rPr>
+  </w:style>
+  <w:style w:styleId="Heading7" w:type="paragraph">
     <w:name w:val="heading 7"/>
     <w:basedOn w:val="Normal"/>
     <w:next w:val="BodyText"/>
@@ -4650,15 +4682,15 @@
     <w:pPr>
       <w:keepNext/>
       <w:keepLines/>
-      <w:spacing w:before="40" w:after="0"/>
+      <w:spacing w:after="0" w:before="40"/>
       <w:outlineLvl w:val="6"/>
     </w:pPr>
     <w:rPr>
-      <w:rFonts w:eastAsiaTheme="majorEastAsia" w:cstheme="majorBidi"/>
-      <w:color w:val="595959" w:themeColor="text1" w:themeTint="A6"/>
-    </w:rPr>
-  </w:style>
-  <w:style w:type="paragraph" w:styleId="Heading8">
+      <w:rFonts w:cstheme="majorBidi" w:eastAsiaTheme="majorEastAsia"/>
+      <w:color w:themeColor="text1" w:themeTint="A6" w:val="595959"/>
+    </w:rPr>
+  </w:style>
+  <w:style w:styleId="Heading8" w:type="paragraph">
     <w:name w:val="heading 8"/>
     <w:basedOn w:val="Normal"/>
     <w:next w:val="BodyText"/>
@@ -4675,13 +4707,13 @@
       <w:outlineLvl w:val="7"/>
     </w:pPr>
     <w:rPr>
-      <w:rFonts w:eastAsiaTheme="majorEastAsia" w:cstheme="majorBidi"/>
+      <w:rFonts w:cstheme="majorBidi" w:eastAsiaTheme="majorEastAsia"/>
       <w:i/>
       <w:iCs/>
-      <w:color w:val="272727" w:themeColor="text1" w:themeTint="D8"/>
-    </w:rPr>
-  </w:style>
-  <w:style w:type="paragraph" w:styleId="Heading9">
+      <w:color w:themeColor="text1" w:themeTint="D8" w:val="272727"/>
+    </w:rPr>
+  </w:style>
+  <w:style w:styleId="Heading9" w:type="paragraph">
     <w:name w:val="heading 9"/>
     <w:basedOn w:val="Normal"/>
     <w:next w:val="BodyText"/>
@@ -4698,24 +4730,24 @@
       <w:outlineLvl w:val="8"/>
     </w:pPr>
     <w:rPr>
-      <w:rFonts w:eastAsiaTheme="majorEastAsia" w:cstheme="majorBidi"/>
-      <w:color w:val="272727" w:themeColor="text1" w:themeTint="D8"/>
-    </w:rPr>
-  </w:style>
-  <w:style w:type="character" w:customStyle="1" w:styleId="Heading1Char">
+      <w:rFonts w:cstheme="majorBidi" w:eastAsiaTheme="majorEastAsia"/>
+      <w:color w:themeColor="text1" w:themeTint="D8" w:val="272727"/>
+    </w:rPr>
+  </w:style>
+  <w:style w:customStyle="1" w:styleId="Heading1Char" w:type="character">
     <w:name w:val="Heading 1 Char"/>
     <w:basedOn w:val="DefaultParagraphFont"/>
     <w:link w:val="Heading1"/>
     <w:uiPriority w:val="9"/>
     <w:rsid w:val="00A10FD9"/>
     <w:rPr>
-      <w:rFonts w:asciiTheme="majorHAnsi" w:eastAsiaTheme="majorEastAsia" w:hAnsiTheme="majorHAnsi" w:cstheme="majorBidi"/>
-      <w:color w:val="0F4761" w:themeColor="accent1" w:themeShade="BF"/>
+      <w:rFonts w:asciiTheme="majorHAnsi" w:cstheme="majorBidi" w:eastAsiaTheme="majorEastAsia" w:hAnsiTheme="majorHAnsi"/>
+      <w:color w:themeColor="accent1" w:themeShade="BF" w:val="0F4761"/>
       <w:sz w:val="40"/>
       <w:szCs w:val="40"/>
     </w:rPr>
   </w:style>
-  <w:style w:type="character" w:customStyle="1" w:styleId="Heading2Char">
+  <w:style w:customStyle="1" w:styleId="Heading2Char" w:type="character">
     <w:name w:val="Heading 2 Char"/>
     <w:basedOn w:val="DefaultParagraphFont"/>
     <w:link w:val="Heading2"/>
@@ -4723,13 +4755,13 @@
     <w:semiHidden/>
     <w:rsid w:val="00A10FD9"/>
     <w:rPr>
-      <w:rFonts w:asciiTheme="majorHAnsi" w:eastAsiaTheme="majorEastAsia" w:hAnsiTheme="majorHAnsi" w:cstheme="majorBidi"/>
-      <w:color w:val="0F4761" w:themeColor="accent1" w:themeShade="BF"/>
+      <w:rFonts w:asciiTheme="majorHAnsi" w:cstheme="majorBidi" w:eastAsiaTheme="majorEastAsia" w:hAnsiTheme="majorHAnsi"/>
+      <w:color w:themeColor="accent1" w:themeShade="BF" w:val="0F4761"/>
       <w:sz w:val="32"/>
       <w:szCs w:val="32"/>
     </w:rPr>
   </w:style>
-  <w:style w:type="character" w:customStyle="1" w:styleId="Heading3Char">
+  <w:style w:customStyle="1" w:styleId="Heading3Char" w:type="character">
     <w:name w:val="Heading 3 Char"/>
     <w:basedOn w:val="DefaultParagraphFont"/>
     <w:link w:val="Heading3"/>
@@ -4737,13 +4769,13 @@
     <w:semiHidden/>
     <w:rsid w:val="00A10FD9"/>
     <w:rPr>
-      <w:rFonts w:eastAsiaTheme="majorEastAsia" w:cstheme="majorBidi"/>
-      <w:color w:val="0F4761" w:themeColor="accent1" w:themeShade="BF"/>
+      <w:rFonts w:cstheme="majorBidi" w:eastAsiaTheme="majorEastAsia"/>
+      <w:color w:themeColor="accent1" w:themeShade="BF" w:val="0F4761"/>
       <w:sz w:val="28"/>
       <w:szCs w:val="28"/>
     </w:rPr>
   </w:style>
-  <w:style w:type="character" w:customStyle="1" w:styleId="Heading4Char">
+  <w:style w:customStyle="1" w:styleId="Heading4Char" w:type="character">
     <w:name w:val="Heading 4 Char"/>
     <w:basedOn w:val="DefaultParagraphFont"/>
     <w:link w:val="Heading4"/>
@@ -4751,13 +4783,13 @@
     <w:semiHidden/>
     <w:rsid w:val="00A10FD9"/>
     <w:rPr>
-      <w:rFonts w:eastAsiaTheme="majorEastAsia" w:cstheme="majorBidi"/>
+      <w:rFonts w:cstheme="majorBidi" w:eastAsiaTheme="majorEastAsia"/>
       <w:i/>
       <w:iCs/>
-      <w:color w:val="0F4761" w:themeColor="accent1" w:themeShade="BF"/>
-    </w:rPr>
-  </w:style>
-  <w:style w:type="character" w:customStyle="1" w:styleId="Heading5Char">
+      <w:color w:themeColor="accent1" w:themeShade="BF" w:val="0F4761"/>
+    </w:rPr>
+  </w:style>
+  <w:style w:customStyle="1" w:styleId="Heading5Char" w:type="character">
     <w:name w:val="Heading 5 Char"/>
     <w:basedOn w:val="DefaultParagraphFont"/>
     <w:link w:val="Heading5"/>
@@ -4765,11 +4797,11 @@
     <w:semiHidden/>
     <w:rsid w:val="00A10FD9"/>
     <w:rPr>
-      <w:rFonts w:eastAsiaTheme="majorEastAsia" w:cstheme="majorBidi"/>
-      <w:color w:val="0F4761" w:themeColor="accent1" w:themeShade="BF"/>
-    </w:rPr>
-  </w:style>
-  <w:style w:type="character" w:customStyle="1" w:styleId="Heading6Char">
+      <w:rFonts w:cstheme="majorBidi" w:eastAsiaTheme="majorEastAsia"/>
+      <w:color w:themeColor="accent1" w:themeShade="BF" w:val="0F4761"/>
+    </w:rPr>
+  </w:style>
+  <w:style w:customStyle="1" w:styleId="Heading6Char" w:type="character">
     <w:name w:val="Heading 6 Char"/>
     <w:basedOn w:val="DefaultParagraphFont"/>
     <w:link w:val="Heading6"/>
@@ -4777,13 +4809,13 @@
     <w:semiHidden/>
     <w:rsid w:val="00A10FD9"/>
     <w:rPr>
-      <w:rFonts w:eastAsiaTheme="majorEastAsia" w:cstheme="majorBidi"/>
+      <w:rFonts w:cstheme="majorBidi" w:eastAsiaTheme="majorEastAsia"/>
       <w:i/>
       <w:iCs/>
-      <w:color w:val="595959" w:themeColor="text1" w:themeTint="A6"/>
-    </w:rPr>
-  </w:style>
-  <w:style w:type="character" w:customStyle="1" w:styleId="Heading7Char">
+      <w:color w:themeColor="text1" w:themeTint="A6" w:val="595959"/>
+    </w:rPr>
+  </w:style>
+  <w:style w:customStyle="1" w:styleId="Heading7Char" w:type="character">
     <w:name w:val="Heading 7 Char"/>
     <w:basedOn w:val="DefaultParagraphFont"/>
     <w:link w:val="Heading7"/>
@@ -4791,11 +4823,11 @@
     <w:semiHidden/>
     <w:rsid w:val="00A10FD9"/>
     <w:rPr>
-      <w:rFonts w:eastAsiaTheme="majorEastAsia" w:cstheme="majorBidi"/>
-      <w:color w:val="595959" w:themeColor="text1" w:themeTint="A6"/>
-    </w:rPr>
-  </w:style>
-  <w:style w:type="character" w:customStyle="1" w:styleId="Heading8Char">
+      <w:rFonts w:cstheme="majorBidi" w:eastAsiaTheme="majorEastAsia"/>
+      <w:color w:themeColor="text1" w:themeTint="A6" w:val="595959"/>
+    </w:rPr>
+  </w:style>
+  <w:style w:customStyle="1" w:styleId="Heading8Char" w:type="character">
     <w:name w:val="Heading 8 Char"/>
     <w:basedOn w:val="DefaultParagraphFont"/>
     <w:link w:val="Heading8"/>
@@ -4803,13 +4835,13 @@
     <w:semiHidden/>
     <w:rsid w:val="00A10FD9"/>
     <w:rPr>
-      <w:rFonts w:eastAsiaTheme="majorEastAsia" w:cstheme="majorBidi"/>
+      <w:rFonts w:cstheme="majorBidi" w:eastAsiaTheme="majorEastAsia"/>
       <w:i/>
       <w:iCs/>
-      <w:color w:val="272727" w:themeColor="text1" w:themeTint="D8"/>
-    </w:rPr>
-  </w:style>
-  <w:style w:type="character" w:customStyle="1" w:styleId="Heading9Char">
+      <w:color w:themeColor="text1" w:themeTint="D8" w:val="272727"/>
+    </w:rPr>
+  </w:style>
+  <w:style w:customStyle="1" w:styleId="Heading9Char" w:type="character">
     <w:name w:val="Heading 9 Char"/>
     <w:basedOn w:val="DefaultParagraphFont"/>
     <w:link w:val="Heading9"/>
@@ -4817,11 +4849,11 @@
     <w:semiHidden/>
     <w:rsid w:val="00A10FD9"/>
     <w:rPr>
-      <w:rFonts w:eastAsiaTheme="majorEastAsia" w:cstheme="majorBidi"/>
-      <w:color w:val="272727" w:themeColor="text1" w:themeTint="D8"/>
-    </w:rPr>
-  </w:style>
-  <w:style w:type="paragraph" w:styleId="BlockText">
+      <w:rFonts w:cstheme="majorBidi" w:eastAsiaTheme="majorEastAsia"/>
+      <w:color w:themeColor="text1" w:themeTint="D8" w:val="272727"/>
+    </w:rPr>
+  </w:style>
+  <w:style w:styleId="BlockText" w:type="paragraph">
     <w:name w:val="Block Text"/>
     <w:basedOn w:val="BodyText"/>
     <w:next w:val="BodyText"/>
@@ -4829,11 +4861,11 @@
     <w:unhideWhenUsed/>
     <w:qFormat/>
     <w:pPr>
-      <w:spacing w:before="100" w:after="100"/>
+      <w:spacing w:after="100" w:before="100"/>
       <w:ind w:firstLine="0" w:left="480" w:right="480"/>
     </w:pPr>
   </w:style>
-  <w:style w:type="paragraph" w:styleId="FootnoteText">
+  <w:style w:styleId="FootnoteText" w:type="paragraph">
     <w:name w:val="Footnote Text"/>
     <w:basedOn w:val="Normal"/>
     <w:next w:val="FootnoteText"/>
@@ -4841,7 +4873,7 @@
     <w:unhideWhenUsed/>
     <w:qFormat/>
   </w:style>
-  <w:style w:type="paragraph" w:styleId="FootnoteBlockText">
+  <w:style w:styleId="FootnoteBlockText" w:type="paragraph">
     <w:name w:val="Footnote Block Text"/>
     <w:basedOn w:val="FootnoteText"/>
     <w:next w:val="FootnoteText"/>
@@ -4849,26 +4881,28 @@
     <w:unhideWhenUsed/>
     <w:qFormat/>
     <w:pPr>
-      <w:spacing w:before="100" w:after="100"/>
+      <w:spacing w:after="100" w:before="100"/>
       <w:ind w:firstLine="0" w:left="480" w:right="480"/>
     </w:pPr>
   </w:style>
-  <w:style w:type="character" w:default="1" w:styleId="DefaultParagraphFont">
+  <w:style w:default="1" w:styleId="DefaultParagraphFont" w:type="character">
     <w:name w:val="Default Paragraph Font"/>
     <w:semiHidden/>
     <w:unhideWhenUsed/>
   </w:style>
-  <w:style w:type="table" w:default="1" w:styleId="Table">
+  <w:style w:default="1" w:styleId="Table" w:type="table">
     <w:name w:val="Table"/>
     <w:basedOn w:val="TableNormal"/>
+    <w:semiHidden/>
+    <w:unhideWhenUsed/>
     <w:qFormat/>
     <w:tblPr>
-      <w:tblInd w:w="0" w:type="dxa"/>
+      <w:tblInd w:type="dxa" w:w="0"/>
       <w:tblCellMar>
-        <w:top w:w="0" w:type="dxa"/>
-        <w:left w:w="108" w:type="dxa"/>
-        <w:bottom w:w="0" w:type="dxa"/>
-        <w:right w:w="108" w:type="dxa"/>
+        <w:top w:type="dxa" w:w="0"/>
+        <w:left w:type="dxa" w:w="108"/>
+        <w:bottom w:type="dxa" w:w="0"/>
+        <w:right w:type="dxa" w:w="108"/>
       </w:tblCellMar>
     </w:tblPr>
     <w:tblStylePr w:type="firstRow">
@@ -4880,7 +4914,7 @@
       </w:tcPr>
     </w:tblStylePr>
   </w:style>
-  <w:style w:type="paragraph" w:customStyle="1" w:styleId="DefinitionTerm">
+  <w:style w:customStyle="1" w:styleId="DefinitionTerm" w:type="paragraph">
     <w:name w:val="Definition Term"/>
     <w:basedOn w:val="Normal"/>
     <w:next w:val="Definition"/>
@@ -4893,49 +4927,49 @@
       <w:b/>
     </w:rPr>
   </w:style>
-  <w:style w:type="paragraph" w:customStyle="1" w:styleId="Definition">
+  <w:style w:customStyle="1" w:styleId="Definition" w:type="paragraph">
     <w:name w:val="Definition"/>
     <w:basedOn w:val="Normal"/>
   </w:style>
-  <w:style w:type="paragraph" w:styleId="Caption">
+  <w:style w:styleId="Caption" w:type="paragraph">
     <w:name w:val="Caption"/>
     <w:basedOn w:val="Normal"/>
     <w:link w:val="BodyTextChar"/>
     <w:pPr>
-      <w:spacing w:before="0" w:after="120"/>
+      <w:spacing w:after="120" w:before="0"/>
     </w:pPr>
     <w:rPr>
       <w:i/>
     </w:rPr>
   </w:style>
-  <w:style w:type="paragraph" w:customStyle="1" w:styleId="TableCaption">
+  <w:style w:customStyle="1" w:styleId="TableCaption" w:type="paragraph">
     <w:name w:val="Table Caption"/>
     <w:basedOn w:val="Caption"/>
     <w:pPr>
       <w:keepNext/>
     </w:pPr>
   </w:style>
-  <w:style w:type="paragraph" w:customStyle="1" w:styleId="ImageCaption">
+  <w:style w:customStyle="1" w:styleId="ImageCaption" w:type="paragraph">
     <w:name w:val="Image Caption"/>
     <w:basedOn w:val="Caption"/>
   </w:style>
-  <w:style w:type="paragraph" w:customStyle="1" w:styleId="Figure">
+  <w:style w:customStyle="1" w:styleId="Figure" w:type="paragraph">
     <w:name w:val="Figure"/>
     <w:basedOn w:val="Normal"/>
   </w:style>
-  <w:style w:type="paragraph" w:customStyle="1" w:styleId="CaptionedFigure">
+  <w:style w:customStyle="1" w:styleId="CaptionedFigure" w:type="paragraph">
     <w:name w:val="Captioned Figure"/>
     <w:basedOn w:val="Figure"/>
     <w:pPr>
       <w:keepNext/>
     </w:pPr>
   </w:style>
-  <w:style w:type="character" w:customStyle="1" w:styleId="BodyTextChar">
+  <w:style w:customStyle="1" w:styleId="BodyTextChar" w:type="character">
     <w:name w:val="Body Text Char"/>
     <w:basedOn w:val="DefaultParagraphFont"/>
     <w:link w:val="BodyText"/>
   </w:style>
-  <w:style w:type="character" w:customStyle="1" w:styleId="VerbatimChar">
+  <w:style w:customStyle="1" w:styleId="VerbatimChar" w:type="character">
     <w:name w:val="Verbatim Char"/>
     <w:basedOn w:val="BodyTextChar"/>
     <w:rPr>
@@ -4943,25 +4977,25 @@
       <w:sz w:val="22"/>
     </w:rPr>
   </w:style>
-  <w:style w:type="character" w:customStyle="1" w:styleId="SectionNumber">
+  <w:style w:customStyle="1" w:styleId="SectionNumber" w:type="character">
     <w:name w:val="Section Number"/>
     <w:basedOn w:val="BodyTextChar"/>
   </w:style>
-  <w:style w:type="character" w:styleId="FootnoteReference">
+  <w:style w:styleId="FootnoteReference" w:type="character">
     <w:name w:val="Footnote Reference"/>
     <w:basedOn w:val="BodyTextChar"/>
     <w:rPr>
       <w:vertAlign w:val="superscript"/>
     </w:rPr>
   </w:style>
-  <w:style w:type="character" w:styleId="Hyperlink">
+  <w:style w:styleId="Hyperlink" w:type="character">
     <w:name w:val="Hyperlink"/>
     <w:basedOn w:val="BodyTextChar"/>
     <w:rPr>
-      <w:color w:val="4F81BD" w:themeColor="accent1"/>
-    </w:rPr>
-  </w:style>
-  <w:style w:type="paragraph" w:styleId="TOCHeading">
+      <w:color w:themeColor="accent1" w:val="4F81BD"/>
+    </w:rPr>
+  </w:style>
+  <w:style w:styleId="TOCHeading" w:type="paragraph">
     <w:name w:val="TOC Heading"/>
     <w:basedOn w:val="Heading1"/>
     <w:next w:val="BodyText"/>
@@ -4973,10 +5007,10 @@
       <w:outlineLvl w:val="9"/>
     </w:pPr>
     <w:rPr>
-      <w:rFonts w:asciiTheme="majorHAnsi" w:eastAsiaTheme="majorEastAsia" w:hAnsiTheme="majorHAnsi" w:cstheme="majorBidi"/>
+      <w:rFonts w:asciiTheme="majorHAnsi" w:cstheme="majorBidi" w:eastAsiaTheme="majorEastAsia" w:hAnsiTheme="majorHAnsi"/>
       <w:b w:val="0"/>
       <w:bCs w:val="0"/>
-      <w:color w:val="365F91" w:themeColor="accent1" w:themeShade="BF"/>
+      <w:color w:themeColor="accent1" w:themeShade="BF" w:val="365F91"/>
     </w:rPr>
   </w:style>
   <w:style w:type="paragraph" w:customStyle="1" w:styleId="SourceCode">

</xml_diff>